<commit_message>
word: regenerar artigo com Pandoc e validar layout
</commit_message>
<xml_diff>
--- a/artigo.docx
+++ b/artigo.docx
@@ -185,7 +185,150 @@
         <w:pStyle w:val="BodyText"/>
       </w:pPr>
       <w:r>
-        <w:t xml:space="preserve">Este artigo analisa como padrões bibliométricos e evidências temáticas sobre manutenção predial sustentável podem fundamentar um protocolo multicritério adaptável às edificações públicas universitárias. Foi conduzida uma revisão integrativa sistematizada, com mapeamento bibliométrico e síntese temática, nas bases Scopus, Web of Science e Crossref, entre 2010 e 2026. A estrutura do campo foi examinada em 372 registros com maior aderência e suficiência documental; a triagem e a auditoria resultaram em 104 registros para a síntese temática. Como a busca original capturou inteligência artificial e aprendizado de máquina apenas incidentalmente, uma busca complementar de sensibilidade dedicada a esse tema foi conduzida nas mesmas três bases; após deduplicação e auditoria com os mesmos critérios de elegibilidade, o núcleo temático foi ampliado para 121 registros. O campo transita de um vocabulário centrado em eficiência, desempenho e edificações verdes para outro associado a BIM,</w:t>
+        <w:t xml:space="preserve">O artigo investiga como evidências bibliométricas e temáticas sobre manutenção predial sustentável podem fundamentar um protocolo multicritério adaptável às edificações públicas universitárias. Realizou-se revisão integrativa sistematizada em Scopus, Web of Science e Crossref, entre 2010 e 2026. A busca principal recuperou 12.118 ocorrências; após deduplicação e triagem, 372 registros sustentaram o mapeamento bibliométrico e 104 compuseram o núcleo temático original. Uma busca complementar de sensibilidade para inteligência artificial e aprendizado de máquina recuperou 6.728 ocorrências e incorporou 17 registros, elevando o núcleo vigente para 121, sem alterar a camada bibliométrica da busca principal. Predominaram as dimensões técnica-operacional (116 registros), institucional (97) e ambiental (92), e os critérios desempenho operacional (99), informação e dados (82), custo (63), energia e vida útil (44 cada). Aprendizado de máquina passou de nove para 26 registros após a sensibilidade. Entre os 17 incorporados, dez tratam predominantemente de previsão ou previsão com otimização, dois de diagnóstico e classificação e cinco de síntese ou integração tecnológica. Nenhum demonstrou a cadeia completa entre modelo treinado, validação externa, ponderação multicritério, regras de veto e decisão pública auditável. Como contribuição, a síntese foi convertida em matriz analítica conceitual e protocolo operacional candidato, com indicadores, fontes, periodicidade, direção de preferência e vetos. Frequências documentais não foram transformadas em pesos; ponderação, limiares e agregação dependem de validação institucional e teste multicampi.</w:t>
+      </w:r>
+    </w:p>
+    <w:p>
+      <w:pPr>
+        <w:pStyle w:val="BodyText"/>
+      </w:pPr>
+      <w:r>
+        <w:rPr>
+          <w:bCs/>
+          <w:b/>
+        </w:rPr>
+        <w:t xml:space="preserve">Palavras-chave:</w:t>
+      </w:r>
+      <w:r>
+        <w:t xml:space="preserve"> </w:t>
+      </w:r>
+      <w:r>
+        <w:t xml:space="preserve">manutenção predial; sustentabilidade; decisão multicritério; edificações públicas universitárias; aprendizado de máquina.</w:t>
+      </w:r>
+    </w:p>
+    <w:p>
+      <w:pPr>
+        <w:pStyle w:val="BodyText"/>
+      </w:pPr>
+      <w:r>
+        <w:rPr>
+          <w:bCs/>
+          <w:b/>
+        </w:rPr>
+        <w:t xml:space="preserve">Abstract</w:t>
+      </w:r>
+    </w:p>
+    <w:p>
+      <w:pPr>
+        <w:pStyle w:val="BodyText"/>
+      </w:pPr>
+      <w:r>
+        <w:t xml:space="preserve">This article investigates how bibliometric and thematic evidence on sustainable building maintenance can support a multi-criteria protocol adaptable to public university buildings. A systematized integrative review was conducted in Scopus, Web of Science, and Crossref for 2010–2026. The main search retrieved 12,118 occurrences; after deduplication and screening, 372 records supported bibliometric mapping and 104 formed the original thematic core. A complementary sensitivity search for artificial intelligence and machine learning retrieved 6,728 occurrences and incorporated 17 records, expanding the current core to 121 without changing the bibliometric layer derived from the main search. The technical-operational (116 records), institutional (97), and environmental (92) dimensions predominated, as did operational performance (99), information and data (82), cost (63), energy, and service life (44 each). Machine learning increased from nine to 26 records after the sensitivity search. Among the 17 incorporated records, ten predominantly address prediction or prediction with optimization, two address diagnosis and classification, and five address technological synthesis or integration. None demonstrated the complete chain linking a trained model, external validation, multi-criteria weighting, veto rules, and auditable public decision-making. The synthesis was translated into a conceptual analytical matrix and a candidate operational protocol specifying indicators, data sources, periodicity, preference direction, and vetoes. Documentary frequencies were not converted into weights; weighting, thresholds, and aggregation require institutional validation and multi-campus testing.</w:t>
+      </w:r>
+    </w:p>
+    <w:p>
+      <w:pPr>
+        <w:pStyle w:val="BodyText"/>
+      </w:pPr>
+      <w:r>
+        <w:rPr>
+          <w:bCs/>
+          <w:b/>
+        </w:rPr>
+        <w:t xml:space="preserve">Keywords:</w:t>
+      </w:r>
+      <w:r>
+        <w:t xml:space="preserve"> </w:t>
+      </w:r>
+      <w:r>
+        <w:t xml:space="preserve">building maintenance; sustainability; multi-criteria decision-making; public university buildings; machine learning.</w:t>
+      </w:r>
+    </w:p>
+    <w:bookmarkStart w:id="20" w:name="sec:introducao"/>
+    <w:p>
+      <w:pPr>
+        <w:pStyle w:val="Heading1"/>
+      </w:pPr>
+      <w:r>
+        <w:t xml:space="preserve">Introdução</w:t>
+      </w:r>
+    </w:p>
+    <w:p>
+      <w:pPr>
+        <w:pStyle w:val="FirstParagraph"/>
+      </w:pPr>
+      <w:r>
+        <w:t xml:space="preserve">A gestão de edificações públicas universitárias enfrenta uma tensão decisória recorrente: as intervenções mais visíveis ou urgentes competem por recursos com ações preventivas, ambientais, sociais e institucionais cujos benefícios se distribuem ao longo do ciclo de vida. A ausência de uma arquitetura transparente de critérios pode favorecer decisões reativas e dificultar a justificativa técnica, orçamentária e pública da prioridade atribuída a cada ativo, como indicam estudos de caso em instituições universitárias</w:t>
+      </w:r>
+      <w:r>
+        <w:t xml:space="preserve"> </w:t>
+      </w:r>
+      <w:r>
+        <w:t xml:space="preserve">(Lateef, Khamidi, and Idrus 2010; Barbosa et al. 2020)</w:t>
+      </w:r>
+      <w:r>
+        <w:t xml:space="preserve">. A manutenção predial condiciona desempenho, segurança, durabilidade e continuidade dos serviços, e a NBR 5674 estabelece requisitos de planejamento, controle e avaliação do sistema de manutenção</w:t>
+      </w:r>
+      <w:r>
+        <w:t xml:space="preserve"> </w:t>
+      </w:r>
+      <w:r>
+        <w:t xml:space="preserve">(Associação Brasileira de Normas Técnicas 2012)</w:t>
+      </w:r>
+      <w:r>
+        <w:t xml:space="preserve">. No âmbito público brasileiro, essa responsabilidade também se vincula a deveres legais e administrativos do gestor</w:t>
+      </w:r>
+      <w:r>
+        <w:t xml:space="preserve"> </w:t>
+      </w:r>
+      <w:r>
+        <w:t xml:space="preserve">(Araújo Neto 2015)</w:t>
+      </w:r>
+      <w:r>
+        <w:t xml:space="preserve">.</w:t>
+      </w:r>
+    </w:p>
+    <w:p>
+      <w:pPr>
+        <w:pStyle w:val="BodyText"/>
+      </w:pPr>
+      <w:r>
+        <w:t xml:space="preserve">Restrições orçamentárias, envelhecimento da infraestrutura e acúmulo de demandas tornam insuficiente uma ordenação baseada em custo ou urgência isolados. A análise de custos em universidade federal demonstra a utilidade de modelos de previsão para o planejamento orçamentário</w:t>
+      </w:r>
+      <w:r>
+        <w:t xml:space="preserve"> </w:t>
+      </w:r>
+      <w:r>
+        <w:t xml:space="preserve">(Martins and Espejo 2024)</w:t>
+      </w:r>
+      <w:r>
+        <w:t xml:space="preserve">, enquanto registros de ordens de serviço permitem reconhecer padrões de demanda e apoiar o planejamento de intervenções</w:t>
+      </w:r>
+      <w:r>
+        <w:t xml:space="preserve"> </w:t>
+      </w:r>
+      <w:r>
+        <w:t xml:space="preserve">(Morais, Paula, and Reis 2023)</w:t>
+      </w:r>
+      <w:r>
+        <w:t xml:space="preserve">. Para sustentar a prioridade, séries de custos e ordens de serviço precisam ser combinadas a condição física, risco, energia, impacto ambiental, experiência dos usuários, conformidade e capacidade institucional</w:t>
+      </w:r>
+      <w:r>
+        <w:t xml:space="preserve"> </w:t>
+      </w:r>
+      <w:r>
+        <w:t xml:space="preserve">(Maia, Scheer, and Freitas 2016; Nägeli et al. 2019; Alfalah et al. 2022)</w:t>
+      </w:r>
+      <w:r>
+        <w:t xml:space="preserve">.</w:t>
+      </w:r>
+    </w:p>
+    <w:p>
+      <w:pPr>
+        <w:pStyle w:val="BodyText"/>
+      </w:pPr>
+      <w:r>
+        <w:t xml:space="preserve">O</w:t>
       </w:r>
       <w:r>
         <w:t xml:space="preserve"> </w:t>
@@ -195,135 +338,22 @@
           <w:iCs/>
           <w:i/>
         </w:rPr>
-        <w:t xml:space="preserve">digital twins</w:t>
-      </w:r>
-      <w:r>
-        <w:t xml:space="preserve">, carbono, ciclo de vida, manutenção preditiva e, de forma ainda emergente, aprendizado de máquina. No núcleo temático, destacaram-se as dimensões técnica-operacional, institucional e ambiental e os critérios desempenho operacional, informação, custo, vida útil e energia. Métodos multicritério formalmente nomeados foram menos frequentes que estruturas genéricas de apoio à decisão; a presença documental de inteligência artificial não constitui evidência de maturidade institucional de adoção. Apenas 12 registros apresentaram lacunas específicas para instituições públicas de ensino superior. Como contribuição, propõe-se uma matriz analítica conceitual, informada pela síntese da literatura, convertida em protocolo operacional candidato com indicadores, fontes de dados, periodicidade, direção de preferência e regras de veto. Pesos e funções de agregação não são derivados das frequências documentais e dependem de validação posterior.</w:t>
-      </w:r>
-    </w:p>
-    <w:p>
-      <w:pPr>
-        <w:pStyle w:val="BodyText"/>
-      </w:pPr>
-      <w:r>
-        <w:rPr>
-          <w:bCs/>
-          <w:b/>
-        </w:rPr>
-        <w:t xml:space="preserve">Palavras-chave:</w:t>
-      </w:r>
-      <w:r>
-        <w:t xml:space="preserve"> </w:t>
-      </w:r>
-      <w:r>
-        <w:t xml:space="preserve">manutenção predial; sustentabilidade; métodos multicritério de decisão; gestão de edificações públicas; bibliometria.</w:t>
-      </w:r>
-    </w:p>
-    <w:p>
-      <w:pPr>
-        <w:pStyle w:val="BodyText"/>
-      </w:pPr>
-      <w:r>
-        <w:rPr>
-          <w:bCs/>
-          <w:b/>
-        </w:rPr>
-        <w:t xml:space="preserve">Abstract</w:t>
-      </w:r>
-    </w:p>
-    <w:p>
-      <w:pPr>
-        <w:pStyle w:val="BodyText"/>
-      </w:pPr>
-      <w:r>
-        <w:t xml:space="preserve">This article examines how bibliometric patterns and thematic evidence on sustainable building maintenance can support a multi-criteria protocol adaptable to public university buildings. A systematized integrative review with bibliometric mapping and thematic synthesis was conducted in Scopus, Web of Science, and Crossref from 2010 to 2026. The field structure was examined through 372 records with stronger relevance and documentary sufficiency; screening and auditing produced 104 records for thematic synthesis. Because the original search captured artificial intelligence and machine learning only incidentally, a complementary sensitivity search dedicated to that theme was conducted in the same three databases; after deduplication and auditing under the same eligibility criteria, the thematic core was expanded to 121 records. The field is shifting from a vocabulary centered on efficiency, performance, and green buildings toward BIM, digital twins, carbon, life cycle, predictive maintenance, and, still emergent, machine learning. Technical-operational, institutional, and environmental dimensions were prominent in the thematic core, as were operational performance, information, cost, service life, and energy. Formally named multi-criteria methods were less frequent than generic decision-support frameworks; documentary presence of artificial intelligence does not constitute evidence of institutional adoption maturity. Only 12 records reported gaps specific to public higher education institutions. The study contributes a conceptual analytical matrix informed by the literature synthesis and translated into a candidate operational protocol with indicators, data sources, periodicity, preference direction, and veto rules. Weights and aggregation functions are not derived from documentary frequencies and require subsequent validation.</w:t>
-      </w:r>
-    </w:p>
-    <w:p>
-      <w:pPr>
-        <w:pStyle w:val="BodyText"/>
-      </w:pPr>
-      <w:r>
-        <w:rPr>
-          <w:bCs/>
-          <w:b/>
-        </w:rPr>
-        <w:t xml:space="preserve">Keywords:</w:t>
-      </w:r>
-      <w:r>
-        <w:t xml:space="preserve"> </w:t>
-      </w:r>
-      <w:r>
-        <w:t xml:space="preserve">building maintenance; sustainability; multi-criteria decision-making; public building management; bibliometrics.</w:t>
-      </w:r>
-    </w:p>
-    <w:bookmarkStart w:id="20" w:name="sec:introducao"/>
-    <w:p>
-      <w:pPr>
-        <w:pStyle w:val="Heading1"/>
-      </w:pPr>
-      <w:r>
-        <w:t xml:space="preserve">Introdução</w:t>
-      </w:r>
-    </w:p>
-    <w:p>
-      <w:pPr>
-        <w:pStyle w:val="FirstParagraph"/>
-      </w:pPr>
-      <w:r>
-        <w:t xml:space="preserve">A gestão de edificações públicas universitárias enfrenta uma tensão decisória recorrente: as intervenções mais visíveis ou urgentes competem por recursos com ações preventivas, ambientais, sociais e institucionais cujos benefícios se distribuem ao longo do ciclo de vida. A ausência de uma arquitetura transparente de critérios pode favorecer decisões reativas e dificultar a justificativa técnica, orçamentária e pública da prioridade atribuída a cada ativo. A manutenção predial condiciona desempenho, segurança, durabilidade e continuidade dos serviços, e a NBR 5674 estabelece requisitos de planejamento, controle e avaliação do sistema de manutenção</w:t>
-      </w:r>
-      <w:r>
-        <w:t xml:space="preserve"> </w:t>
-      </w:r>
-      <w:r>
-        <w:t xml:space="preserve">(Associação Brasileira de Normas Técnicas 2012)</w:t>
-      </w:r>
-      <w:r>
-        <w:t xml:space="preserve">. No âmbito público brasileiro, essa responsabilidade também se vincula a deveres legais e administrativos do gestor</w:t>
-      </w:r>
-      <w:r>
-        <w:t xml:space="preserve"> </w:t>
-      </w:r>
-      <w:r>
-        <w:t xml:space="preserve">(Araújo Neto 2015)</w:t>
-      </w:r>
-      <w:r>
-        <w:t xml:space="preserve">.</w:t>
-      </w:r>
-    </w:p>
-    <w:p>
-      <w:pPr>
-        <w:pStyle w:val="BodyText"/>
-      </w:pPr>
-      <w:r>
-        <w:t xml:space="preserve">Restrições orçamentárias, envelhecimento da infraestrutura e acúmulo de demandas tornam insuficiente uma ordenação baseada em custo ou urgência isolados. A análise de custos em universidade federal demonstra a utilidade de modelos de previsão para o planejamento orçamentário</w:t>
-      </w:r>
-      <w:r>
-        <w:t xml:space="preserve"> </w:t>
-      </w:r>
-      <w:r>
-        <w:t xml:space="preserve">(Martins and Espejo 2024)</w:t>
-      </w:r>
-      <w:r>
-        <w:t xml:space="preserve">, enquanto registros de ordens de serviço permitem reconhecer padrões de demanda e apoiar o planejamento de intervenções</w:t>
-      </w:r>
-      <w:r>
-        <w:t xml:space="preserve"> </w:t>
-      </w:r>
-      <w:r>
-        <w:t xml:space="preserve">(Morais, Paula, and Reis 2023)</w:t>
-      </w:r>
-      <w:r>
-        <w:t xml:space="preserve">. Esses dados, porém, precisam ser combinados a condição física, risco, energia, impacto ambiental, experiência dos usuários, conformidade e capacidade institucional.</w:t>
-      </w:r>
-    </w:p>
-    <w:p>
-      <w:pPr>
-        <w:pStyle w:val="BodyText"/>
-      </w:pPr>
-      <w:r>
-        <w:t xml:space="preserve">O</w:t>
+        <w:t xml:space="preserve">facility management</w:t>
+      </w:r>
+      <w:r>
+        <w:t xml:space="preserve"> </w:t>
+      </w:r>
+      <w:r>
+        <w:t xml:space="preserve">sustentável articula desempenho ambiental, econômico e social com planejamento, operação e gestão dos ativos construídos</w:t>
+      </w:r>
+      <w:r>
+        <w:t xml:space="preserve"> </w:t>
+      </w:r>
+      <w:r>
+        <w:t xml:space="preserve">(Nielsen, Sarasoja, and Galamba 2016; Opoku and Lee 2022; Okoro 2023)</w:t>
+      </w:r>
+      <w:r>
+        <w:t xml:space="preserve">. Os Objetivos de Desenvolvimento Sustentável oferecem metas públicas para infraestrutura, cidades e uso responsável de recursos, enquanto a abordagem ambiental, social e de governança (ESG, do inglês</w:t>
       </w:r>
       <w:r>
         <w:t xml:space="preserve"> </w:t>
@@ -333,31 +363,6 @@
           <w:iCs/>
           <w:i/>
         </w:rPr>
-        <w:t xml:space="preserve">facility management</w:t>
-      </w:r>
-      <w:r>
-        <w:t xml:space="preserve"> </w:t>
-      </w:r>
-      <w:r>
-        <w:t xml:space="preserve">sustentável articula desempenho ambiental, econômico e social com planejamento, operação e gestão dos ativos construídos</w:t>
-      </w:r>
-      <w:r>
-        <w:t xml:space="preserve"> </w:t>
-      </w:r>
-      <w:r>
-        <w:t xml:space="preserve">(Nielsen, Sarasoja, and Galamba 2016; Opoku and Lee 2022; Okoro 2023)</w:t>
-      </w:r>
-      <w:r>
-        <w:t xml:space="preserve">. Os Objetivos de Desenvolvimento Sustentável oferecem metas públicas para infraestrutura, cidades e uso responsável de recursos, enquanto a abordagem ambiental, social e de governança (ESG, do inglês</w:t>
-      </w:r>
-      <w:r>
-        <w:t xml:space="preserve"> </w:t>
-      </w:r>
-      <w:r>
-        <w:rPr>
-          <w:iCs/>
-          <w:i/>
-        </w:rPr>
         <w:t xml:space="preserve">environmental, social and governance</w:t>
       </w:r>
       <w:r>
@@ -370,7 +375,16 @@
         <w:t xml:space="preserve">(Okoro 2023; Ramantswana et al. 2026)</w:t>
       </w:r>
       <w:r>
-        <w:t xml:space="preserve">. Métodos de apoio multicritério podem explicitar compensações entre esses objetivos, desde que critérios, indicadores, pesos, regras não compensatórias e incertezas sejam documentados.</w:t>
+        <w:t xml:space="preserve">. Métodos de apoio multicritério podem explicitar compensações entre esses objetivos, desde que critérios, indicadores, pesos, regras não compensatórias e incertezas sejam documentados</w:t>
+      </w:r>
+      <w:r>
+        <w:t xml:space="preserve"> </w:t>
+      </w:r>
+      <w:r>
+        <w:t xml:space="preserve">(Alfalah et al. 2022; Naji, Gunduz, and Maki 2023; Masmoudi et al. 2026)</w:t>
+      </w:r>
+      <w:r>
+        <w:t xml:space="preserve">.</w:t>
       </w:r>
     </w:p>
     <w:p>
@@ -378,7 +392,40 @@
         <w:pStyle w:val="BodyText"/>
       </w:pPr>
       <w:r>
-        <w:t xml:space="preserve">O objetivo geral é analisar a estrutura bibliométrica e temática da literatura e, a partir dela, propor a arquitetura de um protocolo multicritério adaptável à priorização de intervenções em edificações públicas universitárias. A pergunta central (RQ0) é: como os padrões bibliométricos e a síntese temática da literatura podem fundamentar a arquitetura de critérios, indicadores e regras de decisão de um protocolo multicritério adaptável às edificações públicas universitárias? A análise responde a cinco questões específicas: quais dimensões de sustentabilidade são identificadas (RQ1); quais critérios de priorização são identificados (RQ2); quais métodos de apoio à decisão são identificados (RQ3); em quais contextos de edificação essas abordagens aparecem (RQ4); e quais lacunas são registradas para instituições públicas de ensino superior (RQ5).</w:t>
+        <w:t xml:space="preserve">Apesar dessa convergência potencial, estudos sobre digitalização e métodos decisórios ainda documentam separadamente integração de dados, previsão operacional, critérios de sustentabilidade e escolha multicritério, sem demonstrar de modo recorrente a cadeia completa até a decisão institucional</w:t>
+      </w:r>
+      <w:r>
+        <w:t xml:space="preserve"> </w:t>
+      </w:r>
+      <w:r>
+        <w:t xml:space="preserve">(Deng, Menassa, and Kamat 2021; Das 2025; Alfalah et al. 2022; Masmoudi et al. 2026)</w:t>
+      </w:r>
+      <w:r>
+        <w:t xml:space="preserve">. A lacuna abordada neste artigo é a conexão rastreável entre evidência científica, variável observável e regra pública de decisão, sem confundir frequência bibliográfica com importância normativa.</w:t>
+      </w:r>
+    </w:p>
+    <w:p>
+      <w:pPr>
+        <w:pStyle w:val="BodyText"/>
+      </w:pPr>
+      <w:r>
+        <w:t xml:space="preserve">O objetivo geral é analisar a estrutura bibliométrica e temática da literatura e, a partir dela, propor a arquitetura de um protocolo multicritério adaptável à priorização de intervenções em edificações públicas universitárias. A pergunta central (RQ0) é: como os padrões bibliométricos e a síntese temática da literatura podem fundamentar a arquitetura de critérios, indicadores e regras de decisão de um protocolo multicritério adaptável às edificações públicas universitárias?</w:t>
+      </w:r>
+    </w:p>
+    <w:p>
+      <w:pPr>
+        <w:pStyle w:val="BodyText"/>
+      </w:pPr>
+      <w:r>
+        <w:t xml:space="preserve">A análise foi orientada originalmente por cinco questões específicas: quais dimensões de sustentabilidade são identificadas (RQ1); quais critérios de priorização são identificados (RQ2); quais métodos de apoio à decisão são identificados (RQ3); em quais contextos de edificação essas abordagens aparecem (RQ4); e quais lacunas são registradas para instituições públicas de ensino superior (RQ5). Como verificação complementar, formulou-se a RQ6: em que medida uma busca de sensibilidade dedicada à inteligência artificial (IA) e ao aprendizado de máquina altera a identificação de métodos informacionais e preditivos aplicados à manutenção e à gestão de edificações? A RQ6 não redefine retrospectivamente a busca principal; ela testa uma possível insuficiência de cobertura temática identificada após a síntese inicial.</w:t>
+      </w:r>
+    </w:p>
+    <w:p>
+      <w:pPr>
+        <w:pStyle w:val="BodyText"/>
+      </w:pPr>
+      <w:r>
+        <w:t xml:space="preserve">A contribuição pretendida é tripla: separar o mapeamento estrutural do campo da síntese temática; testar a cobertura de métodos informacionais por uma busca de sensibilidade explicitamente delimitada; e traduzir os achados em especificação operacional cuja validade permaneça condicionada à participação institucional e ao teste empírico.</w:t>
       </w:r>
     </w:p>
     <w:bookmarkEnd w:id="20"/>
@@ -396,14 +443,23 @@
         <w:pStyle w:val="FirstParagraph"/>
       </w:pPr>
       <w:r>
-        <w:t xml:space="preserve">A literatura analisada pode ser organizada em cinco correntes complementares. Essa organização não substitui a classificação empírica do corpus; ela explicita os fundamentos usados para converter a síntese em arquitetura decisória. A Tabela </w:t>
+        <w:t xml:space="preserve">A literatura analisada pode ser organizada em cinco correntes complementares, abrangendo ciclo de vida, gestão sustentável de facilidades, efeitos sobre usuários, integração digital e apoio multicritério</w:t>
+      </w:r>
+      <w:r>
+        <w:t xml:space="preserve"> </w:t>
+      </w:r>
+      <w:r>
+        <w:t xml:space="preserve">(Nägeli et al. 2019; Nielsen, Sarasoja, and Galamba 2016; Alfalah et al. 2022; Deng, Menassa, and Kamat 2021; Masmoudi et al. 2026)</w:t>
+      </w:r>
+      <w:r>
+        <w:t xml:space="preserve">. Essa organização não substitui a classificação empírica do corpus; ela explicita os fundamentos usados para converter a síntese em arquitetura decisória. A Tabela </w:t>
       </w:r>
       <w:hyperlink w:anchor="tab:correntesteoricas">
         <w:r>
           <w:rPr>
             <w:rStyle w:val="Hyperlink"/>
           </w:rPr>
-          <w:t xml:space="preserve">[tab:correntesteoricas]</w:t>
+          <w:t xml:space="preserve">1</w:t>
         </w:r>
       </w:hyperlink>
       <w:r>
@@ -675,7 +731,7 @@
               <w:rPr>
                 <w:sz w:val="18"/>
               </w:rPr>
-              <w:t>BIM, digital twin, sensores, ontologias e manutenção preditiva.</w:t>
+              <w:t>BIM, digital twin, sensores, ontologias, IA e manutenção preditiva.</w:t>
             </w:r>
           </w:p>
         </w:tc>
@@ -688,7 +744,7 @@
               <w:rPr>
                 <w:sz w:val="18"/>
               </w:rPr>
-              <w:t>Rastreabilidade, integração de dados e atualização progressiva dos indicadores.</w:t>
+              <w:t>Rastreabilidade, integração de dados, diagnóstico e atualização progressiva dos indicadores.</w:t>
             </w:r>
           </w:p>
         </w:tc>
@@ -701,7 +757,7 @@
               <w:rPr>
                 <w:sz w:val="18"/>
               </w:rPr>
-              <w:t>Maturidade digital e interoperabilidade ainda heterogêneas.</w:t>
+              <w:t>Validação externa, interoperabilidade e governança ainda heterogêneas.</w:t>
             </w:r>
           </w:p>
         </w:tc>
@@ -776,7 +832,16 @@
         <w:t xml:space="preserve">(Nägeli et al. 2019)</w:t>
       </w:r>
       <w:r>
-        <w:t xml:space="preserve">. Estudos de manutenibilidade mostram ainda que decisões tomadas no projeto influenciam acesso, segurança e custo de intervenções futuras. No protocolo, essa corrente sustenta critérios como desempenho, risco, condição física, vida útil e qualidade do serviço.</w:t>
+        <w:t xml:space="preserve">. Estudos de manutenibilidade mostram ainda que decisões tomadas no projeto influenciam acesso, segurança e custo de intervenções futuras</w:t>
+      </w:r>
+      <w:r>
+        <w:t xml:space="preserve"> </w:t>
+      </w:r>
+      <w:r>
+        <w:t xml:space="preserve">(Othman and Kamal 2023; Chew and Conejos 2016; Conejos, Chew, and Azril 2019)</w:t>
+      </w:r>
+      <w:r>
+        <w:t xml:space="preserve">. No protocolo, essa corrente sustenta critérios como desempenho, risco, condição física, vida útil e qualidade do serviço.</w:t>
       </w:r>
     </w:p>
     <w:p>
@@ -793,7 +858,16 @@
         <w:t xml:space="preserve">(Nielsen, Sarasoja, and Galamba 2016; Opoku and Lee 2022; Okoro 2023)</w:t>
       </w:r>
       <w:r>
-        <w:t xml:space="preserve">. O ciclo de vida deve operar como eixo transversal, porque custos, riscos e impactos futuros podem aparecer em mais de uma dimensão e produzir dupla contagem se forem tratados como um bloco independente sem regras explícitas.</w:t>
+        <w:t xml:space="preserve">. No protocolo proposto, o ciclo de vida opera como eixo transversal para integrar custos, riscos e impactos futuros sem converter a mesma consequência temporal em critérios redundantes, opção analítica apoiada pela abordagem conjunta de manutenção, renovação e energia</w:t>
+      </w:r>
+      <w:r>
+        <w:t xml:space="preserve"> </w:t>
+      </w:r>
+      <w:r>
+        <w:t xml:space="preserve">(Nägeli et al. 2019)</w:t>
+      </w:r>
+      <w:r>
+        <w:t xml:space="preserve">.</w:t>
       </w:r>
     </w:p>
     <w:p>
@@ -831,7 +905,7 @@
         <w:t xml:space="preserve">digital twins</w:t>
       </w:r>
       <w:r>
-        <w:t xml:space="preserve">, sensores, ontologias e manutenção preditiva. Essas tecnologias podem conectar cadastro, condição, operação e histórico de intervenções, mas sua presença na literatura não comprova maturidade institucional. Revisões sobre a transição de BIM para</w:t>
+        <w:t xml:space="preserve">, sensores, ontologias, inteligência artificial e manutenção preditiva. Essas tecnologias podem conectar cadastro, condição, operação e histórico de intervenções, mas cumprem funções distintas: plataformas organizam e sincronizam dados; modelos treinados estimam demanda, vida útil ou anomalias; e a decisão institucional ainda precisa estabelecer critérios, preferências e restrições. Revisões sobre a transição de BIM para</w:t>
       </w:r>
       <w:r>
         <w:t xml:space="preserve"> </w:t>
@@ -856,6 +930,15 @@
         <w:t xml:space="preserve">(Deng, Menassa, and Kamat 2021; Espinosa Gispert et al. 2025; Goretti and Kaming 2023)</w:t>
       </w:r>
       <w:r>
+        <w:t xml:space="preserve">. Estudos integrais do lote de sensibilidade reforçam a necessidade de validação contextual e governança dos dados</w:t>
+      </w:r>
+      <w:r>
+        <w:t xml:space="preserve"> </w:t>
+      </w:r>
+      <w:r>
+        <w:t xml:space="preserve">(Motuzienė et al. 2025; Wu and Mundt-Petersen 2025; Das 2025)</w:t>
+      </w:r>
+      <w:r>
         <w:t xml:space="preserve">.</w:t>
       </w:r>
     </w:p>
@@ -864,7 +947,7 @@
         <w:pStyle w:val="BodyText"/>
       </w:pPr>
       <w:r>
-        <w:t xml:space="preserve">A corrente de integração multicritério fornece procedimentos para estruturar conflitos entre objetivos. AHP, TOPSIS e ANP apoiam ponderação e ordenação; Delphi apoia construção de consenso; métodos fuzzy tratam julgamentos linguísticos; otimização explora restrições e combinações. Aplicações em edifícios públicos, educacionais e</w:t>
+        <w:t xml:space="preserve">A corrente de integração multicritério fornece procedimentos para estruturar conflitos entre objetivos. AHP, TOPSIS e ANP apoiam ponderação e ordenação; Delphi apoia construção de consenso; métodos fuzzy tratam julgamentos linguísticos; e otimização explora restrições e combinações, funções observadas em aplicações educacionais, de</w:t>
       </w:r>
       <w:r>
         <w:t xml:space="preserve"> </w:t>
@@ -880,7 +963,7 @@
         <w:t xml:space="preserve"> </w:t>
       </w:r>
       <w:r>
-        <w:t xml:space="preserve">confirmam a utilidade dessas abordagens</w:t>
+        <w:t xml:space="preserve">e de manutenção pública</w:t>
       </w:r>
       <w:r>
         <w:t xml:space="preserve"> </w:t>
@@ -889,7 +972,16 @@
         <w:t xml:space="preserve">(Alfalah et al. 2022; Naji, Gunduz, and Maki 2023; Masmoudi et al. 2026)</w:t>
       </w:r>
       <w:r>
-        <w:t xml:space="preserve">. Ainda assim, nenhum método deve ser escolhido apenas pela frequência bibliográfica: o problema decisório, a qualidade dos dados, a compensabilidade dos critérios e a capacidade dos usuários precisam orientar a seleção.</w:t>
+        <w:t xml:space="preserve">. Ainda assim, a seleção do método deve considerar o problema decisório, a qualidade dos dados, a compensabilidade dos critérios e a capacidade dos usuários, e não apenas sua frequência bibliográfica</w:t>
+      </w:r>
+      <w:r>
+        <w:t xml:space="preserve"> </w:t>
+      </w:r>
+      <w:r>
+        <w:t xml:space="preserve">(Alfalah et al. 2022; Naji, Gunduz, and Maki 2023; Masmoudi et al. 2026)</w:t>
+      </w:r>
+      <w:r>
+        <w:t xml:space="preserve">.</w:t>
       </w:r>
     </w:p>
     <w:bookmarkEnd w:id="21"/>
@@ -927,9 +1019,11 @@
       <w:r>
         <w:t xml:space="preserve">.</w:t>
       </w:r>
-      <w:r>
-        <w:t xml:space="preserve"> </w:t>
-      </w:r>
+    </w:p>
+    <w:p>
+      <w:pPr>
+        <w:pStyle w:val="BodyText"/>
+      </w:pPr>
       <w:r>
         <w:t xml:space="preserve">A análise foi organizada em dois níveis complementares. A camada bibliométrica ampliada utilizou os 372 registros classificados como</w:t>
       </w:r>
@@ -943,7 +1037,10 @@
         <w:t xml:space="preserve">A_nucleo_forte</w:t>
       </w:r>
       <w:r>
-        <w:t xml:space="preserve">, todos com título, ano, fonte e resumo e 329 com palavras-chave. Esse conjunto foi empregado para analisar fontes, coocorrência de palavras-chave, mapa temático e evolução entre 2010–2020 e 2021–2026. O núcleo final de 104 registros permaneceu como base da síntese temática diretamente alinhada às perguntas de pesquisa. A rede de colaboração não foi produzida porque apenas 91 dos 372 registros possuíam autores e não havia afiliações; o acoplamento bibliográfico não foi calculado porque as referências citadas não foram preservadas no corpus consolidado. A normalização reuniu variantes ortográficas e siglas equivalentes, e as relações de coocorrência foram normalizadas pelas frequências marginais.</w:t>
+        <w:t xml:space="preserve"> </w:t>
+      </w:r>
+      <w:r>
+        <w:t xml:space="preserve">na busca principal, todos com título, ano, fonte e resumo e 329 com palavras-chave. Esse conjunto foi empregado para analisar fontes, coocorrência de palavras-chave, mapa temático e evolução entre 2010–2020 e 2021–2026. A síntese temática utilizou inicialmente 104 registros e passou a 121 após a incorporação de 17 registros identificados pela busca complementar de sensibilidade para inteligência artificial e aprendizado de máquina. Os registros recuperados por essa busca direcionada não foram acrescentados à camada bibliométrica de 372, porque o enriquecimento deliberado com termos de IA e aprendizado de máquina alteraria artificialmente a estrutura temática observada na busca principal. A rede de colaboração não foi produzida porque apenas 91 dos 372 registros possuíam autores e não havia afiliações; o acoplamento bibliográfico não foi calculado porque as referências citadas não foram preservadas no corpus consolidado. A normalização reuniu variantes ortográficas e siglas equivalentes, e as relações de coocorrência foram normalizadas pelas frequências marginais.</w:t>
       </w:r>
     </w:p>
     <w:p>
@@ -977,7 +1074,7 @@
         <w:pStyle w:val="FirstParagraph"/>
       </w:pPr>
       <w:r>
-        <w:t xml:space="preserve">Consultas, exportações, codebook, matrizes intermediárias, scripts determinísticos, figuras e verificações automatizadas foram versionados no repositório da pesquisa. O fluxo preserva identificadores, proveniência das bases, regras de deduplicação, decisões de triagem e parâmetros da síntese, permitindo que resultados numéricos e produtos bibliométricos sejam recompilados a partir dos arquivos disponíveis. Essa rastreabilidade constitui uma contribuição de ciência aberta, ainda que não substitua pré-registro nem revisão independente.</w:t>
+        <w:t xml:space="preserve">Consultas, exportações, manual de codificação, matrizes intermediárias, scripts determinísticos, figuras e verificações automatizadas foram versionados no repositório da pesquisa. O fluxo preserva identificadores, proveniência das bases, regras de deduplicação, decisões de triagem e parâmetros da síntese, permitindo que resultados numéricos e produtos bibliométricos sejam recompilados a partir dos arquivos disponíveis. Essa rastreabilidade constitui uma contribuição de ciência aberta, ainda que não substitua pré-registro nem revisão independente.</w:t>
       </w:r>
     </w:p>
     <w:p>
@@ -985,7 +1082,7 @@
         <w:pStyle w:val="BodyText"/>
       </w:pPr>
       <w:r>
-        <w:t xml:space="preserve">O caráter determinístico das rotinas reduz variações de execução: a mesma entrada, a mesma versão do código e os mesmos parâmetros produzem a mesma saída. Isso não elimina subjetividade. O codebook, os limiares, as categorias, as expressões de busca e as decisões humanas sobre casos duvidosos incorporam escolhas analíticas. A automação torna essas escolhas mais auditáveis, mas não as converte em verdade objetiva.</w:t>
+        <w:t xml:space="preserve">O caráter determinístico das rotinas reduz variações de execução: a mesma entrada, a mesma versão do código e os mesmos parâmetros produzem a mesma saída. Isso não elimina subjetividade. O manual de codificação, os limiares, as categorias, as expressões de busca e as decisões humanas sobre casos duvidosos incorporam escolhas analíticas. A automação torna essas escolhas mais auditáveis, mas não as converte em verdade objetiva.</w:t>
       </w:r>
     </w:p>
     <w:p>
@@ -1070,6 +1167,15 @@
           <w:i/>
         </w:rPr>
         <w:t xml:space="preserve">Analytic Network Process</w:t>
+      </w:r>
+      <w:r>
+        <w:t xml:space="preserve">; aplicações dessas famílias metodológicas no domínio predial são apresentadas por</w:t>
+      </w:r>
+      <w:r>
+        <w:t xml:space="preserve"> </w:t>
+      </w:r>
+      <w:r>
+        <w:t xml:space="preserve">Alfalah et al. (2022; Naji, Gunduz, and Maki 2023; Masmoudi et al. 2026)</w:t>
       </w:r>
       <w:r>
         <w:t xml:space="preserve">.</w:t>
@@ -1087,7 +1193,7 @@
           <w:rPr>
             <w:rStyle w:val="Hyperlink"/>
           </w:rPr>
-          <w:t xml:space="preserve">[tab:alinhamentorq]</w:t>
+          <w:t xml:space="preserve">2</w:t>
         </w:r>
       </w:hyperlink>
       <w:r>
@@ -1385,7 +1491,7 @@
               <w:rPr>
                 <w:sz w:val="18"/>
               </w:rPr>
-              <w:t>Seção 6 e Tabela [tab:criteriospriorizacao].</w:t>
+              <w:t>Seção 6 e Tabela 8.</w:t>
             </w:r>
           </w:p>
         </w:tc>
@@ -1519,7 +1625,7 @@
               <w:rPr>
                 <w:sz w:val="18"/>
               </w:rPr>
-              <w:t>Seção 8 e Tabela [tab:contexto].</w:t>
+              <w:t>Seção 8 e Tabela 9.</w:t>
             </w:r>
           </w:p>
         </w:tc>
@@ -1587,6 +1693,73 @@
                 <w:sz w:val="18"/>
               </w:rPr>
               <w:t>Seções 8, 11 e 12.</w:t>
+            </w:r>
+          </w:p>
+        </w:tc>
+      </w:tr>
+      <w:tr>
+        <w:tc>
+          <w:tcPr>
+            <w:tcW w:type="dxa" w:w="1872"/>
+          </w:tcPr>
+          <w:p>
+            <w:r>
+              <w:rPr>
+                <w:sz w:val="18"/>
+              </w:rPr>
+              <w:t>RQ6</w:t>
+            </w:r>
+          </w:p>
+        </w:tc>
+        <w:tc>
+          <w:tcPr>
+            <w:tcW w:type="dxa" w:w="1872"/>
+          </w:tcPr>
+          <w:p>
+            <w:r>
+              <w:rPr>
+                <w:sz w:val="18"/>
+              </w:rPr>
+              <w:t>Efeito da busca de sensibilidade sobre a identificação de IA e aprendizado de máquina.</w:t>
+            </w:r>
+          </w:p>
+        </w:tc>
+        <w:tc>
+          <w:tcPr>
+            <w:tcW w:type="dxa" w:w="1872"/>
+          </w:tcPr>
+          <w:p>
+            <w:r>
+              <w:rPr>
+                <w:sz w:val="18"/>
+              </w:rPr>
+              <w:t>Técnica computacional confirmada, objeto predial e sustentabilidade; termos ambíguos exigem contexto adicional.</w:t>
+            </w:r>
+          </w:p>
+        </w:tc>
+        <w:tc>
+          <w:tcPr>
+            <w:tcW w:type="dxa" w:w="1872"/>
+          </w:tcPr>
+          <w:p>
+            <w:r>
+              <w:rPr>
+                <w:sz w:val="18"/>
+              </w:rPr>
+              <w:t>Classe de evidência RQ6; técnica identificada; contexto; decisão de incorporação.</w:t>
+            </w:r>
+          </w:p>
+        </w:tc>
+        <w:tc>
+          <w:tcPr>
+            <w:tcW w:type="dxa" w:w="1872"/>
+          </w:tcPr>
+          <w:p>
+            <w:r>
+              <w:rPr>
+                <w:sz w:val="18"/>
+              </w:rPr>
+              <w:t>Seções 3.4, 7, 10 e 12.</w:t>
             </w:r>
           </w:p>
         </w:tc>
@@ -1598,7 +1771,7 @@
         <w:pStyle w:val="BodyText"/>
       </w:pPr>
       <w:r>
-        <w:t xml:space="preserve">A busca abrangeu publicações de 2010 a 2026 nas bases Scopus, Web of Science e Crossref. As 13 consultas e as exportações correspondentes foram executadas em 8 de julho de 2026. Na Scopus, o enriquecimento manual realizado em 9 de julho de 2026, por casamento de EID com a exportação do site, identificou cinco registros existentes apenas no arquivo manual e os incorporou ao corpus. Na Web of Science, a recontagem do quarto arquivo corrigiu o total de 502 para 503 registros; tratou-se de correção do método de contagem, não de novo registro. As consultas foram organizadas em quatro eixos: manutenção e sustentabilidade; contexto público universitário; priorização da manutenção; e gestão de ativos no ciclo de vida.</w:t>
+        <w:t xml:space="preserve">A busca principal abrangeu publicações de 2010 a 2026 nas bases Scopus, Web of Science e Crossref. Suas 13 consultas foram executadas em 8 de julho de 2026. Na Scopus, o enriquecimento manual realizado em 9 de julho de 2026, por casamento de EID com a exportação do site, identificou cinco registros existentes apenas no arquivo manual e os incorporou ao corpus. Na Web of Science, a recontagem do quarto arquivo corrigiu o total de 502 para 503 registros; tratou-se de correção do método de contagem, não de novo registro. As consultas principais foram organizadas em quatro eixos: manutenção e sustentabilidade; contexto público universitário; priorização da manutenção; e gestão de ativos no ciclo de vida.</w:t>
       </w:r>
     </w:p>
     <w:p>
@@ -1651,21 +1824,52 @@
         <w:t xml:space="preserve">(Crossref 2026)</w:t>
       </w:r>
       <w:r>
-        <w:t xml:space="preserve">. A Tabela </w:t>
+        <w:t xml:space="preserve">.</w:t>
+      </w:r>
+    </w:p>
+    <w:p>
+      <w:pPr>
+        <w:pStyle w:val="BodyText"/>
+      </w:pPr>
+      <w:r>
+        <w:t xml:space="preserve">A busca complementar de sensibilidade foi executada em 12 de julho de 2026 nas mesmas três fontes. Os arquivos recebidos preservam uma exportação Scopus com 3.169 registros, duas partes não sobrepostas da Web of Science com 1.559 registros e dez consultas Crossref com 200 registros cada. As dez expressões textuais do Crossref estão registradas linha a linha no arquivo bruto. As strings nativas exatas usadas na Scopus e na Web of Science não foram preservadas nos arquivos exportados recebidos; por isso, não foram reconstruídas por inferência. Essa lacuna é declarada na tabela-fonte, sem impedir a verificação dos campos, datas, período e totais efetivamente exportados.</w:t>
+      </w:r>
+    </w:p>
+    <w:p>
+      <w:pPr>
+        <w:pStyle w:val="BodyText"/>
+      </w:pPr>
+      <w:r>
+        <w:t xml:space="preserve">A Tabela </w:t>
       </w:r>
       <w:hyperlink w:anchor="tab:estrategiabusca">
         <w:r>
           <w:rPr>
             <w:rStyle w:val="Hyperlink"/>
           </w:rPr>
-          <w:t xml:space="preserve">[tab:estrategiabusca]</w:t>
+          <w:t xml:space="preserve">3</w:t>
         </w:r>
       </w:hyperlink>
       <w:r>
         <w:t xml:space="preserve"> </w:t>
       </w:r>
       <w:r>
-        <w:t xml:space="preserve">consolida os parâmetros verificáveis.</w:t>
+        <w:t xml:space="preserve">consolida as duas rodadas. O arquivo</w:t>
+      </w:r>
+      <w:r>
+        <w:t xml:space="preserve"> </w:t>
+      </w:r>
+      <w:r>
+        <w:rPr>
+          <w:rStyle w:val="VerbatimChar"/>
+        </w:rPr>
+        <w:t xml:space="preserve">latex-artigo/fontes/tabela_estrategia_busca.csv</w:t>
+      </w:r>
+      <w:r>
+        <w:t xml:space="preserve"> </w:t>
+      </w:r>
+      <w:r>
+        <w:t xml:space="preserve">preserva uma linha por consulta, com expressão documentada, campo, data, período, retorno bruto e observação. A soma de 18.846 corresponde apenas ao volume operacional das duas rodadas antes da deduplicação e não constitui corpus homogêneo, porque a busca de sensibilidade foi deliberadamente enriquecida para IA e aprendizado de máquina.</w:t>
       </w:r>
     </w:p>
     <w:tbl>
@@ -1700,6 +1904,20 @@
                 <w:b/>
                 <w:sz w:val="18"/>
               </w:rPr>
+              <w:t>Rodada</w:t>
+            </w:r>
+          </w:p>
+        </w:tc>
+        <w:tc>
+          <w:tcPr>
+            <w:tcW w:type="dxa" w:w="1560"/>
+          </w:tcPr>
+          <w:p>
+            <w:r>
+              <w:rPr>
+                <w:b/>
+                <w:sz w:val="18"/>
+              </w:rPr>
               <w:t>Base</w:t>
             </w:r>
           </w:p>
@@ -1714,7 +1932,7 @@
                 <w:b/>
                 <w:sz w:val="18"/>
               </w:rPr>
-              <w:t>Data documentada</w:t>
+              <w:t>Data</w:t>
             </w:r>
           </w:p>
         </w:tc>
@@ -1728,7 +1946,7 @@
                 <w:b/>
                 <w:sz w:val="18"/>
               </w:rPr>
-              <w:t>Período</w:t>
+              <w:t>Campo e consultas</w:t>
             </w:r>
           </w:p>
         </w:tc>
@@ -1742,7 +1960,7 @@
                 <w:b/>
                 <w:sz w:val="18"/>
               </w:rPr>
-              <w:t>Campo ou modelo</w:t>
+              <w:t>Registros</w:t>
             </w:r>
           </w:p>
         </w:tc>
@@ -1756,21 +1974,7 @@
                 <w:b/>
                 <w:sz w:val="18"/>
               </w:rPr>
-              <w:t>Registros</w:t>
-            </w:r>
-          </w:p>
-        </w:tc>
-        <w:tc>
-          <w:tcPr>
-            <w:tcW w:type="dxa" w:w="1560"/>
-          </w:tcPr>
-          <w:p>
-            <w:r>
-              <w:rPr>
-                <w:b/>
-                <w:sz w:val="18"/>
-              </w:rPr>
-              <w:t>Limites e função</w:t>
+              <w:t>Documentação</w:t>
             </w:r>
           </w:p>
         </w:tc>
@@ -1785,6 +1989,19 @@
               <w:rPr>
                 <w:sz w:val="18"/>
               </w:rPr>
+              <w:t>Principal</w:t>
+            </w:r>
+          </w:p>
+        </w:tc>
+        <w:tc>
+          <w:tcPr>
+            <w:tcW w:type="dxa" w:w="1560"/>
+          </w:tcPr>
+          <w:p>
+            <w:r>
+              <w:rPr>
+                <w:sz w:val="18"/>
+              </w:rPr>
               <w:t>Scopus</w:t>
             </w:r>
           </w:p>
@@ -1798,7 +2015,7 @@
               <w:rPr>
                 <w:sz w:val="18"/>
               </w:rPr>
-              <w:t>08/07/2026; enriquecimento em 09/07/2026</w:t>
+              <w:t>08–09/07/2026</w:t>
             </w:r>
           </w:p>
         </w:tc>
@@ -1811,7 +2028,7 @@
               <w:rPr>
                 <w:sz w:val="18"/>
               </w:rPr>
-              <w:t>2010–2026</w:t>
+              <w:t>4 em TITLE-ABS-KEY; enriquecimento por EID</w:t>
             </w:r>
           </w:p>
         </w:tc>
@@ -1824,7 +2041,7 @@
               <w:rPr>
                 <w:sz w:val="18"/>
               </w:rPr>
-              <w:t>4 consultas em TITLE-ABS-KEY</w:t>
+              <w:t>9.438</w:t>
             </w:r>
           </w:p>
         </w:tc>
@@ -1837,20 +2054,7 @@
               <w:rPr>
                 <w:sz w:val="18"/>
               </w:rPr>
-              <w:t>9.438</w:t>
-            </w:r>
-          </w:p>
-        </w:tc>
-        <w:tc>
-          <w:tcPr>
-            <w:tcW w:type="dxa" w:w="1560"/>
-          </w:tcPr>
-          <w:p>
-            <w:r>
-              <w:rPr>
-                <w:sz w:val="18"/>
-              </w:rPr>
-              <w:t>Base principal; 9.433 da API e cinco exclusivos do export manual.</w:t>
+              <w:t>Strings preservadas; 9.433 da API e cinco do export manual.</w:t>
             </w:r>
           </w:p>
         </w:tc>
@@ -1865,6 +2069,19 @@
               <w:rPr>
                 <w:sz w:val="18"/>
               </w:rPr>
+              <w:t>Principal</w:t>
+            </w:r>
+          </w:p>
+        </w:tc>
+        <w:tc>
+          <w:tcPr>
+            <w:tcW w:type="dxa" w:w="1560"/>
+          </w:tcPr>
+          <w:p>
+            <w:r>
+              <w:rPr>
+                <w:sz w:val="18"/>
+              </w:rPr>
               <w:t>Web of Science</w:t>
             </w:r>
           </w:p>
@@ -1891,7 +2108,7 @@
               <w:rPr>
                 <w:sz w:val="18"/>
               </w:rPr>
-              <w:t>2010–2026</w:t>
+              <w:t>4 em TS (Topic)</w:t>
             </w:r>
           </w:p>
         </w:tc>
@@ -1904,7 +2121,7 @@
               <w:rPr>
                 <w:sz w:val="18"/>
               </w:rPr>
-              <w:t>4 buscas manuais em TS (Topic)</w:t>
+              <w:t>1.680</w:t>
             </w:r>
           </w:p>
         </w:tc>
@@ -1917,20 +2134,7 @@
               <w:rPr>
                 <w:sz w:val="18"/>
               </w:rPr>
-              <w:t>1.680</w:t>
-            </w:r>
-          </w:p>
-        </w:tc>
-        <w:tc>
-          <w:tcPr>
-            <w:tcW w:type="dxa" w:w="1560"/>
-          </w:tcPr>
-          <w:p>
-            <w:r>
-              <w:rPr>
-                <w:sz w:val="18"/>
-              </w:rPr>
-              <w:t>Base independente; A4 recontado em 503; associação A1–A4 aos RIS informada de memória.</w:t>
+              <w:t>Strings preservadas; quarta exportação recontada em 503.</w:t>
             </w:r>
           </w:p>
         </w:tc>
@@ -1945,6 +2149,19 @@
               <w:rPr>
                 <w:sz w:val="18"/>
               </w:rPr>
+              <w:t>Principal</w:t>
+            </w:r>
+          </w:p>
+        </w:tc>
+        <w:tc>
+          <w:tcPr>
+            <w:tcW w:type="dxa" w:w="1560"/>
+          </w:tcPr>
+          <w:p>
+            <w:r>
+              <w:rPr>
+                <w:sz w:val="18"/>
+              </w:rPr>
               <w:t>Crossref</w:t>
             </w:r>
           </w:p>
@@ -1971,7 +2188,7 @@
               <w:rPr>
                 <w:sz w:val="18"/>
               </w:rPr>
-              <w:t>2010–2026</w:t>
+              <w:t>5 em query.bibliographic</w:t>
             </w:r>
           </w:p>
         </w:tc>
@@ -1984,7 +2201,7 @@
               <w:rPr>
                 <w:sz w:val="18"/>
               </w:rPr>
-              <w:t>5 consultas em query.bibliographic</w:t>
+              <w:t>1.000</w:t>
             </w:r>
           </w:p>
         </w:tc>
@@ -1997,20 +2214,7 @@
               <w:rPr>
                 <w:sz w:val="18"/>
               </w:rPr>
-              <w:t>1.000</w:t>
-            </w:r>
-          </w:p>
-        </w:tc>
-        <w:tc>
-          <w:tcPr>
-            <w:tcW w:type="dxa" w:w="1560"/>
-          </w:tcPr>
-          <w:p>
-            <w:r>
-              <w:rPr>
-                <w:sz w:val="18"/>
-              </w:rPr>
-              <w:t>Fonte complementar; 200 resultados por consulta, ordenados por relevância.</w:t>
+              <w:t>Consultas preservadas; 200 resultados por relevância.</w:t>
             </w:r>
           </w:p>
         </w:tc>
@@ -2025,7 +2229,7 @@
               <w:rPr>
                 <w:sz w:val="18"/>
               </w:rPr>
-              <w:t>Total</w:t>
+              <w:t>(lr)1-6</w:t>
             </w:r>
           </w:p>
         </w:tc>
@@ -2038,7 +2242,7 @@
               <w:rPr>
                 <w:sz w:val="18"/>
               </w:rPr>
-              <w:t>&amp;</w:t>
+              <w:t>12.118</w:t>
             </w:r>
           </w:p>
         </w:tc>
@@ -2051,7 +2255,7 @@
               <w:rPr>
                 <w:sz w:val="18"/>
               </w:rPr>
-              <w:t>13 consultas</w:t>
+              <w:t>13 consultas, antes da deduplicação.</w:t>
             </w:r>
           </w:p>
         </w:tc>
@@ -2064,7 +2268,6 @@
               <w:rPr>
                 <w:sz w:val="18"/>
               </w:rPr>
-              <w:t>12.118</w:t>
             </w:r>
           </w:p>
         </w:tc>
@@ -2077,7 +2280,323 @@
               <w:rPr>
                 <w:sz w:val="18"/>
               </w:rPr>
-              <w:t>Volume anterior à deduplicação.</w:t>
+            </w:r>
+          </w:p>
+        </w:tc>
+        <w:tc>
+          <w:tcPr>
+            <w:tcW w:type="dxa" w:w="1560"/>
+          </w:tcPr>
+          <w:p>
+            <w:r>
+              <w:rPr>
+                <w:sz w:val="18"/>
+              </w:rPr>
+            </w:r>
+          </w:p>
+        </w:tc>
+      </w:tr>
+      <w:tr>
+        <w:tc>
+          <w:tcPr>
+            <w:tcW w:type="dxa" w:w="1560"/>
+          </w:tcPr>
+          <w:p>
+            <w:r>
+              <w:rPr>
+                <w:sz w:val="18"/>
+              </w:rPr>
+              <w:t>Sensibilidade IA/ML</w:t>
+            </w:r>
+          </w:p>
+        </w:tc>
+        <w:tc>
+          <w:tcPr>
+            <w:tcW w:type="dxa" w:w="1560"/>
+          </w:tcPr>
+          <w:p>
+            <w:r>
+              <w:rPr>
+                <w:sz w:val="18"/>
+              </w:rPr>
+              <w:t>Scopus</w:t>
+            </w:r>
+          </w:p>
+        </w:tc>
+        <w:tc>
+          <w:tcPr>
+            <w:tcW w:type="dxa" w:w="1560"/>
+          </w:tcPr>
+          <w:p>
+            <w:r>
+              <w:rPr>
+                <w:sz w:val="18"/>
+              </w:rPr>
+              <w:t>12/07/2026</w:t>
+            </w:r>
+          </w:p>
+        </w:tc>
+        <w:tc>
+          <w:tcPr>
+            <w:tcW w:type="dxa" w:w="1560"/>
+          </w:tcPr>
+          <w:p>
+            <w:r>
+              <w:rPr>
+                <w:sz w:val="18"/>
+              </w:rPr>
+              <w:t>1 exportação de TITLE-ABS-KEY</w:t>
+            </w:r>
+          </w:p>
+        </w:tc>
+        <w:tc>
+          <w:tcPr>
+            <w:tcW w:type="dxa" w:w="1560"/>
+          </w:tcPr>
+          <w:p>
+            <w:r>
+              <w:rPr>
+                <w:sz w:val="18"/>
+              </w:rPr>
+              <w:t>3.169</w:t>
+            </w:r>
+          </w:p>
+        </w:tc>
+        <w:tc>
+          <w:tcPr>
+            <w:tcW w:type="dxa" w:w="1560"/>
+          </w:tcPr>
+          <w:p>
+            <w:r>
+              <w:rPr>
+                <w:sz w:val="18"/>
+              </w:rPr>
+              <w:t>String nativa exata não preservada no arquivo recebido.</w:t>
+            </w:r>
+          </w:p>
+        </w:tc>
+      </w:tr>
+      <w:tr>
+        <w:tc>
+          <w:tcPr>
+            <w:tcW w:type="dxa" w:w="1560"/>
+          </w:tcPr>
+          <w:p>
+            <w:r>
+              <w:rPr>
+                <w:sz w:val="18"/>
+              </w:rPr>
+              <w:t>Sensibilidade IA/ML</w:t>
+            </w:r>
+          </w:p>
+        </w:tc>
+        <w:tc>
+          <w:tcPr>
+            <w:tcW w:type="dxa" w:w="1560"/>
+          </w:tcPr>
+          <w:p>
+            <w:r>
+              <w:rPr>
+                <w:sz w:val="18"/>
+              </w:rPr>
+              <w:t>Web of Science</w:t>
+            </w:r>
+          </w:p>
+        </w:tc>
+        <w:tc>
+          <w:tcPr>
+            <w:tcW w:type="dxa" w:w="1560"/>
+          </w:tcPr>
+          <w:p>
+            <w:r>
+              <w:rPr>
+                <w:sz w:val="18"/>
+              </w:rPr>
+              <w:t>12/07/2026</w:t>
+            </w:r>
+          </w:p>
+        </w:tc>
+        <w:tc>
+          <w:tcPr>
+            <w:tcW w:type="dxa" w:w="1560"/>
+          </w:tcPr>
+          <w:p>
+            <w:r>
+              <w:rPr>
+                <w:sz w:val="18"/>
+              </w:rPr>
+              <w:t>1 busca em TS (Topic), exportada em duas partes</w:t>
+            </w:r>
+          </w:p>
+        </w:tc>
+        <w:tc>
+          <w:tcPr>
+            <w:tcW w:type="dxa" w:w="1560"/>
+          </w:tcPr>
+          <w:p>
+            <w:r>
+              <w:rPr>
+                <w:sz w:val="18"/>
+              </w:rPr>
+              <w:t>1.559</w:t>
+            </w:r>
+          </w:p>
+        </w:tc>
+        <w:tc>
+          <w:tcPr>
+            <w:tcW w:type="dxa" w:w="1560"/>
+          </w:tcPr>
+          <w:p>
+            <w:r>
+              <w:rPr>
+                <w:sz w:val="18"/>
+              </w:rPr>
+              <w:t>String nativa exata não preservada nos RIS recebidos.</w:t>
+            </w:r>
+          </w:p>
+        </w:tc>
+      </w:tr>
+      <w:tr>
+        <w:tc>
+          <w:tcPr>
+            <w:tcW w:type="dxa" w:w="1560"/>
+          </w:tcPr>
+          <w:p>
+            <w:r>
+              <w:rPr>
+                <w:sz w:val="18"/>
+              </w:rPr>
+              <w:t>Sensibilidade IA/ML</w:t>
+            </w:r>
+          </w:p>
+        </w:tc>
+        <w:tc>
+          <w:tcPr>
+            <w:tcW w:type="dxa" w:w="1560"/>
+          </w:tcPr>
+          <w:p>
+            <w:r>
+              <w:rPr>
+                <w:sz w:val="18"/>
+              </w:rPr>
+              <w:t>Crossref</w:t>
+            </w:r>
+          </w:p>
+        </w:tc>
+        <w:tc>
+          <w:tcPr>
+            <w:tcW w:type="dxa" w:w="1560"/>
+          </w:tcPr>
+          <w:p>
+            <w:r>
+              <w:rPr>
+                <w:sz w:val="18"/>
+              </w:rPr>
+              <w:t>12/07/2026</w:t>
+            </w:r>
+          </w:p>
+        </w:tc>
+        <w:tc>
+          <w:tcPr>
+            <w:tcW w:type="dxa" w:w="1560"/>
+          </w:tcPr>
+          <w:p>
+            <w:r>
+              <w:rPr>
+                <w:sz w:val="18"/>
+              </w:rPr>
+              <w:t>10 em query.bibliographic</w:t>
+            </w:r>
+          </w:p>
+        </w:tc>
+        <w:tc>
+          <w:tcPr>
+            <w:tcW w:type="dxa" w:w="1560"/>
+          </w:tcPr>
+          <w:p>
+            <w:r>
+              <w:rPr>
+                <w:sz w:val="18"/>
+              </w:rPr>
+              <w:t>2.000</w:t>
+            </w:r>
+          </w:p>
+        </w:tc>
+        <w:tc>
+          <w:tcPr>
+            <w:tcW w:type="dxa" w:w="1560"/>
+          </w:tcPr>
+          <w:p>
+            <w:r>
+              <w:rPr>
+                <w:sz w:val="18"/>
+              </w:rPr>
+              <w:t>Consultas preservadas; 200 resultados por relevância.</w:t>
+            </w:r>
+          </w:p>
+        </w:tc>
+      </w:tr>
+      <w:tr>
+        <w:tc>
+          <w:tcPr>
+            <w:tcW w:type="dxa" w:w="1560"/>
+          </w:tcPr>
+          <w:p>
+            <w:r>
+              <w:rPr>
+                <w:sz w:val="18"/>
+              </w:rPr>
+              <w:t>(lr)1-6</w:t>
+            </w:r>
+          </w:p>
+        </w:tc>
+        <w:tc>
+          <w:tcPr>
+            <w:tcW w:type="dxa" w:w="1560"/>
+          </w:tcPr>
+          <w:p>
+            <w:r>
+              <w:rPr>
+                <w:sz w:val="18"/>
+              </w:rPr>
+              <w:t>6.728</w:t>
+            </w:r>
+          </w:p>
+        </w:tc>
+        <w:tc>
+          <w:tcPr>
+            <w:tcW w:type="dxa" w:w="1560"/>
+          </w:tcPr>
+          <w:p>
+            <w:r>
+              <w:rPr>
+                <w:sz w:val="18"/>
+              </w:rPr>
+              <w:t>12 consultas, antes da deduplicação.</w:t>
+            </w:r>
+          </w:p>
+        </w:tc>
+        <w:tc>
+          <w:tcPr>
+            <w:tcW w:type="dxa" w:w="1560"/>
+          </w:tcPr>
+          <w:p>
+            <w:r>
+              <w:rPr>
+                <w:sz w:val="18"/>
+              </w:rPr>
+            </w:r>
+          </w:p>
+        </w:tc>
+        <w:tc>
+          <w:tcPr>
+            <w:tcW w:type="dxa" w:w="1560"/>
+          </w:tcPr>
+          <w:p>
+            <w:r>
+              <w:rPr>
+                <w:sz w:val="18"/>
+              </w:rPr>
             </w:r>
           </w:p>
         </w:tc>
@@ -2101,7 +2620,7 @@
         <w:pStyle w:val="BodyText"/>
       </w:pPr>
       <w:r>
-        <w:t xml:space="preserve">As quatro expressões da Scopus, as quatro strings da Web of Science e as cinco consultas do Crossref foram preservadas. Na Web of Science, a associação individual entre cada arquivo RIS e as strings A1–A4 foi informada de memória pelo pesquisador, e não reconstruída a partir de registro contemporâneo da busca. As exportações ocorreram nas mesmas datas das consultas. Não foram aplicados filtros de idioma ou tipo documental. Não houve busca piloto, uso de estudos-semente ou pré-registro. O protocolo e a matriz conceitual foram elaborados antes da coleta. O marco inicial de 2010 foi adotado para mapear o desenvolvimento do tema desde o início da década de 2010 até a data da busca, preservando uma janela temporal contemporânea comum às três fontes.</w:t>
+        <w:t xml:space="preserve">Na busca principal, as quatro expressões da Scopus, as quatro strings da Web of Science e as cinco consultas do Crossref foram preservadas. Na Web of Science, a associação individual entre cada arquivo RIS e as strings A1–A4 foi informada de memória pelo pesquisador, e não reconstruída a partir de registro contemporâneo da busca. Na busca de sensibilidade, foram preservadas integralmente as dez consultas Crossref, mas não as strings nativas exatas das exportações Scopus e Web of Science. Não foram aplicados filtros de idioma ou tipo documental na busca principal. Não houve busca piloto, uso de estudos-semente ou pré-registro. O protocolo e a matriz conceitual foram elaborados antes da coleta principal; a RQ6 e sua busca de sensibilidade foram formalizadas posteriormente para testar a insuficiência temática identificada. O marco inicial de 2010 foi adotado para mapear o desenvolvimento do tema desde o início da década de 2010 até a data da busca, preservando uma janela temporal contemporânea comum às três fontes.</w:t>
       </w:r>
     </w:p>
     <w:p>
@@ -2116,7 +2635,7 @@
           <w:rPr>
             <w:rStyle w:val="Hyperlink"/>
           </w:rPr>
-          <w:t xml:space="preserve">[tab:criteriosincluexclu]</w:t>
+          <w:t xml:space="preserve">4</w:t>
         </w:r>
       </w:hyperlink>
       <w:r>
@@ -2545,7 +3064,7 @@
           <w:rPr>
             <w:rStyle w:val="Hyperlink"/>
           </w:rPr>
-          <w:t xml:space="preserve">[tab:deduplicacao]</w:t>
+          <w:t xml:space="preserve">5</w:t>
         </w:r>
       </w:hyperlink>
       <w:r>
@@ -2995,14 +3514,14 @@
           <w:rPr>
             <w:rStyle w:val="Hyperlink"/>
           </w:rPr>
-          <w:t xml:space="preserve">[tab:funilselecao]</w:t>
+          <w:t xml:space="preserve">6</w:t>
         </w:r>
       </w:hyperlink>
       <w:r>
         <w:t xml:space="preserve"> </w:t>
       </w:r>
       <w:r>
-        <w:t xml:space="preserve">e a Figura </w:t>
+        <w:t xml:space="preserve">preserva a rastreabilidade detalhada da busca principal até o núcleo original de 104 registros. A Figura </w:t>
       </w:r>
       <w:hyperlink w:anchor="fig:funil">
         <w:r>
@@ -3016,7 +3535,7 @@
         <w:t xml:space="preserve"> </w:t>
       </w:r>
       <w:r>
-        <w:t xml:space="preserve">apresentam o fluxo.</w:t>
+        <w:t xml:space="preserve">integra esse percurso à busca complementar de sensibilidade e explicita a convergência no núcleo temático vigente de 121 registros.</w:t>
       </w:r>
     </w:p>
     <w:tbl>
@@ -3594,10 +4113,49 @@
     </w:tbl>
     <w:p>
       <w:pPr>
+        <w:jc w:val="center"/>
+      </w:pPr>
+      <w:r>
+        <w:drawing>
+          <wp:inline>
+            <wp:extent cx="5669280" cy="2752897"/>
+            <wp:docPr id="59" name="Picture 59"/>
+            <wp:cNvGraphicFramePr>
+              <a:graphicFrameLocks noChangeAspect="1"/>
+            </wp:cNvGraphicFramePr>
+            <a:graphic>
+              <a:graphicData uri="http://schemas.openxmlformats.org/drawingml/2006/picture">
+                <pic:pic>
+                  <pic:nvPicPr>
+                    <pic:cNvPr id="0" name="figura_tikz_1.png"/>
+                    <pic:cNvPicPr/>
+                  </pic:nvPicPr>
+                  <pic:blipFill>
+                    <a:blip r:embed="rId9"/>
+                    <a:stretch>
+                      <a:fillRect/>
+                    </a:stretch>
+                  </pic:blipFill>
+                  <pic:spPr>
+                    <a:xfrm>
+                      <a:off x="0" y="0"/>
+                      <a:ext cx="5669280" cy="2752897"/>
+                    </a:xfrm>
+                    <a:prstGeom prst="rect"/>
+                  </pic:spPr>
+                </pic:pic>
+              </a:graphicData>
+            </a:graphic>
+          </wp:inline>
+        </w:drawing>
+      </w:r>
+    </w:p>
+    <w:p>
+      <w:pPr>
         <w:pStyle w:val="ImageCaption"/>
       </w:pPr>
       <w:r>
-        <w:t xml:space="preserve">Fluxo de seleção do corpus</w:t>
+        <w:t xml:space="preserve">Fluxo integrado da busca principal e da busca complementar de sensibilidade</w:t>
       </w:r>
     </w:p>
     <w:p>
@@ -3605,7 +4163,7 @@
         <w:pStyle w:val="BodyText"/>
       </w:pPr>
       <w:r>
-        <w:t xml:space="preserve">A avaliação de elegibilidade do núcleo final não incluiu leitura de texto completo dos 104 estudos. Título, resumo, palavras-chave e campos extraídos foram a base documental de todas as camadas de triagem e da auditoria qualitativa. Um dos 137 registros havia sido sinalizado para verificação pontual em texto completo e foi excluído sem que essa leitura fosse realizada. A inclusão dos 104 estudos no núcleo final representa, portanto, aderência aos critérios de seleção em nível documental, sem confirmação por elegibilidade em texto completo.</w:t>
+        <w:t xml:space="preserve">A avaliação de elegibilidade do núcleo temático original não incluiu leitura de texto completo dos 104 estudos. Título, resumo, palavras-chave e campos extraídos foram a base documental de todas as camadas de triagem e da auditoria qualitativa. Um dos 137 registros havia sido sinalizado para verificação pontual em texto completo e foi excluído sem que essa leitura fosse realizada. A inclusão dos 104 estudos no núcleo original representa, portanto, aderência aos critérios de seleção em nível documental, sem confirmação por elegibilidade em texto completo.</w:t>
       </w:r>
     </w:p>
     <w:p>
@@ -3613,7 +4171,7 @@
         <w:pStyle w:val="BodyText"/>
       </w:pPr>
       <w:r>
-        <w:t xml:space="preserve">A síntese permanece predominantemente apoiada em título, resumo, palavras-chave e campos estruturados, em razão do acesso institucional restrito a parte dos periódicos das bases consultadas. Em duas tarefas pontuais posteriores, 30 estudos com PDF disponível foram lidos integralmente; 14 forneceram evidências específicas incorporadas e citadas individualmente. Esse uso é indicado explicitamente por estudo e não altera a natureza predominantemente documental da seleção, da extração e dos resultados agregados do núcleo de 104 registros.</w:t>
+        <w:t xml:space="preserve">A síntese permanece predominantemente apoiada em título, resumo, palavras-chave e campos estruturados, em razão do acesso institucional restrito a parte dos periódicos das bases consultadas. Em três tarefas pontuais posteriores, 37 estudos com texto completo disponível foram lidos integralmente; 19 forneceram evidências específicas incorporadas e citadas individualmente. O terceiro lote corresponde aos 17 registros incorporados pela busca de sensibilidade: sete textos integrais abertos puderam ser consultados e cinco acrescentaram resultados quantitativos, desenho de validação ou limitações ausentes do resumo. Esse uso é indicado explicitamente por estudo e não altera a natureza predominantemente documental da seleção, da extração e dos resultados agregados; os dez registros restantes do lote de sensibilidade permanecem caracterizados por título e resumo.</w:t>
       </w:r>
     </w:p>
     <w:p>
@@ -3621,7 +4179,7 @@
         <w:pStyle w:val="BodyText"/>
       </w:pPr>
       <w:r>
-        <w:t xml:space="preserve">A extração do núcleo final utilizou título, resumo, palavras-chave e campos estruturados para identificar dimensões de sustentabilidade, critérios de priorização, métodos de apoio à decisão, contexto da edificação, ODS, ESG e lacunas relacionadas a instituições públicas de ensino superior. A unidade de contagem foi o registro único. Campos com múltiplas categorias foram tratados como respostas múltiplas, mantendo um único identificador por estudo em cada categoria. Dimensão e critério são categorias analiticamente distintas: a dimensão é uma categoria-guarda-chuva (técnica-operacional, institucional, ambiental, ciclo de vida, econômica ou social), enquanto o critério é um atributo operacional específico dentro de uma dimensão; por isso, termos como energia, risco, conforto e segurança são contabilizados como critérios de priorização e não duplicam a contagem das seis dimensões-guarda-chuva. As definições, regras de inclusão e exclusão e exemplos de cada categoria estão detalhados em codebook de apoio à extração, mantido no repositório da revisão.</w:t>
+        <w:t xml:space="preserve">A extração do núcleo final utilizou título, resumo, palavras-chave e campos estruturados para identificar dimensões de sustentabilidade, critérios de priorização, métodos de apoio à decisão, contexto da edificação, ODS, ESG e lacunas relacionadas a instituições públicas de ensino superior. A unidade de contagem foi o registro único. Campos com múltiplas categorias foram tratados como respostas múltiplas, mantendo um único identificador por estudo em cada categoria. Dimensão e critério são categorias analiticamente distintas: a dimensão é uma categoria-guarda-chuva (técnica-operacional, institucional, ambiental, ciclo de vida, econômica ou social), enquanto o critério é um atributo operacional específico dentro de uma dimensão; por isso, termos como energia, risco, conforto e segurança são contabilizados como critérios de priorização e não duplicam a contagem das seis dimensões-guarda-chuva. As definições, regras de inclusão e exclusão e exemplos de cada categoria estão detalhados em manual de codificação de apoio à extração, mantido no repositório da revisão.</w:t>
       </w:r>
     </w:p>
     <w:bookmarkEnd w:id="24"/>
@@ -3646,11 +4204,11 @@
           <w:rPr>
             <w:rStyle w:val="Hyperlink"/>
           </w:rPr>
-          <w:t xml:space="preserve">[tab:estrategiabusca]</w:t>
+          <w:t xml:space="preserve">3</w:t>
         </w:r>
       </w:hyperlink>
       <w:r>
-        <w:t xml:space="preserve">) recuperaram inteligência artificial (IA) e aprendizado de máquina apenas de forma incidental: nenhuma pergunta de pesquisa das seis originais (RQ0 a RQ5) continha dicionário de termos dedicado ao tema, e o método de decisão nomeado mais próximo (RQ3) cobre exclusivamente instrumentos multicritério, como MCDM, AHP e TOPSIS. Para verificar se essa lacuna subestimava a presença do tema no campo, uma busca complementar de sensibilidade foi conduzida nas mesmas três bases, com expressões voltadas explicitamente a IA e aprendizado de máquina aplicados a manutenção e gestão predial, recuperando 3.169 registros na Scopus, 1.559 na Web of Science e 2.000 no Crossref, totalizando 6.728 ocorrências brutas.</w:t>
+        <w:t xml:space="preserve">) recuperaram inteligência artificial (IA) e aprendizado de máquina apenas de forma incidental: nenhuma das questões originalmente formuladas (RQ0 a RQ5) continha dicionário de termos dedicado ao tema, e o método de decisão nomeado mais próximo (RQ3) cobre exclusivamente instrumentos multicritério, como MCDM, AHP e TOPSIS. Para verificar se essa lacuna subestimava a presença do tema no campo, uma busca complementar de sensibilidade foi conduzida nas mesmas três bases, com expressões voltadas explicitamente a IA e aprendizado de máquina aplicados a manutenção e gestão predial, recuperando 3.169 registros na Scopus, 1.559 na Web of Science e 2.000 no Crossref, totalizando 6.728 ocorrências brutas.</w:t>
       </w:r>
     </w:p>
     <w:p>
@@ -3666,7 +4224,7 @@
         <w:pStyle w:val="BodyText"/>
       </w:pPr>
       <w:r>
-        <w:t xml:space="preserve">Uma nova pergunta de pesquisa (RQ6), dedicada a IA e aprendizado de máquina, foi formalizada em codebook próprio, com dois níveis de termos: um conjunto que confirma isoladamente uma técnica computacional (por exemplo,</w:t>
+        <w:t xml:space="preserve">Uma nova pergunta de pesquisa (RQ6), dedicada a IA e aprendizado de máquina, foi formalizada em manual de codificação próprio, com dois níveis de termos: um conjunto que confirma isoladamente uma técnica computacional (por exemplo,</w:t>
       </w:r>
       <w:r>
         <w:t xml:space="preserve"> </w:t>
@@ -3763,7 +4321,16 @@
         <w:t xml:space="preserve"> </w:t>
       </w:r>
       <w:r>
-        <w:t xml:space="preserve">como sinônimos de IA, prática observada como risco metodológico na literatura correlata. Os 4.889 registros foram classificados, sem amostragem, em seis classes de evidência de IA/aprendizado de máquina; os registros sem resumo disponível na fonte (concentrados no Crossref) receberam nível de confiança rebaixado por definição.</w:t>
+        <w:t xml:space="preserve">como sinônimos de IA, pois plataformas digitais, modelos treinados e mecanismos de decisão ocupam níveis analíticos distintos</w:t>
+      </w:r>
+      <w:r>
+        <w:t xml:space="preserve"> </w:t>
+      </w:r>
+      <w:r>
+        <w:t xml:space="preserve">(Deng, Menassa, and Kamat 2021; Das 2025)</w:t>
+      </w:r>
+      <w:r>
+        <w:t xml:space="preserve">. Os 4.889 registros foram classificados, sem amostragem, em seis classes de evidência de IA e aprendizado de máquina; os registros sem resumo disponível na fonte (concentrados no Crossref) receberam nível de confiança rebaixado por definição.</w:t>
       </w:r>
     </w:p>
     <w:p>
@@ -3771,7 +4338,7 @@
         <w:pStyle w:val="BodyText"/>
       </w:pPr>
       <w:r>
-        <w:t xml:space="preserve">Os registros com aplicação de IA/aprendizado de máquina confirmada foram submetidos ao mesmo critério de elegibilidade do núcleo original (objeto predial e sustentabilidade obrigatórios). Revisão individual de título e resumo removeu, em seguida, oito candidatos cuja aplicação, apesar de tecnicamente confirmada, ocorria em domínio industrial, aeroespacial ou veicular sem relação com edificações. Sete registros já pertencentes ao núcleo original, previamente classificados como secundários ou excluídos por um dicionário que não reconhecia IA, foram reavaliados sob a RQ6: cinco foram promovidos ao núcleo principal e dois permaneceram secundários, por não apresentarem, no resumo disponível, relação explícita com manutenção predial. Ao final, 17 registros passaram a integrar o núcleo temático, elevando-o de 104 para 121 registros, com extração qualitativa de dimensões, critérios, métodos e contexto realizada sob o mesmo vocabulário fechado e os mesmos procedimentos do núcleo original, sem leitura de texto completo.</w:t>
+        <w:t xml:space="preserve">Os registros com aplicação de IA e aprendizado de máquina confirmada foram submetidos ao mesmo critério de elegibilidade do núcleo original (objeto predial e sustentabilidade obrigatórios). Revisão individual de título e resumo removeu, em seguida, oito candidatos cuja aplicação, apesar de tecnicamente confirmada, ocorria em domínio industrial, aeroespacial ou veicular sem relação com edificações. Sete registros já pertencentes ao núcleo original, previamente classificados como secundários ou excluídos por um dicionário que não reconhecia IA, foram reavaliados sob a RQ6: cinco foram promovidos ao núcleo principal e dois permaneceram secundários, por não apresentarem, no resumo disponível, relação explícita com manutenção predial. Ao final, 17 registros passaram a integrar o núcleo temático, elevando-o de 104 para 121 registros, com extração qualitativa de dimensões, critérios, métodos e contexto realizada sob o mesmo vocabulário fechado e os mesmos procedimentos do núcleo original, sem leitura de texto completo.</w:t>
       </w:r>
     </w:p>
     <w:bookmarkEnd w:id="25"/>
@@ -3846,7 +4413,21 @@
         <w:pStyle w:val="BodyText"/>
       </w:pPr>
       <w:r>
-        <w:t xml:space="preserve">O corpus distribuiu-se por 208 fontes, indicando dispersão editorial. O núcleo aproximado de Bradford reuniu 13 fontes responsáveis por cerca de um terço dos registros.</w:t>
+        <w:t xml:space="preserve">O Gráfico </w:t>
+      </w:r>
+      <w:hyperlink w:anchor="fig:fontes372">
+        <w:r>
+          <w:rPr>
+            <w:rStyle w:val="Hyperlink"/>
+          </w:rPr>
+          <w:t xml:space="preserve">2</w:t>
+        </w:r>
+      </w:hyperlink>
+      <w:r>
+        <w:t xml:space="preserve"> </w:t>
+      </w:r>
+      <w:r>
+        <w:t xml:space="preserve">sintetiza a distribuição editorial do corpus, composto por 208 fontes. O núcleo aproximado de Bradford reuniu 13 fontes responsáveis por cerca de um terço dos registros.</w:t>
       </w:r>
       <w:r>
         <w:t xml:space="preserve"> </w:t>
@@ -4005,7 +4586,21 @@
         <w:pStyle w:val="BodyText"/>
       </w:pPr>
       <w:r>
-        <w:t xml:space="preserve">O mapa temático identificou dois eixos de maior centralidade. O primeiro articulou BIM, desempenho da edificação e</w:t>
+        <w:t xml:space="preserve">O Gráfico </w:t>
+      </w:r>
+      <w:hyperlink w:anchor="fig:mapatematico372">
+        <w:r>
+          <w:rPr>
+            <w:rStyle w:val="Hyperlink"/>
+          </w:rPr>
+          <w:t xml:space="preserve">3</w:t>
+        </w:r>
+      </w:hyperlink>
+      <w:r>
+        <w:t xml:space="preserve"> </w:t>
+      </w:r>
+      <w:r>
+        <w:t xml:space="preserve">apresenta o mapa temático, no qual foram identificados dois eixos de maior centralidade. O primeiro articulou BIM, desempenho da edificação e</w:t>
       </w:r>
       <w:r>
         <w:t xml:space="preserve"> </w:t>
@@ -4081,7 +4676,21 @@
         <w:pStyle w:val="BodyText"/>
       </w:pPr>
       <w:r>
-        <w:t xml:space="preserve">A rede normalizada reforçou a posição de BIM e gestão de facilidades como elementos de conexão. BIM apareceu associado a gestão de facilidades,</w:t>
+        <w:t xml:space="preserve">O Gráfico </w:t>
+      </w:r>
+      <w:hyperlink w:anchor="fig:redecor372">
+        <w:r>
+          <w:rPr>
+            <w:rStyle w:val="Hyperlink"/>
+          </w:rPr>
+          <w:t xml:space="preserve">4</w:t>
+        </w:r>
+      </w:hyperlink>
+      <w:r>
+        <w:t xml:space="preserve"> </w:t>
+      </w:r>
+      <w:r>
+        <w:t xml:space="preserve">mostra a rede normalizada, que reforça a posição de BIM e gestão de facilidades como elementos de conexão. BIM apareceu associado a gestão de facilidades,</w:t>
       </w:r>
       <w:r>
         <w:t xml:space="preserve"> </w:t>
@@ -4157,7 +4766,21 @@
         <w:pStyle w:val="BodyText"/>
       </w:pPr>
       <w:r>
-        <w:t xml:space="preserve">A comparação temporal mostra mudança do vocabulário do campo. A participação de BIM aumentou 7,3 pontos percentuais entre os dois períodos, enquanto</w:t>
+        <w:t xml:space="preserve">O Gráfico </w:t>
+      </w:r>
+      <w:hyperlink w:anchor="fig:evolucaotematica372">
+        <w:r>
+          <w:rPr>
+            <w:rStyle w:val="Hyperlink"/>
+          </w:rPr>
+          <w:t xml:space="preserve">5</w:t>
+        </w:r>
+      </w:hyperlink>
+      <w:r>
+        <w:t xml:space="preserve"> </w:t>
+      </w:r>
+      <w:r>
+        <w:t xml:space="preserve">compara os períodos e mostra mudança do vocabulário do campo. A participação de BIM aumentou 7,3 pontos percentuais entre os dois períodos, enquanto</w:t>
       </w:r>
       <w:r>
         <w:t xml:space="preserve"> </w:t>
@@ -4249,7 +4872,7 @@
         <w:t xml:space="preserve">digital twins</w:t>
       </w:r>
       <w:r>
-        <w:t xml:space="preserve">, carbono, ciclo de vida e manutenção preditiva. Essa transformação amplia a capacidade informacional da gestão predial, mas não elimina a lacuna identificada na síntese temática: poucos estudos documentam toda a cadeia entre indicador, ponderação, agregação, validação e decisão em instituições públicas universitárias.</w:t>
+        <w:t xml:space="preserve">, carbono, ciclo de vida e manutenção preditiva. Esse resultado descreve a estrutura documental do campo, mas não demonstra maturidade decisória. Por isso, as seções seguintes usam o núcleo temático de 121 registros para examinar se tais temas se convertem em dimensões, critérios, métodos e regras aplicáveis à priorização pública universitária.</w:t>
       </w:r>
     </w:p>
     <w:bookmarkEnd w:id="39"/>
@@ -4479,7 +5102,7 @@
           <w:rPr>
             <w:rStyle w:val="Hyperlink"/>
           </w:rPr>
-          <w:t xml:space="preserve">[tab:basetipo]</w:t>
+          <w:t xml:space="preserve">7</w:t>
         </w:r>
       </w:hyperlink>
       <w:r>
@@ -4892,6 +5515,14 @@
       </w:tr>
     </w:tbl>
     <w:p/>
+    <w:p>
+      <w:pPr>
+        <w:pStyle w:val="BodyText"/>
+      </w:pPr>
+      <w:r>
+        <w:t xml:space="preserve">A concentração em artigos de periódico e a baixa presença exclusiva do Crossref descrevem a composição documental do núcleo, não a qualidade individual dos estudos. Do mesmo modo, a sobreposição entre bases expressa proveniência da recuperação e não constitui replicação independente de evidência.</w:t>
+      </w:r>
+    </w:p>
     <w:bookmarkEnd w:id="43"/>
     <w:bookmarkStart w:id="47" w:name="sec:criterios"/>
     <w:p>
@@ -4907,7 +5538,7 @@
         <w:pStyle w:val="FirstParagraph"/>
       </w:pPr>
       <w:r>
-        <w:t xml:space="preserve">A codificação documental identificou seis dimensões, com respostas múltiplas: técnica-operacional em 116 registros, institucional em 97, ambiental em 92, ciclo de vida em 65, econômica em 63 e social em 59. O predomínio das duas primeiras reflete também a amplitude do codebook e não demonstra aplicação empírica ou maior importância científica. A composição é compatível com a gestão de facilidades sustentável, que articula impactos ambientais, sociais e econômicos nos níveis estratégico, tático e operacional</w:t>
+        <w:t xml:space="preserve">Em resposta à RQ1, a codificação documental identificou seis dimensões, com respostas múltiplas: técnica-operacional em 116 registros, institucional em 97, ambiental em 92, ciclo de vida em 65, econômica em 63 e social em 59. O predomínio das duas primeiras reflete também a amplitude do manual de codificação e não demonstra aplicação empírica ou maior importância científica. A composição é compatível com a gestão de facilidades sustentável, que articula impactos ambientais, sociais e econômicos nos níveis estratégico, tático e operacional</w:t>
       </w:r>
       <w:r>
         <w:t xml:space="preserve"> </w:t>
@@ -5014,7 +5645,7 @@
         <w:pStyle w:val="BodyText"/>
       </w:pPr>
       <w:r>
-        <w:t xml:space="preserve">Desempenho operacional aparece em 99 registros, informação e dados em 82, custo em 63, energia e vida útil em 44 cada. Condição física, risco e manutenibilidade completam o núcleo técnico; conforto, segurança, satisfação, emissões, resíduos e água representam efeitos sociais e ambientais específicos.</w:t>
+        <w:t xml:space="preserve">Em resposta à RQ2, desempenho operacional aparece em 99 registros, informação e dados em 82, custo em 63, energia e vida útil em 44 cada. Condição física, risco e manutenibilidade completam o núcleo técnico; conforto, segurança, satisfação, emissões, resíduos e água representam efeitos sociais e ambientais específicos.</w:t>
       </w:r>
     </w:p>
     <w:tbl>
@@ -5784,7 +6415,7 @@
         <w:pStyle w:val="FirstParagraph"/>
       </w:pPr>
       <w:r>
-        <w:t xml:space="preserve">A categoria ampla</w:t>
+        <w:t xml:space="preserve">Em resposta à RQ3, a categoria ampla</w:t>
       </w:r>
       <w:r>
         <w:t xml:space="preserve"> </w:t>
@@ -5964,16 +6595,15 @@
         </w:r>
       </w:hyperlink>
       <w:r>
-        <w:t xml:space="preserve">), salta de nove para 26 registros (21,5%) entre o núcleo original e o núcleo ampliado, crescimento concentrado, por construção, nos 17 estudos incorporados por essa busca, e não em uma tendência observada de forma independente na busca original. Os demais métodos crescem de forma modesta e proporcional ao aumento geral do núcleo, sem evidência de que a busca de sensibilidade tenha inflado artificialmente outras categorias metodológicas. O protocolo deve funcionar com planilhas, cadastros, inspeções e ordens de serviço e permitir integração progressiva a modelos e plataformas digitais, incluindo eventuais módulos preditivos baseados em aprendizado de máquina, cuja presença documental não substitui validação de desempenho em operação real. As aplicações do núcleo demonstram funções distintas: ANP difuso na avaliação de edifícios educacionais</w:t>
-      </w:r>
-      <w:r>
-        <w:t xml:space="preserve"> </w:t>
-      </w:r>
-      <w:r>
-        <w:t xml:space="preserve">(Alfalah et al. 2022)</w:t>
-      </w:r>
-      <w:r>
-        <w:t xml:space="preserve">, Delphi modificado em gestão de</w:t>
+        <w:t xml:space="preserve">), salta de nove para 26 registros (21,5%) entre o núcleo original e o núcleo ampliado, crescimento concentrado, por construção, nos 17 estudos incorporados por essa busca, e não em uma tendência observada de forma independente na busca original. Os demais métodos crescem de forma modesta e proporcional ao aumento geral do núcleo, sem evidência de que a busca de sensibilidade tenha inflado artificialmente outras categorias metodológicas.</w:t>
+      </w:r>
+    </w:p>
+    <w:p>
+      <w:pPr>
+        <w:pStyle w:val="BodyText"/>
+      </w:pPr>
+      <w:r>
+        <w:t xml:space="preserve">Esses resultados não tornam BIM,</w:t>
       </w:r>
       <w:r>
         <w:t xml:space="preserve"> </w:t>
@@ -5983,48 +6613,22 @@
           <w:iCs/>
           <w:i/>
         </w:rPr>
-        <w:t xml:space="preserve">campus</w:t>
-      </w:r>
-      <w:r>
-        <w:t xml:space="preserve"> </w:t>
-      </w:r>
-      <w:r>
-        <w:t xml:space="preserve">(Naji, Gunduz, and Maki 2023)</w:t>
-      </w:r>
-      <w:r>
-        <w:t xml:space="preserve"> </w:t>
-      </w:r>
-      <w:r>
-        <w:t xml:space="preserve">e AHP, TOPSIS e otimização na alocação de prestadores públicos</w:t>
-      </w:r>
-      <w:r>
-        <w:t xml:space="preserve"> </w:t>
-      </w:r>
-      <w:r>
-        <w:t xml:space="preserve">(Masmoudi et al. 2026)</w:t>
-      </w:r>
-      <w:r>
-        <w:t xml:space="preserve">.</w:t>
-      </w:r>
-    </w:p>
-    <w:p>
-      <w:pPr>
-        <w:pStyle w:val="BodyText"/>
-      </w:pPr>
-      <w:r>
-        <w:t xml:space="preserve">As leituras integrais delimitam a maturidade digital e a variedade analítica.</w:t>
-      </w:r>
-      <w:r>
-        <w:t xml:space="preserve"> </w:t>
-      </w:r>
-      <w:r>
-        <w:t xml:space="preserve">Deng, Menassa, and Kamat (2021)</w:t>
-      </w:r>
-      <w:r>
-        <w:t xml:space="preserve"> </w:t>
-      </w:r>
-      <w:r>
-        <w:t xml:space="preserve">não encontraram, entre 123 estudos,</w:t>
+        <w:t xml:space="preserve">digital twin</w:t>
+      </w:r>
+      <w:r>
+        <w:t xml:space="preserve"> </w:t>
+      </w:r>
+      <w:r>
+        <w:t xml:space="preserve">ou aprendizado de máquina requisitos para a aplicação do protocolo. Como proposição deste artigo, a arquitetura deve funcionar com planilhas, cadastros, inspeções e ordens de serviço e admitir integração progressiva a plataformas digitais ou módulos preditivos, condicionada à validação do desempenho em operação real. As aplicações do núcleo demonstram funções distintas: ANP difuso na avaliação de edifícios educacionais</w:t>
+      </w:r>
+      <w:r>
+        <w:t xml:space="preserve"> </w:t>
+      </w:r>
+      <w:r>
+        <w:t xml:space="preserve">(Alfalah et al. 2022)</w:t>
+      </w:r>
+      <w:r>
+        <w:t xml:space="preserve">, Delphi modificado em gestão de</w:t>
       </w:r>
       <w:r>
         <w:t xml:space="preserve"> </w:t>
@@ -6034,84 +6638,183 @@
           <w:iCs/>
           <w:i/>
         </w:rPr>
+        <w:t xml:space="preserve">campus</w:t>
+      </w:r>
+      <w:r>
+        <w:t xml:space="preserve"> </w:t>
+      </w:r>
+      <w:r>
+        <w:t xml:space="preserve">(Naji, Gunduz, and Maki 2023)</w:t>
+      </w:r>
+      <w:r>
+        <w:t xml:space="preserve"> </w:t>
+      </w:r>
+      <w:r>
+        <w:t xml:space="preserve">e AHP, TOPSIS e otimização na alocação de prestadores públicos</w:t>
+      </w:r>
+      <w:r>
+        <w:t xml:space="preserve"> </w:t>
+      </w:r>
+      <w:r>
+        <w:t xml:space="preserve">(Masmoudi et al. 2026)</w:t>
+      </w:r>
+      <w:r>
+        <w:t xml:space="preserve">.</w:t>
+      </w:r>
+    </w:p>
+    <w:p>
+      <w:pPr>
+        <w:pStyle w:val="BodyText"/>
+      </w:pPr>
+      <w:r>
+        <w:t xml:space="preserve">A leitura integral do lote incorporado permite responder diretamente à RQ6 sem confundir técnica computacional com governança decisória. Os estudos empíricos consultados empregam aprendizado de máquina para produzir variáveis operacionais: previsão de demanda de ventilação, com modelo treinado em três edifícios e economia de até 7,5% frente ao controle tradicional</w:t>
+      </w:r>
+      <w:r>
+        <w:t xml:space="preserve"> </w:t>
+      </w:r>
+      <w:r>
+        <w:t xml:space="preserve">(Motuzienė et al. 2025)</w:t>
+      </w:r>
+      <w:r>
+        <w:t xml:space="preserve">; regressão em grafos para estimar vida útil de componentes, na qual a GCN alcançou</w:t>
+      </w:r>
+      <w:r>
+        <w:t xml:space="preserve"> </w:t>
+      </w:r>
+      <m:oMath>
+        <m:sSup>
+          <m:e>
+            <m:r>
+              <m:t>R</m:t>
+            </m:r>
+          </m:e>
+          <m:sup>
+            <m:r>
+              <m:t>2</m:t>
+            </m:r>
+          </m:sup>
+        </m:sSup>
+        <m:r>
+          <m:rPr>
+            <m:sty m:val="p"/>
+          </m:rPr>
+          <m:t>=</m:t>
+        </m:r>
+        <m:r>
+          <m:t>0</m:t>
+        </m:r>
+        <m:r>
+          <m:rPr>
+            <m:sty m:val="p"/>
+          </m:rPr>
+          <m:t>,</m:t>
+        </m:r>
+        <m:r>
+          <m:t>83</m:t>
+        </m:r>
+      </m:oMath>
+      <w:r>
+        <w:t xml:space="preserve"> </w:t>
+      </w:r>
+      <w:r>
+        <w:t xml:space="preserve">(Wu and Mundt-Petersen 2025)</w:t>
+      </w:r>
+      <w:r>
+        <w:t xml:space="preserve">; e previsão conjunta de eletricidade, gás e água, com separação entre treino, validação e teste e erros distintos por variável</w:t>
+      </w:r>
+      <w:r>
+        <w:t xml:space="preserve"> </w:t>
+      </w:r>
+      <w:r>
+        <w:t xml:space="preserve">(Suh and Chang 2012)</w:t>
+      </w:r>
+      <w:r>
+        <w:t xml:space="preserve">. Esses resultados correspondem a previsão e otimização operacional; diagnósticos, classificação de danos e apoio à decisão também aparecem no lote, mas, quando o texto integral não estava disponível, permaneceram caracterizados somente pelo resumo.</w:t>
+      </w:r>
+    </w:p>
+    <w:p>
+      <w:pPr>
+        <w:pStyle w:val="BodyText"/>
+      </w:pPr>
+      <w:r>
+        <w:t xml:space="preserve">As duas revisões integrais consultadas reforçam os limites dessa evidência. A síntese de IoT e IA não utilizou dados empíricos próprios e identificou viés para o Norte Global, além de necessidades de interoperabilidade, privacidade, governança e avaliação do ciclo de vida</w:t>
+      </w:r>
+      <w:r>
+        <w:t xml:space="preserve"> </w:t>
+      </w:r>
+      <w:r>
+        <w:t xml:space="preserve">(Das 2025)</w:t>
+      </w:r>
+      <w:r>
+        <w:t xml:space="preserve">. Na revisão de 76 estudos sobre ambientes internos conectados, 41 integraram energia, conforto e sustentabilidade, enquanto 35 omitiram pelo menos uma dessas dimensões; as faixas de economia divulgadas sintetizam aplicações heterogêneas e não representam o desempenho de um único modelo</w:t>
+      </w:r>
+      <w:r>
+        <w:t xml:space="preserve"> </w:t>
+      </w:r>
+      <w:r>
+        <w:t xml:space="preserve">(Alici 2026)</w:t>
+      </w:r>
+      <w:r>
+        <w:t xml:space="preserve">. Assim, a resposta à RQ6 é que a busca de sensibilidade revela uma camada relevante de produção de evidências preditivas, diagnósticas e operacionais, porém não demonstra integração sistemática desses resultados com ponderação institucional, regras de veto ou métodos multicritério. O módulo computacional pode informar critérios; não substitui a decisão pública.</w:t>
+      </w:r>
+    </w:p>
+    <w:p>
+      <w:pPr>
+        <w:pStyle w:val="BodyText"/>
+      </w:pPr>
+      <w:r>
+        <w:t xml:space="preserve">A matriz comparativa dos 17 registros, preservada como material suplementar, classificou cada estudo pela função analítica predominante. Dez concentram-se em previsão ou previsão combinada à otimização, dois em diagnóstico e classificação de danos e cinco em síntese ou integração tecnológica. Essa distribuição não estima prevalência no campo, pois decorre de uma busca construída para maximizar a recuperação de IA e aprendizado de máquina. Ela esclarece, contudo, o lugar desses métodos na arquitetura proposta: em três estudos a saída se aproxima de uma ação operacional ou recomendação direta, enquanto nos demais funciona como estimativa, diagnóstico ou infraestrutura informacional que ainda requer critérios, preferências, restrições e responsabilização institucional. Nenhum dos 17 demonstrou uma cadeia completa que ligasse treinamento do modelo, validação externa, ponderação multicritério, regra de veto e decisão pública auditável.</w:t>
+      </w:r>
+    </w:p>
+    <w:p>
+      <w:pPr>
+        <w:pStyle w:val="BodyText"/>
+      </w:pPr>
+      <w:r>
+        <w:t xml:space="preserve">Além do lote de sensibilidade, as leituras integrais do núcleo original distinguem integração informacional, simulação e estruturação decisória. A revisão de 123 estudos não encontrou</w:t>
+      </w:r>
+      <w:r>
+        <w:t xml:space="preserve"> </w:t>
+      </w:r>
+      <w:r>
+        <w:rPr>
+          <w:iCs/>
+          <w:i/>
+        </w:rPr>
         <w:t xml:space="preserve">digital twin</w:t>
       </w:r>
       <w:r>
         <w:t xml:space="preserve"> </w:t>
       </w:r>
       <w:r>
-        <w:t xml:space="preserve">com controle, otimização e retroalimentação plenos;</w:t>
-      </w:r>
-      <w:r>
-        <w:t xml:space="preserve"> </w:t>
-      </w:r>
-      <w:r>
-        <w:t xml:space="preserve">Espinosa Gispert et al. (2025)</w:t>
-      </w:r>
-      <w:r>
-        <w:t xml:space="preserve"> </w:t>
-      </w:r>
-      <w:r>
-        <w:t xml:space="preserve">propõem ontologia de ativos para manutenção preditiva;</w:t>
-      </w:r>
-      <w:r>
-        <w:t xml:space="preserve"> </w:t>
-      </w:r>
-      <w:r>
-        <w:t xml:space="preserve">Goretti and Kaming (2023)</w:t>
-      </w:r>
-      <w:r>
-        <w:t xml:space="preserve"> </w:t>
-      </w:r>
-      <w:r>
-        <w:t xml:space="preserve">situam BIM 7D na operação e manutenção; e</w:t>
-      </w:r>
-      <w:r>
-        <w:t xml:space="preserve"> </w:t>
-      </w:r>
-      <w:r>
-        <w:t xml:space="preserve">Ferreira et al. (2020)</w:t>
-      </w:r>
-      <w:r>
-        <w:t xml:space="preserve"> </w:t>
-      </w:r>
-      <w:r>
-        <w:t xml:space="preserve">comparam estratégias preventivas, corretivas e combinadas por redes de Petri e Monte Carlo. O conjunto percorre integração informacional, prevenção e simulação de componentes, mas não demonstra adoção institucional generalizada.</w:t>
-      </w:r>
-    </w:p>
-    <w:p>
-      <w:pPr>
-        <w:pStyle w:val="BodyText"/>
-      </w:pPr>
-      <w:r>
-        <w:t xml:space="preserve">Outros três estudos distinguem níveis de estruturação decisória: sistema conceitual Lean Six Sigma ainda sem validação empírica</w:t>
-      </w:r>
-      <w:r>
-        <w:t xml:space="preserve"> </w:t>
-      </w:r>
-      <w:r>
-        <w:t xml:space="preserve">(Aldairi, Khan, and Munive-Hernandez 2017)</w:t>
-      </w:r>
-      <w:r>
-        <w:t xml:space="preserve">; avaliação sintética fuzzy de estratégias de gestão de facilidades</w:t>
-      </w:r>
-      <w:r>
-        <w:t xml:space="preserve"> </w:t>
-      </w:r>
-      <w:r>
-        <w:t xml:space="preserve">(Yoon and Cha 2018)</w:t>
-      </w:r>
-      <w:r>
-        <w:t xml:space="preserve">; e raciocínio baseado em casos com Fuzzy-AHP para ponderar atributos e prever reparos históricos</w:t>
-      </w:r>
-      <w:r>
-        <w:t xml:space="preserve"> </w:t>
-      </w:r>
-      <w:r>
-        <w:t xml:space="preserve">(Park, Kwon, and Ahn 2019)</w:t>
-      </w:r>
-      <w:r>
-        <w:t xml:space="preserve">. Assim, menção a método, aplicação formal e validação permanecem categorias diferentes.</w:t>
+        <w:t xml:space="preserve">com controle, otimização e retroalimentação plenos</w:t>
+      </w:r>
+      <w:r>
+        <w:t xml:space="preserve"> </w:t>
+      </w:r>
+      <w:r>
+        <w:t xml:space="preserve">(Deng, Menassa, and Kamat 2021)</w:t>
+      </w:r>
+      <w:r>
+        <w:t xml:space="preserve">; outros trabalhos propõem ontologia de ativos, BIM 7D e comparação de estratégias por simulação</w:t>
+      </w:r>
+      <w:r>
+        <w:t xml:space="preserve"> </w:t>
+      </w:r>
+      <w:r>
+        <w:t xml:space="preserve">(Espinosa Gispert et al. 2025; Goretti and Kaming 2023; Ferreira et al. 2020)</w:t>
+      </w:r>
+      <w:r>
+        <w:t xml:space="preserve">. No plano decisório, foram identificados um sistema conceitual Lean Six Sigma sem validação empírica, uma avaliação sintética fuzzy e um modelo de raciocínio baseado em casos com Fuzzy-AHP</w:t>
+      </w:r>
+      <w:r>
+        <w:t xml:space="preserve"> </w:t>
+      </w:r>
+      <w:r>
+        <w:t xml:space="preserve">(Aldairi, Khan, and Munive-Hernandez 2017; Yoon and Cha 2018; Park, Kwon, and Ahn 2019)</w:t>
+      </w:r>
+      <w:r>
+        <w:t xml:space="preserve">. Esses casos confirmam que menção a método, aplicação formal e validação são níveis analíticos distintos; não demonstram adoção institucional generalizada.</w:t>
       </w:r>
     </w:p>
     <w:bookmarkEnd w:id="51"/>
@@ -6129,7 +6832,7 @@
         <w:pStyle w:val="FirstParagraph"/>
       </w:pPr>
       <w:r>
-        <w:t xml:space="preserve">A caracterização documental identificou 101 registros sobre edificação genérica e 59 sobre portfólio predial. Entre as tipologias específicas, houve 17 registros sobre hospitais, 16 sobre edifícios comerciais, 15 residenciais, 14 universidades, dez</w:t>
+        <w:t xml:space="preserve">Em resposta à RQ4, a caracterização documental identificou 101 registros sobre edificação genérica e 59 sobre portfólio predial. Entre as tipologias específicas, houve 17 registros sobre hospitais, 16 sobre edifícios comerciais, 15 residenciais, 14 universidades, dez</w:t>
       </w:r>
       <w:r>
         <w:t xml:space="preserve"> </w:t>
@@ -6142,7 +6845,7 @@
         <w:t xml:space="preserve">campus</w:t>
       </w:r>
       <w:r>
-        <w:t xml:space="preserve">, seis patrimônios históricos, cinco edifícios públicos, cinco escolas e um museu. As categorias são respostas múltiplas; edificação genérica é uma categoria-guarda-chuva, não uma tipologia homogênea.</w:t>
+        <w:t xml:space="preserve">, seis patrimônios históricos, cinco edifícios públicos, cinco escolas e um museu. As categorias são respostas múltiplas; edificação genérica é uma categoria-guarda-chuva, não uma tipologia homogênea. Em um registro, o contexto não pôde ser identificado no resumo.</w:t>
       </w:r>
     </w:p>
     <w:tbl>
@@ -6658,6 +7361,47 @@
           </w:p>
         </w:tc>
       </w:tr>
+      <w:tr>
+        <w:tc>
+          <w:tcPr>
+            <w:tcW w:type="dxa" w:w="3120"/>
+          </w:tcPr>
+          <w:p>
+            <w:r>
+              <w:rPr>
+                <w:sz w:val="18"/>
+              </w:rPr>
+              <w:t>Não identificado no resumo</w:t>
+            </w:r>
+          </w:p>
+        </w:tc>
+        <w:tc>
+          <w:tcPr>
+            <w:tcW w:type="dxa" w:w="3120"/>
+          </w:tcPr>
+          <w:p>
+            <w:r>
+              <w:rPr>
+                <w:sz w:val="18"/>
+              </w:rPr>
+              <w:t>1</w:t>
+            </w:r>
+          </w:p>
+        </w:tc>
+        <w:tc>
+          <w:tcPr>
+            <w:tcW w:type="dxa" w:w="3120"/>
+          </w:tcPr>
+          <w:p>
+            <w:r>
+              <w:rPr>
+                <w:sz w:val="18"/>
+              </w:rPr>
+              <w:t>0,8</w:t>
+            </w:r>
+          </w:p>
+        </w:tc>
+      </w:tr>
     </w:tbl>
     <w:p/>
     <w:p>
@@ -6665,7 +7409,16 @@
         <w:pStyle w:val="BodyText"/>
       </w:pPr>
       <w:r>
-        <w:t xml:space="preserve">Em instituições de ensino, a gestão sustentável combina desempenho físico, usuários e capacidade administrativa. A literatura identifica fatores críticos em universidades</w:t>
+        <w:t xml:space="preserve">Em instituições de ensino, a gestão sustentável combina desempenho físico, usuários e capacidade administrativa. Estudos de caso em universidades públicas documentaram predomínio corretivo, registros fragmentados, ausência de indicadores ou inspeções periódicas e fragilidades na manutenção preventiva</w:t>
+      </w:r>
+      <w:r>
+        <w:t xml:space="preserve"> </w:t>
+      </w:r>
+      <w:r>
+        <w:t xml:space="preserve">(Lateef, Khamidi, and Idrus 2010; Barbosa et al. 2020)</w:t>
+      </w:r>
+      <w:r>
+        <w:t xml:space="preserve">. A literatura identifica fatores críticos em universidades</w:t>
       </w:r>
       <w:r>
         <w:t xml:space="preserve"> </w:t>
@@ -6719,7 +7472,7 @@
         <w:pStyle w:val="BodyText"/>
       </w:pPr>
       <w:r>
-        <w:t xml:space="preserve">A baixa frequência de universidade,</w:t>
+        <w:t xml:space="preserve">Em resposta à RQ5, a baixa frequência de universidade,</w:t>
       </w:r>
       <w:r>
         <w:t xml:space="preserve"> </w:t>
@@ -6735,7 +7488,7 @@
         <w:t xml:space="preserve"> </w:t>
       </w:r>
       <w:r>
-        <w:t xml:space="preserve">e edifício público confirma a lacuna de validação em portfólios heterogêneos, com restrições orçamentárias, continuidade acadêmica e múltiplos usuários. A busca de sensibilidade para inteligência artificial (Seção </w:t>
+        <w:t xml:space="preserve">e edifício público limita a evidência diretamente transferível a portfólios heterogêneos, com restrições orçamentárias, continuidade acadêmica e múltiplos usuários. A busca de sensibilidade para inteligência artificial (Seção </w:t>
       </w:r>
       <w:hyperlink w:anchor="sec:buscaia">
         <w:r>
@@ -7076,7 +7829,7 @@
           <w:rPr>
             <w:rStyle w:val="Hyperlink"/>
           </w:rPr>
-          <w:t xml:space="preserve">[tab:protocolooperacional]</w:t>
+          <w:t xml:space="preserve">10</w:t>
         </w:r>
       </w:hyperlink>
       <w:r>
@@ -7090,7 +7843,7 @@
           <w:rPr>
             <w:rStyle w:val="Hyperlink"/>
           </w:rPr>
-          <w:t xml:space="preserve">[tab:especificacaoindicadores]</w:t>
+          <w:t xml:space="preserve">11</w:t>
         </w:r>
       </w:hyperlink>
       <w:r>
@@ -7359,16 +8112,15 @@
         </w:tblBorders>
       </w:tblPr>
       <w:tblGrid>
-        <w:gridCol w:w="1872"/>
-        <w:gridCol w:w="1872"/>
-        <w:gridCol w:w="1872"/>
-        <w:gridCol w:w="1872"/>
-        <w:gridCol w:w="1872"/>
+        <w:gridCol w:w="2340"/>
+        <w:gridCol w:w="2340"/>
+        <w:gridCol w:w="2340"/>
+        <w:gridCol w:w="2340"/>
       </w:tblGrid>
       <w:tr>
         <w:tc>
           <w:tcPr>
-            <w:tcW w:type="dxa" w:w="1872"/>
+            <w:tcW w:type="dxa" w:w="2340"/>
           </w:tcPr>
           <w:p>
             <w:r>
@@ -7382,7 +8134,7 @@
         </w:tc>
         <w:tc>
           <w:tcPr>
-            <w:tcW w:type="dxa" w:w="1872"/>
+            <w:tcW w:type="dxa" w:w="2340"/>
           </w:tcPr>
           <w:p>
             <w:r>
@@ -7396,7 +8148,7 @@
         </w:tc>
         <w:tc>
           <w:tcPr>
-            <w:tcW w:type="dxa" w:w="1872"/>
+            <w:tcW w:type="dxa" w:w="2340"/>
           </w:tcPr>
           <w:p>
             <w:r>
@@ -7410,7 +8162,7 @@
         </w:tc>
         <w:tc>
           <w:tcPr>
-            <w:tcW w:type="dxa" w:w="1872"/>
+            <w:tcW w:type="dxa" w:w="2340"/>
           </w:tcPr>
           <w:p>
             <w:r>
@@ -7418,21 +8170,7 @@
                 <w:b/>
                 <w:sz w:val="18"/>
               </w:rPr>
-              <w:t>Period.</w:t>
-            </w:r>
-          </w:p>
-        </w:tc>
-        <w:tc>
-          <w:tcPr>
-            <w:tcW w:type="dxa" w:w="1872"/>
-          </w:tcPr>
-          <w:p>
-            <w:r>
-              <w:rPr>
-                <w:b/>
-                <w:sz w:val="18"/>
-              </w:rPr>
-              <w:t>Pref.</w:t>
+              <w:t>Periodicidade; preferência</w:t>
             </w:r>
           </w:p>
         </w:tc>
@@ -7440,7 +8178,7 @@
       <w:tr>
         <w:tc>
           <w:tcPr>
-            <w:tcW w:type="dxa" w:w="1872"/>
+            <w:tcW w:type="dxa" w:w="2340"/>
           </w:tcPr>
           <w:p>
             <w:r>
@@ -7453,7 +8191,7 @@
         </w:tc>
         <w:tc>
           <w:tcPr>
-            <w:tcW w:type="dxa" w:w="1872"/>
+            <w:tcW w:type="dxa" w:w="2340"/>
           </w:tcPr>
           <w:p>
             <w:r>
@@ -7466,7 +8204,7 @@
         </w:tc>
         <w:tc>
           <w:tcPr>
-            <w:tcW w:type="dxa" w:w="1872"/>
+            <w:tcW w:type="dxa" w:w="2340"/>
           </w:tcPr>
           <w:p>
             <w:r>
@@ -7479,27 +8217,14 @@
         </w:tc>
         <w:tc>
           <w:tcPr>
-            <w:tcW w:type="dxa" w:w="1872"/>
-          </w:tcPr>
-          <w:p>
-            <w:r>
-              <w:rPr>
-                <w:sz w:val="18"/>
-              </w:rPr>
-              <w:t>Mensal</w:t>
-            </w:r>
-          </w:p>
-        </w:tc>
-        <w:tc>
-          <w:tcPr>
-            <w:tcW w:type="dxa" w:w="1872"/>
-          </w:tcPr>
-          <w:p>
-            <w:r>
-              <w:rPr>
-                <w:sz w:val="18"/>
-              </w:rPr>
-              <w:t>Menor</w:t>
+            <w:tcW w:type="dxa" w:w="2340"/>
+          </w:tcPr>
+          <w:p>
+            <w:r>
+              <w:rPr>
+                <w:sz w:val="18"/>
+              </w:rPr>
+              <w:t>Mensal; menor</w:t>
             </w:r>
           </w:p>
         </w:tc>
@@ -7507,7 +8232,7 @@
       <w:tr>
         <w:tc>
           <w:tcPr>
-            <w:tcW w:type="dxa" w:w="1872"/>
+            <w:tcW w:type="dxa" w:w="2340"/>
           </w:tcPr>
           <w:p>
             <w:r>
@@ -7520,7 +8245,7 @@
         </w:tc>
         <w:tc>
           <w:tcPr>
-            <w:tcW w:type="dxa" w:w="1872"/>
+            <w:tcW w:type="dxa" w:w="2340"/>
           </w:tcPr>
           <w:p>
             <w:r>
@@ -7533,7 +8258,7 @@
         </w:tc>
         <w:tc>
           <w:tcPr>
-            <w:tcW w:type="dxa" w:w="1872"/>
+            <w:tcW w:type="dxa" w:w="2340"/>
           </w:tcPr>
           <w:p>
             <w:r>
@@ -7546,27 +8271,14 @@
         </w:tc>
         <w:tc>
           <w:tcPr>
-            <w:tcW w:type="dxa" w:w="1872"/>
-          </w:tcPr>
-          <w:p>
-            <w:r>
-              <w:rPr>
-                <w:sz w:val="18"/>
-              </w:rPr>
-              <w:t>Trimestral</w:t>
-            </w:r>
-          </w:p>
-        </w:tc>
-        <w:tc>
-          <w:tcPr>
-            <w:tcW w:type="dxa" w:w="1872"/>
-          </w:tcPr>
-          <w:p>
-            <w:r>
-              <w:rPr>
-                <w:sz w:val="18"/>
-              </w:rPr>
-              <w:t>Maior</w:t>
+            <w:tcW w:type="dxa" w:w="2340"/>
+          </w:tcPr>
+          <w:p>
+            <w:r>
+              <w:rPr>
+                <w:sz w:val="18"/>
+              </w:rPr>
+              <w:t>Trimestral; maior</w:t>
             </w:r>
           </w:p>
         </w:tc>
@@ -7574,7 +8286,7 @@
       <w:tr>
         <w:tc>
           <w:tcPr>
-            <w:tcW w:type="dxa" w:w="1872"/>
+            <w:tcW w:type="dxa" w:w="2340"/>
           </w:tcPr>
           <w:p>
             <w:r>
@@ -7587,7 +8299,7 @@
         </w:tc>
         <w:tc>
           <w:tcPr>
-            <w:tcW w:type="dxa" w:w="1872"/>
+            <w:tcW w:type="dxa" w:w="2340"/>
           </w:tcPr>
           <w:p>
             <w:r>
@@ -7600,7 +8312,7 @@
         </w:tc>
         <w:tc>
           <w:tcPr>
-            <w:tcW w:type="dxa" w:w="1872"/>
+            <w:tcW w:type="dxa" w:w="2340"/>
           </w:tcPr>
           <w:p>
             <w:r>
@@ -7613,27 +8325,14 @@
         </w:tc>
         <w:tc>
           <w:tcPr>
-            <w:tcW w:type="dxa" w:w="1872"/>
-          </w:tcPr>
-          <w:p>
-            <w:r>
-              <w:rPr>
-                <w:sz w:val="18"/>
-              </w:rPr>
-              <w:t>Semestral</w:t>
-            </w:r>
-          </w:p>
-        </w:tc>
-        <w:tc>
-          <w:tcPr>
-            <w:tcW w:type="dxa" w:w="1872"/>
-          </w:tcPr>
-          <w:p>
-            <w:r>
-              <w:rPr>
-                <w:sz w:val="18"/>
-              </w:rPr>
-              <w:t>Maior</w:t>
+            <w:tcW w:type="dxa" w:w="2340"/>
+          </w:tcPr>
+          <w:p>
+            <w:r>
+              <w:rPr>
+                <w:sz w:val="18"/>
+              </w:rPr>
+              <w:t>Semestral; maior</w:t>
             </w:r>
           </w:p>
         </w:tc>
@@ -7641,7 +8340,7 @@
       <w:tr>
         <w:tc>
           <w:tcPr>
-            <w:tcW w:type="dxa" w:w="1872"/>
+            <w:tcW w:type="dxa" w:w="2340"/>
           </w:tcPr>
           <w:p>
             <w:r>
@@ -7654,7 +8353,7 @@
         </w:tc>
         <w:tc>
           <w:tcPr>
-            <w:tcW w:type="dxa" w:w="1872"/>
+            <w:tcW w:type="dxa" w:w="2340"/>
           </w:tcPr>
           <w:p>
             <w:r>
@@ -7667,7 +8366,7 @@
         </w:tc>
         <w:tc>
           <w:tcPr>
-            <w:tcW w:type="dxa" w:w="1872"/>
+            <w:tcW w:type="dxa" w:w="2340"/>
           </w:tcPr>
           <w:p>
             <w:r>
@@ -7680,27 +8379,14 @@
         </w:tc>
         <w:tc>
           <w:tcPr>
-            <w:tcW w:type="dxa" w:w="1872"/>
-          </w:tcPr>
-          <w:p>
-            <w:r>
-              <w:rPr>
-                <w:sz w:val="18"/>
-              </w:rPr>
-              <w:t>Anual</w:t>
-            </w:r>
-          </w:p>
-        </w:tc>
-        <w:tc>
-          <w:tcPr>
-            <w:tcW w:type="dxa" w:w="1872"/>
-          </w:tcPr>
-          <w:p>
-            <w:r>
-              <w:rPr>
-                <w:sz w:val="18"/>
-              </w:rPr>
-              <w:t>Maior</w:t>
+            <w:tcW w:type="dxa" w:w="2340"/>
+          </w:tcPr>
+          <w:p>
+            <w:r>
+              <w:rPr>
+                <w:sz w:val="18"/>
+              </w:rPr>
+              <w:t>Anual; maior</w:t>
             </w:r>
           </w:p>
         </w:tc>
@@ -7708,7 +8394,7 @@
       <w:tr>
         <w:tc>
           <w:tcPr>
-            <w:tcW w:type="dxa" w:w="1872"/>
+            <w:tcW w:type="dxa" w:w="2340"/>
           </w:tcPr>
           <w:p>
             <w:r>
@@ -7721,7 +8407,7 @@
         </w:tc>
         <w:tc>
           <w:tcPr>
-            <w:tcW w:type="dxa" w:w="1872"/>
+            <w:tcW w:type="dxa" w:w="2340"/>
           </w:tcPr>
           <w:p>
             <w:r>
@@ -7734,7 +8420,7 @@
         </w:tc>
         <w:tc>
           <w:tcPr>
-            <w:tcW w:type="dxa" w:w="1872"/>
+            <w:tcW w:type="dxa" w:w="2340"/>
           </w:tcPr>
           <w:p>
             <w:r>
@@ -7747,27 +8433,14 @@
         </w:tc>
         <w:tc>
           <w:tcPr>
-            <w:tcW w:type="dxa" w:w="1872"/>
-          </w:tcPr>
-          <w:p>
-            <w:r>
-              <w:rPr>
-                <w:sz w:val="18"/>
-              </w:rPr>
-              <w:t>Semestral</w:t>
-            </w:r>
-          </w:p>
-        </w:tc>
-        <w:tc>
-          <w:tcPr>
-            <w:tcW w:type="dxa" w:w="1872"/>
-          </w:tcPr>
-          <w:p>
-            <w:r>
-              <w:rPr>
-                <w:sz w:val="18"/>
-              </w:rPr>
-              <w:t>Menor</w:t>
+            <w:tcW w:type="dxa" w:w="2340"/>
+          </w:tcPr>
+          <w:p>
+            <w:r>
+              <w:rPr>
+                <w:sz w:val="18"/>
+              </w:rPr>
+              <w:t>Semestral; menor</w:t>
             </w:r>
           </w:p>
         </w:tc>
@@ -7775,7 +8448,7 @@
       <w:tr>
         <w:tc>
           <w:tcPr>
-            <w:tcW w:type="dxa" w:w="1872"/>
+            <w:tcW w:type="dxa" w:w="2340"/>
           </w:tcPr>
           <w:p>
             <w:r>
@@ -7788,7 +8461,7 @@
         </w:tc>
         <w:tc>
           <w:tcPr>
-            <w:tcW w:type="dxa" w:w="1872"/>
+            <w:tcW w:type="dxa" w:w="2340"/>
           </w:tcPr>
           <w:p>
             <w:r>
@@ -7801,7 +8474,7 @@
         </w:tc>
         <w:tc>
           <w:tcPr>
-            <w:tcW w:type="dxa" w:w="1872"/>
+            <w:tcW w:type="dxa" w:w="2340"/>
           </w:tcPr>
           <w:p>
             <w:r>
@@ -7814,27 +8487,14 @@
         </w:tc>
         <w:tc>
           <w:tcPr>
-            <w:tcW w:type="dxa" w:w="1872"/>
-          </w:tcPr>
-          <w:p>
-            <w:r>
-              <w:rPr>
-                <w:sz w:val="18"/>
-              </w:rPr>
-              <w:t>Mensal</w:t>
-            </w:r>
-          </w:p>
-        </w:tc>
-        <w:tc>
-          <w:tcPr>
-            <w:tcW w:type="dxa" w:w="1872"/>
-          </w:tcPr>
-          <w:p>
-            <w:r>
-              <w:rPr>
-                <w:sz w:val="18"/>
-              </w:rPr>
-              <w:t>Menor</w:t>
+            <w:tcW w:type="dxa" w:w="2340"/>
+          </w:tcPr>
+          <w:p>
+            <w:r>
+              <w:rPr>
+                <w:sz w:val="18"/>
+              </w:rPr>
+              <w:t>Mensal; menor</w:t>
             </w:r>
           </w:p>
         </w:tc>
@@ -7842,7 +8502,7 @@
       <w:tr>
         <w:tc>
           <w:tcPr>
-            <w:tcW w:type="dxa" w:w="1872"/>
+            <w:tcW w:type="dxa" w:w="2340"/>
           </w:tcPr>
           <w:p>
             <w:r>
@@ -7855,7 +8515,7 @@
         </w:tc>
         <w:tc>
           <w:tcPr>
-            <w:tcW w:type="dxa" w:w="1872"/>
+            <w:tcW w:type="dxa" w:w="2340"/>
           </w:tcPr>
           <w:p>
             <w:r>
@@ -7868,7 +8528,7 @@
         </w:tc>
         <w:tc>
           <w:tcPr>
-            <w:tcW w:type="dxa" w:w="1872"/>
+            <w:tcW w:type="dxa" w:w="2340"/>
           </w:tcPr>
           <w:p>
             <w:r>
@@ -7881,27 +8541,14 @@
         </w:tc>
         <w:tc>
           <w:tcPr>
-            <w:tcW w:type="dxa" w:w="1872"/>
-          </w:tcPr>
-          <w:p>
-            <w:r>
-              <w:rPr>
-                <w:sz w:val="18"/>
-              </w:rPr>
-              <w:t>Trimestral</w:t>
-            </w:r>
-          </w:p>
-        </w:tc>
-        <w:tc>
-          <w:tcPr>
-            <w:tcW w:type="dxa" w:w="1872"/>
-          </w:tcPr>
-          <w:p>
-            <w:r>
-              <w:rPr>
-                <w:sz w:val="18"/>
-              </w:rPr>
-              <w:t>Menor</w:t>
+            <w:tcW w:type="dxa" w:w="2340"/>
+          </w:tcPr>
+          <w:p>
+            <w:r>
+              <w:rPr>
+                <w:sz w:val="18"/>
+              </w:rPr>
+              <w:t>Trimestral; menor</w:t>
             </w:r>
           </w:p>
         </w:tc>
@@ -7939,6 +8586,45 @@
     </w:tbl>
     <w:p>
       <w:pPr>
+        <w:jc w:val="center"/>
+      </w:pPr>
+      <w:r>
+        <w:drawing>
+          <wp:inline>
+            <wp:extent cx="5669280" cy="1970982"/>
+            <wp:docPr id="60" name="Picture 60"/>
+            <wp:cNvGraphicFramePr>
+              <a:graphicFrameLocks noChangeAspect="1"/>
+            </wp:cNvGraphicFramePr>
+            <a:graphic>
+              <a:graphicData uri="http://schemas.openxmlformats.org/drawingml/2006/picture">
+                <pic:pic>
+                  <pic:nvPicPr>
+                    <pic:cNvPr id="0" name="figura_tikz_2.png"/>
+                    <pic:cNvPicPr/>
+                  </pic:nvPicPr>
+                  <pic:blipFill>
+                    <a:blip r:embed="rId10"/>
+                    <a:stretch>
+                      <a:fillRect/>
+                    </a:stretch>
+                  </pic:blipFill>
+                  <pic:spPr>
+                    <a:xfrm>
+                      <a:off x="0" y="0"/>
+                      <a:ext cx="5669280" cy="1970982"/>
+                    </a:xfrm>
+                    <a:prstGeom prst="rect"/>
+                  </pic:spPr>
+                </pic:pic>
+              </a:graphicData>
+            </a:graphic>
+          </wp:inline>
+        </w:drawing>
+      </w:r>
+    </w:p>
+    <w:p>
+      <w:pPr>
         <w:pStyle w:val="ImageCaption"/>
       </w:pPr>
       <w:r>
@@ -7950,7 +8636,25 @@
         <w:pStyle w:val="BodyText"/>
       </w:pPr>
       <w:r>
-        <w:t xml:space="preserve">Pesos podem ser elicitados por Delphi, AHP, BWM ou procedimento justificado somente após validação de conteúdo. A função de agregação deve declarar o grau de compensação aceitável, e a sensibilidade deve variar pesos, limiares e tratamento de dados ausentes. Risco estrutural, risco à vida, incêndio e descumprimento legal operam como vetos: desempenho econômico ou ambiental favorável não compensa a violação do limiar definido por norma, laudo ou autoridade competente. O ciclo de vida permanece transversal para evitar dupla contagem.</w:t>
+        <w:t xml:space="preserve">Pesos podem ser elicitados por Delphi, AHP, BWM ou procedimento justificado somente após validação de conteúdo, conforme a função observada desses métodos em aplicações prediais</w:t>
+      </w:r>
+      <w:r>
+        <w:t xml:space="preserve"> </w:t>
+      </w:r>
+      <w:r>
+        <w:t xml:space="preserve">(Alfalah et al. 2022; Naji, Gunduz, and Maki 2023; Masmoudi et al. 2026)</w:t>
+      </w:r>
+      <w:r>
+        <w:t xml:space="preserve">. A função de agregação deve declarar o grau de compensação aceitável, e a sensibilidade deve variar pesos, limiares e tratamento de dados ausentes. Risco estrutural, risco à vida, incêndio e descumprimento legal operam como vetos: desempenho econômico ou ambiental favorável não compensa a violação do limiar definido por norma, laudo ou autoridade competente</w:t>
+      </w:r>
+      <w:r>
+        <w:t xml:space="preserve"> </w:t>
+      </w:r>
+      <w:r>
+        <w:t xml:space="preserve">(Associação Brasileira de Normas Técnicas 2012; Araújo Neto 2015)</w:t>
+      </w:r>
+      <w:r>
+        <w:t xml:space="preserve">. O ciclo de vida permanece transversal para evitar dupla contagem.</w:t>
       </w:r>
     </w:p>
     <w:p>
@@ -7958,7 +8662,7 @@
         <w:pStyle w:val="BodyText"/>
       </w:pPr>
       <w:r>
-        <w:t xml:space="preserve">Mesmo com essa especificação, a matriz não é um modelo validado nem um instrumento pronto para decisão. Indicadores, pesos, limiares e regras requerem participação institucional e teste com dados reais; a contribuição atual é uma arquitetura rastreável para essa validação.</w:t>
+        <w:t xml:space="preserve">Em nível arquitetural, a matriz completa a resposta à RQ0 ao converter dimensões e critérios recorrentes em indicadores candidatos, fontes, periodicidade, direção de preferência e salvaguardas. Ela não é um modelo validado nem um instrumento pronto para decisão; indicadores, pesos, limiares e regras requerem participação institucional e teste com dados reais.</w:t>
       </w:r>
     </w:p>
     <w:bookmarkEnd w:id="59"/>
@@ -8007,7 +8711,7 @@
         <w:t xml:space="preserve">digital twin</w:t>
       </w:r>
       <w:r>
-        <w:t xml:space="preserve">, carbono e avaliação do ciclo de vida indicam mudança de vocabulário, não causalidade ou substituição dos temas tradicionais. A rede conecta BIM a gestão de facilidades, manutenção preditiva, operação e desempenho; as leituras integrais sintetizadas na Seção </w:t>
+        <w:t xml:space="preserve">, carbono e avaliação do ciclo de vida indicam mudança de vocabulário, não causalidade ou substituição dos temas tradicionais. A rede conecta BIM a gestão de facilidades, manutenção preditiva, operação e desempenho; a síntese das leituras integrais na Seção </w:t>
       </w:r>
       <w:hyperlink w:anchor="sec:metodos">
         <w:r>
@@ -8021,16 +8725,7 @@
         <w:t xml:space="preserve"> </w:t>
       </w:r>
       <w:r>
-        <w:t xml:space="preserve">qualificam essa conexão</w:t>
-      </w:r>
-      <w:r>
-        <w:t xml:space="preserve"> </w:t>
-      </w:r>
-      <w:r>
-        <w:t xml:space="preserve">(Deng, Menassa, and Kamat 2021; Espinosa Gispert et al. 2025; Goretti and Kaming 2023)</w:t>
-      </w:r>
-      <w:r>
-        <w:t xml:space="preserve">. O campo avança em capacidade informacional, mas permanece heterogêneo em maturidade e validação.</w:t>
+        <w:t xml:space="preserve">mostra que essa conexão abrange integração de dados, previsão, simulação e estruturação decisória parcial. O campo avança em capacidade informacional, mas permanece heterogêneo em maturidade e validação.</w:t>
       </w:r>
     </w:p>
     <w:p>
@@ -8092,7 +8787,37 @@
         </w:r>
       </w:hyperlink>
       <w:r>
-        <w:t xml:space="preserve">, sem constituir categoria separada de maturidade: presença documental de um termo de IA no título ou resumo não equivale a adoção institucional, validação de desempenho ou substituição de métodos multicritério já consolidados. Sete registros do núcleo original, previamente classificados como secundários ou excluídos, foram reavaliados sob esse critério porque o dicionário de perguntas de pesquisa vigente até então (RQ0 a RQ5) não continha termos dedicados a IA/aprendizado de máquina; cinco foram promovidos ao núcleo principal por evidenciarem técnica computacional efetivamente aplicada, não por reinterpretação do conteúdo original dos estudos.</w:t>
+        <w:t xml:space="preserve">, sem constituir categoria separada de maturidade: presença documental de um termo de IA no título ou resumo não equivale a adoção institucional, validação de desempenho ou substituição de métodos multicritério já consolidados.</w:t>
+      </w:r>
+    </w:p>
+    <w:p>
+      <w:pPr>
+        <w:pStyle w:val="BodyText"/>
+      </w:pPr>
+      <w:r>
+        <w:t xml:space="preserve">Sete registros do núcleo original, previamente classificados como secundários ou excluídos, foram reavaliados sob esse critério porque o dicionário de perguntas de pesquisa vigente até então (RQ0 a RQ5) não continha termos dedicados a IA e aprendizado de máquina; cinco foram promovidos ao núcleo principal por evidenciarem técnica computacional efetivamente aplicada, não por reinterpretação do conteúdo original dos estudos.</w:t>
+      </w:r>
+    </w:p>
+    <w:p>
+      <w:pPr>
+        <w:pStyle w:val="BodyText"/>
+      </w:pPr>
+      <w:r>
+        <w:t xml:space="preserve">A leitura comparativa detalhada na Seção </w:t>
+      </w:r>
+      <w:hyperlink w:anchor="sec:metodos">
+        <w:r>
+          <w:rPr>
+            <w:rStyle w:val="Hyperlink"/>
+          </w:rPr>
+          <w:t xml:space="preserve">7</w:t>
+        </w:r>
+      </w:hyperlink>
+      <w:r>
+        <w:t xml:space="preserve"> </w:t>
+      </w:r>
+      <w:r>
+        <w:t xml:space="preserve">também desloca a discussão de uma oposição simplista entre métodos tradicionais e IA. Os estudos mostram que técnicas treinadas podem produzir estimativas úteis à gestão, mas também registram fragmentação temática e barreiras de interoperabilidade, privacidade, governança de dados e representatividade geográfica. Portanto, acurácia preditiva e legitimidade decisória pertencem a níveis distintos. Para uma universidade pública, mesmo um modelo tecnicamente adequado precisa explicitar origem e atualidade dos dados, domínio de validade, tratamento de erro e dados ausentes, responsável pela decisão e possibilidade de contestação.</w:t>
       </w:r>
     </w:p>
     <w:bookmarkEnd w:id="60"/>
@@ -8151,7 +8876,7 @@
         <w:t xml:space="preserve">(Alfalah et al. 2022; Naji, Gunduz, and Maki 2023; Masmoudi et al. 2026; Kim et al. 2018; Nägeli et al. 2019; Ferreira et al. 2020)</w:t>
       </w:r>
       <w:r>
-        <w:t xml:space="preserve">. A lacuna central não é ausência de critérios, mas falta da cadeia completa entre evidência, variável mensurável, preferência institucional e decisão validada.</w:t>
+        <w:t xml:space="preserve">. A lacuna central não é a ausência de critérios, mas a falta de uma cadeia documentada entre evidência, variável mensurável, preferência institucional e decisão validada. Esse resultado responde à RQ0 ao indicar que a literatura fornece componentes para o protocolo, mas não um modelo diretamente transferível à gestão universitária pública.</w:t>
       </w:r>
     </w:p>
     <w:bookmarkEnd w:id="61"/>
@@ -8203,7 +8928,7 @@
         <w:t xml:space="preserve">(Martins and Espejo 2024; Morais, Paula, and Reis 2023)</w:t>
       </w:r>
       <w:r>
-        <w:t xml:space="preserve">. A baixa presença lexical de ODS e ESG, apesar da recorrência de energia, emissões, segurança, conforto e governança, sugere adoção substantiva sem linguagem operacional explícita</w:t>
+        <w:t xml:space="preserve">. A baixa presença lexical de ODS e ESG, apesar da recorrência de energia, emissões, segurança, conforto e governança, indica no corpus uma aproximação substantiva ainda pouco expressa por esses rótulos. Essa interpretação é compatível com o caráter emergente da incorporação explícita de ESG à gestão de facilidades</w:t>
       </w:r>
       <w:r>
         <w:t xml:space="preserve"> </w:t>
@@ -8230,7 +8955,7 @@
         <w:pStyle w:val="FirstParagraph"/>
       </w:pPr>
       <w:r>
-        <w:t xml:space="preserve">O protocolo preenche parte dessa lacuna ao ligar cada elemento candidato a evidência bibliométrica, síntese temática e leitura integral. A rastreabilidade explica por que desempenho, informação, condição, conformidade, custo, energia e usuários foram escolhidos, enquanto o fluxograma separa validação de conteúdo, qualidade dos dados, ponderação, vetos e sensibilidade. Para a gestão pública, seu valor não está apenas no ordenamento final, mas no registro verificável da fonte, da unidade, da periodicidade, dos atores e das regras aplicadas. Vetos impedem que risco à vida ou ilegalidade sejam compensados por vantagens econômicas ou ambientais.</w:t>
+        <w:t xml:space="preserve">Como proposição deste artigo, o protocolo procura reduzir parte dessa lacuna ao ligar cada elemento candidato a evidência bibliométrica, síntese temática e leitura integral. A rastreabilidade explica por que desempenho, informação, condição, conformidade, custo, energia e usuários foram escolhidos, enquanto o fluxograma separa validação de conteúdo, qualidade dos dados, ponderação, vetos e sensibilidade. Para a gestão pública, seu valor não está apenas no ordenamento final, mas no registro verificável da fonte, da unidade, da periodicidade, dos atores e das regras aplicadas. Vetos impedem que risco à vida ou ilegalidade sejam compensados por vantagens econômicas ou ambientais.</w:t>
       </w:r>
     </w:p>
     <w:p>
@@ -8246,7 +8971,7 @@
         <w:pStyle w:val="BodyText"/>
       </w:pPr>
       <w:r>
-        <w:t xml:space="preserve">O avanço requer validar conteúdo antes de pesos, integrar dados administrativos, elicitar preferências com participação institucional, testar sensibilidade e comparar resultados entre unidades. Essa sequência transforma a síntese em governança da manutenção sem atribuir ao protocolo validade ainda não demonstrada.</w:t>
+        <w:t xml:space="preserve">Como agenda de validação derivada da síntese, recomenda-se validar o conteúdo antes dos pesos, integrar dados administrativos, elicitar preferências com participação institucional, testar sensibilidade e comparar resultados entre unidades. Essa sequência delimita como a arquitetura proposta poderá ser testada sem lhe atribuir validade ainda não demonstrada.</w:t>
       </w:r>
     </w:p>
     <w:bookmarkEnd w:id="63"/>
@@ -8275,7 +9000,7 @@
         <w:t xml:space="preserve"> </w:t>
       </w:r>
       <w:r>
-        <w:t xml:space="preserve">O ano de 2026 é parcial e os índices podem mudar. Não houve pré-registro público do protocolo. Também não foram realizadas busca de citações para frente ou para trás nem busca estruturada de literatura cinzenta, e a cobertura permaneceu condicionada às fontes e aos metadados indexados. As decisões de triagem e codificação foram conduzidas por um único avaliador, sem segundo revisor independente e sem medida de concordância interavaliadores; presença lexical não equivale a variável mensurada, critério aplicado ou resultado empírico, e ODS, SDG e ESG podem estar ausentes mesmo quando seus componentes aparecem.</w:t>
+        <w:t xml:space="preserve">O ano de 2026 é parcial e os índices podem mudar. Não houve pré-registro, busca de citações para frente ou para trás nem busca estruturada de literatura cinzenta; a cobertura depende das três fontes e dos metadados disponíveis. Triagem e codificação foram conduzidas por um único avaliador, sem revisão independente ou concordância interavaliadores. Além disso, presença lexical não equivale a variável mensurada, critério aplicado ou resultado empírico, e ODS, SDG ou ESG podem estar ausentes mesmo quando seus componentes aparecem.</w:t>
       </w:r>
     </w:p>
     <w:p>
@@ -8293,7 +9018,7 @@
         <w:t xml:space="preserve"> </w:t>
       </w:r>
       <w:r>
-        <w:t xml:space="preserve">O núcleo de 121 não foi submetido integralmente a elegibilidade e extração em texto completo. Trinta estudos com PDF disponível foram posteriormente lidos em tarefas pontuais e 14 forneceram evidências específicas. A unidade de análise quantitativa é o registro bibliográfico consolidado. Ela não garante independência entre publicações relacionadas nem representa força de evidência acumulada; a classificação de desenho deixou 23,1% sem sinal suficiente e nenhum instrumento de risco de viés foi aplicado, o que impede comparar qualidade metodológica ou recomendar superioridade. Na camada bibliométrica, a incompletude de autores e a ausência de afiliações e referências citadas impediram rede de colaboração e acoplamento bibliográfico, e as demais medidas permanecem explorações documentais.</w:t>
+        <w:t xml:space="preserve">O núcleo de 121 registros não foi submetido integralmente a elegibilidade e extração em texto completo. As leituras posteriores foram pontuais: 37 textos foram consultados e 19 acrescentaram evidências específicas; no lote de sensibilidade, sete dos 17 foram lidos integralmente. A unidade quantitativa é o registro bibliográfico consolidado, que não garante independência entre publicações relacionadas nem representa força de evidência acumulada. Como 23,1% dos registros não apresentaram sinal suficiente para classificar o desenho e não foi aplicado instrumento de risco de viés, não se pode comparar qualidade metodológica nem recomendar superioridade. A ausência de afiliações e referências citadas e a baixa completude de autores também impediram rede de colaboração e acoplamento bibliográfico.</w:t>
       </w:r>
     </w:p>
     <w:p>
@@ -8311,7 +9036,7 @@
         <w:t xml:space="preserve"> </w:t>
       </w:r>
       <w:r>
-        <w:t xml:space="preserve">Os 4.889 registros da busca de sensibilidade foram classificados por correspondência automatizada de termos contra o dicionário RQ6, não por leitura de texto completo; apenas os candidatos ao núcleo (20 antes da revisão manual) tiveram título e resumo lidos individualmente. A fatia recuperada no Crossref apresentou ausência sistemática de resumo (24,9% com resumo, ante 100% na Scopus e na Web of Science), reduzindo a confiabilidade da classificação nessa fatia e concentrando os registros de confiança baixa; nenhum registro de núcleo desta rodada veio exclusivamente do Crossref. A busca de sensibilidade cobriu apenas as mesmas três bases do núcleo original, sem literatura cinzenta nem bases adicionais especializadas em ciência da computação.</w:t>
+        <w:t xml:space="preserve">Os 4.889 registros foram classificados por correspondência de termos ao dicionário RQ6; somente os 20 candidatos ao núcleo tiveram título e resumo revisados individualmente. No Crossref, 24,9% possuíam resumo, ante 100% na Scopus e na Web of Science, e nenhum registro incorporado teve origem exclusiva nessa fonte. A rodada permaneceu restrita às mesmas três bases, sem literatura cinzenta ou base especializada em ciência da computação. As strings nativas exatas de Scopus e Web of Science não foram preservadas, embora campos, datas, período e totais exportados estejam documentados. Por ter sido deliberadamente enriquecido com termos de inteligência artificial e aprendizado de máquina, o aumento de nove para 26 registros mede o efeito da sensibilidade, não a prevalência dessas técnicas no campo.</w:t>
       </w:r>
     </w:p>
     <w:p>
@@ -8329,11 +9054,11 @@
         <w:t xml:space="preserve"> </w:t>
       </w:r>
       <w:r>
-        <w:t xml:space="preserve">Indicadores e regras formam especificação operacional candidata: pesos, limiares, função de agregação e sensibilidade ainda não foram validados nem executados com dados reais, permanecendo dependentes de validação de conteúdo, participação institucional e teste de robustez.</w:t>
+        <w:t xml:space="preserve">Indicadores e regras constituem especificação candidata. Pesos, limiares, agregação e sensibilidade ainda dependem de validação de conteúdo, participação institucional, dados reais e teste de robustez.</w:t>
       </w:r>
     </w:p>
     <w:bookmarkEnd w:id="65"/>
-    <w:bookmarkStart w:id="136" w:name="sec:consideracoes"/>
+    <w:bookmarkStart w:id="150" w:name="sec:consideracoes"/>
     <w:p>
       <w:pPr>
         <w:pStyle w:val="Heading1"/>
@@ -8379,7 +9104,7 @@
         <w:pStyle w:val="BodyText"/>
       </w:pPr>
       <w:r>
-        <w:t xml:space="preserve">Foram identificadas seis dimensões, 15 critérios e abordagens decisórias heterogêneas. Estruturas genéricas, BIM e apoio à decisão foram mais frequentes que métodos multicritério nomeados; aprendizado de máquina, tema da busca de sensibilidade, cresceu de nove para 26 registros, mas sua presença documental não substitui validação de desempenho nem indica maturidade institucional de adoção. Edificações genéricas e portfólios predominaram; universidades,</w:t>
+        <w:t xml:space="preserve">Foram identificadas seis dimensões, 15 critérios e abordagens decisórias heterogêneas. Estruturas genéricas, BIM e apoio à decisão foram mais frequentes que métodos multicritério nomeados; aprendizado de máquina, tema da busca de sensibilidade, cresceu de nove para 26 registros, mas sua presença documental não substitui validação de desempenho nem indica maturidade institucional de adoção. Em resposta à RQ6, entre os 17 registros incorporados, dez têm como função predominante previsão ou previsão com otimização, dois diagnóstico e classificação e cinco síntese ou integração tecnológica. Nenhum demonstrou a cadeia completa entre modelo treinado, validação externa, ponderação multicritério, vetos e decisão pública auditável. Edificações genéricas e portfólios predominaram; universidades,</w:t>
       </w:r>
       <w:r>
         <w:t xml:space="preserve"> </w:t>
@@ -8412,7 +9137,7 @@
         <w:pStyle w:val="BodyText"/>
       </w:pPr>
       <w:r>
-        <w:t xml:space="preserve">A contribuição é uma matriz analítica conceitual informada pela síntese da literatura, convertida em protocolo operacional candidato e rastreável. A proposta liga evidências a indicadores, fontes, periodicidade, preferência e regras de veto, com pesos e limiares remetidos à validação institucional. Este protocolo não resolve a escassez de recursos, mas oferece um caminho transparente para justificar onde eles serão aplicados, transformando a priorização da manutenção em ato de governança auditável.</w:t>
+        <w:t xml:space="preserve">A contribuição é uma matriz analítica conceitual informada pela síntese da literatura, convertida em protocolo operacional candidato e rastreável. A proposta liga evidências a indicadores, fontes, periodicidade, preferência e regras de veto, com pesos e limiares remetidos à validação institucional. Este protocolo não resolve a escassez de recursos; se validado institucionalmente, poderá oferecer um caminho transparente para justificar sua aplicação e tornar a priorização da manutenção um ato de governança auditável.</w:t>
       </w:r>
     </w:p>
     <w:p>
@@ -8420,7 +9145,7 @@
         <w:pStyle w:val="BodyText"/>
       </w:pPr>
       <w:r>
-        <w:t xml:space="preserve">A implementação permanece organizada em quatro etapas:</w:t>
+        <w:t xml:space="preserve">Como proposição dos autores, a validação futura pode ser organizada em quatro etapas sequenciais, sem que os intervalos de duração sejam definidos antes do diagnóstico institucional:</w:t>
       </w:r>
     </w:p>
     <w:p>
@@ -8435,7 +9160,7 @@
           <w:bCs/>
           <w:b/>
         </w:rPr>
-        <w:t xml:space="preserve">Validação de conteúdo, 0–6 meses:</w:t>
+        <w:t xml:space="preserve">Validação de conteúdo:</w:t>
       </w:r>
       <w:r>
         <w:t xml:space="preserve"> </w:t>
@@ -8456,7 +9181,7 @@
           <w:bCs/>
           <w:b/>
         </w:rPr>
-        <w:t xml:space="preserve">Integração de dados, 6–12 meses:</w:t>
+        <w:t xml:space="preserve">Integração de dados:</w:t>
       </w:r>
       <w:r>
         <w:t xml:space="preserve"> </w:t>
@@ -8477,7 +9202,7 @@
           <w:bCs/>
           <w:b/>
         </w:rPr>
-        <w:t xml:space="preserve">Ponderação e protótipo, 12–18 meses:</w:t>
+        <w:t xml:space="preserve">Ponderação e protótipo:</w:t>
       </w:r>
       <w:r>
         <w:t xml:space="preserve"> </w:t>
@@ -8498,7 +9223,7 @@
           <w:bCs/>
           <w:b/>
         </w:rPr>
-        <w:t xml:space="preserve">Validação multicampi, 18–24 meses:</w:t>
+        <w:t xml:space="preserve">Validação multicampi:</w:t>
       </w:r>
       <w:r>
         <w:t xml:space="preserve"> </w:t>
@@ -8512,10 +9237,10 @@
         <w:pStyle w:val="FirstParagraph"/>
       </w:pPr>
       <w:r>
-        <w:t xml:space="preserve">A versão completa funciona como capítulo de tese e documentação científica do produto. Uma futura versão de artigo pode deslocar rastreabilidade extensa para material suplementar, preservando pergunta, método, resultados bibliométricos e temáticos e protocolo. Até a validação, a contribuição é uma base reproduzível e operacionalmente especificada, não uma classificação pronta para investimento.</w:t>
-      </w:r>
-    </w:p>
-    <w:bookmarkStart w:id="135" w:name="refs"/>
+        <w:t xml:space="preserve">Até a validação empírica e institucional, a contribuição permanece uma base reproduzível e operacionalmente especificada para teste, não uma classificação pronta para orientar investimentos.</w:t>
+      </w:r>
+    </w:p>
+    <w:bookmarkStart w:id="149" w:name="refs"/>
     <w:bookmarkStart w:id="67" w:name="ref-aldairi_lean6sbm_2017"/>
     <w:p>
       <w:pPr>
@@ -8616,19 +9341,19 @@
       </w:r>
     </w:p>
     <w:bookmarkEnd w:id="69"/>
-    <w:bookmarkStart w:id="71" w:name="ref-aliu_barreirasdt_2025"/>
+    <w:bookmarkStart w:id="71" w:name="ref-alici_iotambientes_2026"/>
     <w:p>
       <w:pPr>
         <w:pStyle w:val="Bibliography"/>
       </w:pPr>
       <w:r>
-        <w:t xml:space="preserve">Aliu, Abdulmalik Adozuka, Nor Rima Muhamad Ariff, Sheikh Ali Azzran Sh Said, Divine Senanu Ametefe, and Dah John. 2025.</w:t>
-      </w:r>
-      <w:r>
-        <w:t xml:space="preserve"> </w:t>
-      </w:r>
-      <w:r>
-        <w:t xml:space="preserve">“Barriers to Digital Transformation in Facilities Management: Insights from a Developing Country.”</w:t>
+        <w:t xml:space="preserve">Alici, Nedim. 2026.</w:t>
+      </w:r>
+      <w:r>
+        <w:t xml:space="preserve"> </w:t>
+      </w:r>
+      <w:r>
+        <w:t xml:space="preserve">“IoT-Enabled Indoor Environments in Smart Cities: A Systematic Review on Energy Efficiency, User Comfort, and Environmental Sustainability.”</w:t>
       </w:r>
       <w:r>
         <w:t xml:space="preserve"> </w:t>
@@ -8638,6 +9363,52 @@
           <w:iCs/>
           <w:i/>
         </w:rPr>
+        <w:t xml:space="preserve">Frontiers in Sustainability</w:t>
+      </w:r>
+      <w:r>
+        <w:t xml:space="preserve"> </w:t>
+      </w:r>
+      <w:r>
+        <w:t xml:space="preserve">7: 1751337.</w:t>
+      </w:r>
+      <w:r>
+        <w:t xml:space="preserve"> </w:t>
+      </w:r>
+      <w:hyperlink r:id="rId70">
+        <w:r>
+          <w:rPr>
+            <w:rStyle w:val="Hyperlink"/>
+          </w:rPr>
+          <w:t xml:space="preserve">https://doi.org/10.3389/frsus.2026.1751337</w:t>
+        </w:r>
+      </w:hyperlink>
+      <w:r>
+        <w:t xml:space="preserve">.</w:t>
+      </w:r>
+    </w:p>
+    <w:bookmarkEnd w:id="71"/>
+    <w:bookmarkStart w:id="73" w:name="ref-aliu_barreirasdt_2025"/>
+    <w:p>
+      <w:pPr>
+        <w:pStyle w:val="Bibliography"/>
+      </w:pPr>
+      <w:r>
+        <w:t xml:space="preserve">Aliu, Abdulmalik Adozuka, Nor Rima Muhamad Ariff, Sheikh Ali Azzran Sh Said, Divine Senanu Ametefe, and Dah John. 2025.</w:t>
+      </w:r>
+      <w:r>
+        <w:t xml:space="preserve"> </w:t>
+      </w:r>
+      <w:r>
+        <w:t xml:space="preserve">“Barriers to Digital Transformation in Facilities Management: Insights from a Developing Country.”</w:t>
+      </w:r>
+      <w:r>
+        <w:t xml:space="preserve"> </w:t>
+      </w:r>
+      <w:r>
+        <w:rPr>
+          <w:iCs/>
+          <w:i/>
+        </w:rPr>
         <w:t xml:space="preserve">Journal of Construction in Developing Countries</w:t>
       </w:r>
       <w:r>
@@ -8649,7 +9420,7 @@
       <w:r>
         <w:t xml:space="preserve"> </w:t>
       </w:r>
-      <w:hyperlink r:id="rId70">
+      <w:hyperlink r:id="rId72">
         <w:r>
           <w:rPr>
             <w:rStyle w:val="Hyperlink"/>
@@ -8661,8 +9432,8 @@
         <w:t xml:space="preserve">.</w:t>
       </w:r>
     </w:p>
-    <w:bookmarkEnd w:id="71"/>
-    <w:bookmarkStart w:id="73" w:name="ref-araujoneto_manutencaolegislacao_2015"/>
+    <w:bookmarkEnd w:id="73"/>
+    <w:bookmarkStart w:id="75" w:name="ref-araujoneto_manutencaolegislacao_2015"/>
     <w:p>
       <w:pPr>
         <w:pStyle w:val="Bibliography"/>
@@ -8695,7 +9466,7 @@
       <w:r>
         <w:t xml:space="preserve"> </w:t>
       </w:r>
-      <w:hyperlink r:id="rId72">
+      <w:hyperlink r:id="rId74">
         <w:r>
           <w:rPr>
             <w:rStyle w:val="Hyperlink"/>
@@ -8707,8 +9478,8 @@
         <w:t xml:space="preserve">.</w:t>
       </w:r>
     </w:p>
-    <w:bookmarkEnd w:id="73"/>
-    <w:bookmarkStart w:id="74" w:name="ref-abnt_nbr5674_2012"/>
+    <w:bookmarkEnd w:id="75"/>
+    <w:bookmarkStart w:id="76" w:name="ref-abnt_nbr5674_2012"/>
     <w:p>
       <w:pPr>
         <w:pStyle w:val="Bibliography"/>
@@ -8729,8 +9500,8 @@
         <w:t xml:space="preserve">Rio de Janeiro: ABNT.</w:t>
       </w:r>
     </w:p>
-    <w:bookmarkEnd w:id="74"/>
-    <w:bookmarkStart w:id="76" w:name="ref-awuzie_fmuniversidades_2017"/>
+    <w:bookmarkEnd w:id="76"/>
+    <w:bookmarkStart w:id="78" w:name="ref-awuzie_fmuniversidades_2017"/>
     <w:p>
       <w:pPr>
         <w:pStyle w:val="Bibliography"/>
@@ -8763,7 +9534,7 @@
       <w:r>
         <w:t xml:space="preserve"> </w:t>
       </w:r>
-      <w:hyperlink r:id="rId75">
+      <w:hyperlink r:id="rId77">
         <w:r>
           <w:rPr>
             <w:rStyle w:val="Hyperlink"/>
@@ -8775,20 +9546,20 @@
         <w:t xml:space="preserve">.</w:t>
       </w:r>
     </w:p>
-    <w:bookmarkEnd w:id="76"/>
-    <w:bookmarkStart w:id="78" w:name="ref-chew_manutenibilidadeverde_2016"/>
+    <w:bookmarkEnd w:id="78"/>
+    <w:bookmarkStart w:id="80" w:name="X8197757cb75e327dcc86b36afee00a28411c12b"/>
     <w:p>
       <w:pPr>
         <w:pStyle w:val="Bibliography"/>
       </w:pPr>
       <w:r>
-        <w:t xml:space="preserve">Chew, Michael Yit Lin, and Sheila Conejos. 2016.</w:t>
-      </w:r>
-      <w:r>
-        <w:t xml:space="preserve"> </w:t>
-      </w:r>
-      <w:r>
-        <w:t xml:space="preserve">“Developing a Green Maintainability Framework for Green Walls in Singapore.”</w:t>
+        <w:t xml:space="preserve">Barbosa, Ana Maria da Silva, Taciana de Barros Jerônimo, Patrícia Tatiana Ferreira Ramos, and Juliana Karla Rodrigues de Souza Santos. 2020.</w:t>
+      </w:r>
+      <w:r>
+        <w:t xml:space="preserve"> </w:t>
+      </w:r>
+      <w:r>
+        <w:t xml:space="preserve">“A Gestão de Facilities Na Manutenção de Uma Instituição Pública.”</w:t>
       </w:r>
       <w:r>
         <w:t xml:space="preserve"> </w:t>
@@ -8798,6 +9569,52 @@
           <w:iCs/>
           <w:i/>
         </w:rPr>
+        <w:t xml:space="preserve">Revista Gestão Industrial</w:t>
+      </w:r>
+      <w:r>
+        <w:t xml:space="preserve"> </w:t>
+      </w:r>
+      <w:r>
+        <w:t xml:space="preserve">16 (3): 129–46.</w:t>
+      </w:r>
+      <w:r>
+        <w:t xml:space="preserve"> </w:t>
+      </w:r>
+      <w:hyperlink r:id="rId79">
+        <w:r>
+          <w:rPr>
+            <w:rStyle w:val="Hyperlink"/>
+          </w:rPr>
+          <w:t xml:space="preserve">https://doi.org/10.3895/gi.v16n3.8968</w:t>
+        </w:r>
+      </w:hyperlink>
+      <w:r>
+        <w:t xml:space="preserve">.</w:t>
+      </w:r>
+    </w:p>
+    <w:bookmarkEnd w:id="80"/>
+    <w:bookmarkStart w:id="82" w:name="ref-chew_manutenibilidadeverde_2016"/>
+    <w:p>
+      <w:pPr>
+        <w:pStyle w:val="Bibliography"/>
+      </w:pPr>
+      <w:r>
+        <w:t xml:space="preserve">Chew, Michael Yit Lin, and Sheila Conejos. 2016.</w:t>
+      </w:r>
+      <w:r>
+        <w:t xml:space="preserve"> </w:t>
+      </w:r>
+      <w:r>
+        <w:t xml:space="preserve">“Developing a Green Maintainability Framework for Green Walls in Singapore.”</w:t>
+      </w:r>
+      <w:r>
+        <w:t xml:space="preserve"> </w:t>
+      </w:r>
+      <w:r>
+        <w:rPr>
+          <w:iCs/>
+          <w:i/>
+        </w:rPr>
         <w:t xml:space="preserve">Structural Survey</w:t>
       </w:r>
       <w:r>
@@ -8809,7 +9626,7 @@
       <w:r>
         <w:t xml:space="preserve"> </w:t>
       </w:r>
-      <w:hyperlink r:id="rId77">
+      <w:hyperlink r:id="rId81">
         <w:r>
           <w:rPr>
             <w:rStyle w:val="Hyperlink"/>
@@ -8821,8 +9638,8 @@
         <w:t xml:space="preserve">.</w:t>
       </w:r>
     </w:p>
-    <w:bookmarkEnd w:id="78"/>
-    <w:bookmarkStart w:id="80" w:name="ref-conejos_verticalgreenery_2019"/>
+    <w:bookmarkEnd w:id="82"/>
+    <w:bookmarkStart w:id="84" w:name="ref-conejos_verticalgreenery_2019"/>
     <w:p>
       <w:pPr>
         <w:pStyle w:val="Bibliography"/>
@@ -8855,7 +9672,7 @@
       <w:r>
         <w:t xml:space="preserve"> </w:t>
       </w:r>
-      <w:hyperlink r:id="rId79">
+      <w:hyperlink r:id="rId83">
         <w:r>
           <w:rPr>
             <w:rStyle w:val="Hyperlink"/>
@@ -8867,8 +9684,8 @@
         <w:t xml:space="preserve">.</w:t>
       </w:r>
     </w:p>
-    <w:bookmarkEnd w:id="80"/>
-    <w:bookmarkStart w:id="82" w:name="ref-crossref_restapi_2026"/>
+    <w:bookmarkEnd w:id="84"/>
+    <w:bookmarkStart w:id="86" w:name="ref-crossref_restapi_2026"/>
     <w:p>
       <w:pPr>
         <w:pStyle w:val="Bibliography"/>
@@ -8891,7 +9708,7 @@
       <w:r>
         <w:t xml:space="preserve"> </w:t>
       </w:r>
-      <w:hyperlink r:id="rId81">
+      <w:hyperlink r:id="rId85">
         <w:r>
           <w:rPr>
             <w:rStyle w:val="Hyperlink"/>
@@ -8903,20 +9720,20 @@
         <w:t xml:space="preserve">.</w:t>
       </w:r>
     </w:p>
-    <w:bookmarkEnd w:id="82"/>
-    <w:bookmarkStart w:id="84" w:name="ref-deng_bimdigitaltwins_2021"/>
+    <w:bookmarkEnd w:id="86"/>
+    <w:bookmarkStart w:id="88" w:name="ref-das_iotai_2025"/>
     <w:p>
       <w:pPr>
         <w:pStyle w:val="Bibliography"/>
       </w:pPr>
       <w:r>
-        <w:t xml:space="preserve">Deng, Min, Carol C. Menassa, and Vineet R. Kamat. 2021.</w:t>
-      </w:r>
-      <w:r>
-        <w:t xml:space="preserve"> </w:t>
-      </w:r>
-      <w:r>
-        <w:t xml:space="preserve">“From BIM to Digital Twins: A Systematic Review of the Evolution of Intelligent Building Representations in the AEC-FM Industry.”</w:t>
+        <w:t xml:space="preserve">Das, Dillip Kumar. 2025.</w:t>
+      </w:r>
+      <w:r>
+        <w:t xml:space="preserve"> </w:t>
+      </w:r>
+      <w:r>
+        <w:t xml:space="preserve">“Integrating IoT and AI for Sustainable Energy-Efficient Smart Building: Potential, Barriers and Strategic Pathways.”</w:t>
       </w:r>
       <w:r>
         <w:t xml:space="preserve"> </w:t>
@@ -8926,6 +9743,52 @@
           <w:iCs/>
           <w:i/>
         </w:rPr>
+        <w:t xml:space="preserve">Sustainability</w:t>
+      </w:r>
+      <w:r>
+        <w:t xml:space="preserve"> </w:t>
+      </w:r>
+      <w:r>
+        <w:t xml:space="preserve">17 (22): 10313.</w:t>
+      </w:r>
+      <w:r>
+        <w:t xml:space="preserve"> </w:t>
+      </w:r>
+      <w:hyperlink r:id="rId87">
+        <w:r>
+          <w:rPr>
+            <w:rStyle w:val="Hyperlink"/>
+          </w:rPr>
+          <w:t xml:space="preserve">https://doi.org/10.3390/su172210313</w:t>
+        </w:r>
+      </w:hyperlink>
+      <w:r>
+        <w:t xml:space="preserve">.</w:t>
+      </w:r>
+    </w:p>
+    <w:bookmarkEnd w:id="88"/>
+    <w:bookmarkStart w:id="90" w:name="ref-deng_bimdigitaltwins_2021"/>
+    <w:p>
+      <w:pPr>
+        <w:pStyle w:val="Bibliography"/>
+      </w:pPr>
+      <w:r>
+        <w:t xml:space="preserve">Deng, Min, Carol C. Menassa, and Vineet R. Kamat. 2021.</w:t>
+      </w:r>
+      <w:r>
+        <w:t xml:space="preserve"> </w:t>
+      </w:r>
+      <w:r>
+        <w:t xml:space="preserve">“From BIM to Digital Twins: A Systematic Review of the Evolution of Intelligent Building Representations in the AEC-FM Industry.”</w:t>
+      </w:r>
+      <w:r>
+        <w:t xml:space="preserve"> </w:t>
+      </w:r>
+      <w:r>
+        <w:rPr>
+          <w:iCs/>
+          <w:i/>
+        </w:rPr>
         <w:t xml:space="preserve">Journal of Information Technology in Construction (ITcon)</w:t>
       </w:r>
       <w:r>
@@ -8937,7 +9800,7 @@
       <w:r>
         <w:t xml:space="preserve"> </w:t>
       </w:r>
-      <w:hyperlink r:id="rId83">
+      <w:hyperlink r:id="rId89">
         <w:r>
           <w:rPr>
             <w:rStyle w:val="Hyperlink"/>
@@ -8949,8 +9812,8 @@
         <w:t xml:space="preserve">.</w:t>
       </w:r>
     </w:p>
-    <w:bookmarkEnd w:id="84"/>
-    <w:bookmarkStart w:id="86" w:name="ref-donthu_bibliometria_2021"/>
+    <w:bookmarkEnd w:id="90"/>
+    <w:bookmarkStart w:id="92" w:name="ref-donthu_bibliometria_2021"/>
     <w:p>
       <w:pPr>
         <w:pStyle w:val="Bibliography"/>
@@ -8983,7 +9846,7 @@
       <w:r>
         <w:t xml:space="preserve"> </w:t>
       </w:r>
-      <w:hyperlink r:id="rId85">
+      <w:hyperlink r:id="rId91">
         <w:r>
           <w:rPr>
             <w:rStyle w:val="Hyperlink"/>
@@ -8995,8 +9858,8 @@
         <w:t xml:space="preserve">.</w:t>
       </w:r>
     </w:p>
-    <w:bookmarkEnd w:id="86"/>
-    <w:bookmarkStart w:id="88" w:name="ref-gispert_ontologiaativos_2025"/>
+    <w:bookmarkEnd w:id="92"/>
+    <w:bookmarkStart w:id="94" w:name="ref-gispert_ontologiaativos_2025"/>
     <w:p>
       <w:pPr>
         <w:pStyle w:val="Bibliography"/>
@@ -9029,7 +9892,7 @@
       <w:r>
         <w:t xml:space="preserve"> </w:t>
       </w:r>
-      <w:hyperlink r:id="rId87">
+      <w:hyperlink r:id="rId93">
         <w:r>
           <w:rPr>
             <w:rStyle w:val="Hyperlink"/>
@@ -9041,8 +9904,8 @@
         <w:t xml:space="preserve">.</w:t>
       </w:r>
     </w:p>
-    <w:bookmarkEnd w:id="88"/>
-    <w:bookmarkStart w:id="90" w:name="ref-ferreira_manutencaoceramica_2020"/>
+    <w:bookmarkEnd w:id="94"/>
+    <w:bookmarkStart w:id="96" w:name="ref-ferreira_manutencaoceramica_2020"/>
     <w:p>
       <w:pPr>
         <w:pStyle w:val="Bibliography"/>
@@ -9075,7 +9938,7 @@
       <w:r>
         <w:t xml:space="preserve"> </w:t>
       </w:r>
-      <w:hyperlink r:id="rId89">
+      <w:hyperlink r:id="rId95">
         <w:r>
           <w:rPr>
             <w:rStyle w:val="Hyperlink"/>
@@ -9087,8 +9950,8 @@
         <w:t xml:space="preserve">.</w:t>
       </w:r>
     </w:p>
-    <w:bookmarkEnd w:id="90"/>
-    <w:bookmarkStart w:id="92" w:name="ref-goretti_bimoem_2023"/>
+    <w:bookmarkEnd w:id="96"/>
+    <w:bookmarkStart w:id="98" w:name="ref-goretti_bimoem_2023"/>
     <w:p>
       <w:pPr>
         <w:pStyle w:val="Bibliography"/>
@@ -9121,7 +9984,7 @@
       <w:r>
         <w:t xml:space="preserve"> </w:t>
       </w:r>
-      <w:hyperlink r:id="rId91">
+      <w:hyperlink r:id="rId97">
         <w:r>
           <w:rPr>
             <w:rStyle w:val="Hyperlink"/>
@@ -9133,8 +9996,8 @@
         <w:t xml:space="preserve">.</w:t>
       </w:r>
     </w:p>
-    <w:bookmarkEnd w:id="92"/>
-    <w:bookmarkStart w:id="94" w:name="ref-hu_revisao_sintese_2026"/>
+    <w:bookmarkEnd w:id="98"/>
+    <w:bookmarkStart w:id="100" w:name="ref-hu_revisao_sintese_2026"/>
     <w:p>
       <w:pPr>
         <w:pStyle w:val="Bibliography"/>
@@ -9167,7 +10030,7 @@
       <w:r>
         <w:t xml:space="preserve"> </w:t>
       </w:r>
-      <w:hyperlink r:id="rId93">
+      <w:hyperlink r:id="rId99">
         <w:r>
           <w:rPr>
             <w:rStyle w:val="Hyperlink"/>
@@ -9179,8 +10042,8 @@
         <w:t xml:space="preserve">.</w:t>
       </w:r>
     </w:p>
-    <w:bookmarkEnd w:id="94"/>
-    <w:bookmarkStart w:id="96" w:name="ref-jiang_deduplicacao_regras_2014"/>
+    <w:bookmarkEnd w:id="100"/>
+    <w:bookmarkStart w:id="102" w:name="ref-jiang_deduplicacao_regras_2014"/>
     <w:p>
       <w:pPr>
         <w:pStyle w:val="Bibliography"/>
@@ -9213,7 +10076,7 @@
       <w:r>
         <w:t xml:space="preserve"> </w:t>
       </w:r>
-      <w:hyperlink r:id="rId95">
+      <w:hyperlink r:id="rId101">
         <w:r>
           <w:rPr>
             <w:rStyle w:val="Hyperlink"/>
@@ -9225,8 +10088,8 @@
         <w:t xml:space="preserve">.</w:t>
       </w:r>
     </w:p>
-    <w:bookmarkEnd w:id="96"/>
-    <w:bookmarkStart w:id="98" w:name="ref-kim_estimativacustoseducacional_2018"/>
+    <w:bookmarkEnd w:id="102"/>
+    <w:bookmarkStart w:id="104" w:name="ref-kim_estimativacustoseducacional_2018"/>
     <w:p>
       <w:pPr>
         <w:pStyle w:val="Bibliography"/>
@@ -9259,7 +10122,7 @@
       <w:r>
         <w:t xml:space="preserve"> </w:t>
       </w:r>
-      <w:hyperlink r:id="rId97">
+      <w:hyperlink r:id="rId103">
         <w:r>
           <w:rPr>
             <w:rStyle w:val="Hyperlink"/>
@@ -9271,20 +10134,20 @@
         <w:t xml:space="preserve">.</w:t>
       </w:r>
     </w:p>
-    <w:bookmarkEnd w:id="98"/>
-    <w:bookmarkStart w:id="100" w:name="ref-martins_custosmanutencaoses_2024"/>
+    <w:bookmarkEnd w:id="104"/>
+    <w:bookmarkStart w:id="105" w:name="ref-lateef_manutencaouniversidade_2010"/>
     <w:p>
       <w:pPr>
         <w:pStyle w:val="Bibliography"/>
       </w:pPr>
       <w:r>
-        <w:t xml:space="preserve">Martins, Rafael Fernando Batista, and Márcia Maria dos Santos Bortolocci Espejo. 2024.</w:t>
-      </w:r>
-      <w:r>
-        <w:t xml:space="preserve"> </w:t>
-      </w:r>
-      <w:r>
-        <w:t xml:space="preserve">“Análise de Custos de Manutenção Predial Em Uma Universidade Federal Brasileira Com Uso Do Modelo de Suavização Exponencial Simples.”</w:t>
+        <w:t xml:space="preserve">Lateef, Olanrewaju Abdul, Mohd Faris Khamidi, and Arazi Idrus. 2010.</w:t>
+      </w:r>
+      <w:r>
+        <w:t xml:space="preserve"> </w:t>
+      </w:r>
+      <w:r>
+        <w:t xml:space="preserve">“Building Maintenance Management in a Malaysian University Campuses: A Case Study.”</w:t>
       </w:r>
       <w:r>
         <w:t xml:space="preserve"> </w:t>
@@ -9294,6 +10157,70 @@
           <w:iCs/>
           <w:i/>
         </w:rPr>
+        <w:t xml:space="preserve">Australasian Journal of Construction Economics and Building</w:t>
+      </w:r>
+      <w:r>
+        <w:t xml:space="preserve"> </w:t>
+      </w:r>
+      <w:r>
+        <w:t xml:space="preserve">10 (1/2): 76–89.</w:t>
+      </w:r>
+    </w:p>
+    <w:bookmarkEnd w:id="105"/>
+    <w:bookmarkStart w:id="106" w:name="ref-maia_gestaoinformacaomanutencao_2016"/>
+    <w:p>
+      <w:pPr>
+        <w:pStyle w:val="Bibliography"/>
+      </w:pPr>
+      <w:r>
+        <w:t xml:space="preserve">Maia, Barbara Lepca, Sérgio Scheer, and Maria do Carmo Duarte Freitas. 2016.</w:t>
+      </w:r>
+      <w:r>
+        <w:t xml:space="preserve"> </w:t>
+      </w:r>
+      <w:r>
+        <w:t xml:space="preserve">“Manutenção Predial: A Prospecta de Decisões a Partir Da Gestão Da Informação.”</w:t>
+      </w:r>
+      <w:r>
+        <w:t xml:space="preserve"> </w:t>
+      </w:r>
+      <w:r>
+        <w:rPr>
+          <w:iCs/>
+          <w:i/>
+        </w:rPr>
+        <w:t xml:space="preserve">Revista de Engenharia e Tecnologia</w:t>
+      </w:r>
+      <w:r>
+        <w:t xml:space="preserve"> </w:t>
+      </w:r>
+      <w:r>
+        <w:t xml:space="preserve">8 (3): 37–55.</w:t>
+      </w:r>
+    </w:p>
+    <w:bookmarkEnd w:id="106"/>
+    <w:bookmarkStart w:id="108" w:name="ref-martins_custosmanutencaoses_2024"/>
+    <w:p>
+      <w:pPr>
+        <w:pStyle w:val="Bibliography"/>
+      </w:pPr>
+      <w:r>
+        <w:t xml:space="preserve">Martins, Rafael Fernando Batista, and Márcia Maria dos Santos Bortolocci Espejo. 2024.</w:t>
+      </w:r>
+      <w:r>
+        <w:t xml:space="preserve"> </w:t>
+      </w:r>
+      <w:r>
+        <w:t xml:space="preserve">“Análise de Custos de Manutenção Predial Em Uma Universidade Federal Brasileira Com Uso Do Modelo de Suavização Exponencial Simples.”</w:t>
+      </w:r>
+      <w:r>
+        <w:t xml:space="preserve"> </w:t>
+      </w:r>
+      <w:r>
+        <w:rPr>
+          <w:iCs/>
+          <w:i/>
+        </w:rPr>
         <w:t xml:space="preserve">ABCustos</w:t>
       </w:r>
       <w:r>
@@ -9305,7 +10232,7 @@
       <w:r>
         <w:t xml:space="preserve"> </w:t>
       </w:r>
-      <w:hyperlink r:id="rId99">
+      <w:hyperlink r:id="rId107">
         <w:r>
           <w:rPr>
             <w:rStyle w:val="Hyperlink"/>
@@ -9317,8 +10244,8 @@
         <w:t xml:space="preserve">.</w:t>
       </w:r>
     </w:p>
-    <w:bookmarkEnd w:id="100"/>
-    <w:bookmarkStart w:id="102" w:name="ref-masmoudi_ahptopsis_2026"/>
+    <w:bookmarkEnd w:id="108"/>
+    <w:bookmarkStart w:id="110" w:name="ref-masmoudi_ahptopsis_2026"/>
     <w:p>
       <w:pPr>
         <w:pStyle w:val="Bibliography"/>
@@ -9351,7 +10278,7 @@
       <w:r>
         <w:t xml:space="preserve"> </w:t>
       </w:r>
-      <w:hyperlink r:id="rId101">
+      <w:hyperlink r:id="rId109">
         <w:r>
           <w:rPr>
             <w:rStyle w:val="Hyperlink"/>
@@ -9363,8 +10290,8 @@
         <w:t xml:space="preserve">.</w:t>
       </w:r>
     </w:p>
-    <w:bookmarkEnd w:id="102"/>
-    <w:bookmarkStart w:id="104" w:name="ref-morais_eficienciamanutencao_2023"/>
+    <w:bookmarkEnd w:id="110"/>
+    <w:bookmarkStart w:id="112" w:name="ref-morais_eficienciamanutencao_2023"/>
     <w:p>
       <w:pPr>
         <w:pStyle w:val="Bibliography"/>
@@ -9397,7 +10324,7 @@
       <w:r>
         <w:t xml:space="preserve"> </w:t>
       </w:r>
-      <w:hyperlink r:id="rId103">
+      <w:hyperlink r:id="rId111">
         <w:r>
           <w:rPr>
             <w:rStyle w:val="Hyperlink"/>
@@ -9409,20 +10336,20 @@
         <w:t xml:space="preserve">.</w:t>
       </w:r>
     </w:p>
-    <w:bookmarkEnd w:id="104"/>
-    <w:bookmarkStart w:id="106" w:name="ref-nageli_ciclovida_2019"/>
+    <w:bookmarkEnd w:id="112"/>
+    <w:bookmarkStart w:id="114" w:name="ref-motuziene_ventilacaoia_2025"/>
     <w:p>
       <w:pPr>
         <w:pStyle w:val="Bibliography"/>
       </w:pPr>
       <w:r>
-        <w:t xml:space="preserve">Nägeli, Claudio, Abolfazl Farahani, Magnus Österbring, Jan-Olof Dalenbäck, and Holger Wallbaum. 2019.</w:t>
-      </w:r>
-      <w:r>
-        <w:t xml:space="preserve"> </w:t>
-      </w:r>
-      <w:r>
-        <w:t xml:space="preserve">“A Service-Life Cycle Approach to Maintenance and Energy Retrofit Planning for Building Portfolios.”</w:t>
+        <w:t xml:space="preserve">Motuzienė, Violeta, Jonas Bielskus, Rasa Džiugaitė-Tumėnienė, and Vidas Raudonis. 2025.</w:t>
+      </w:r>
+      <w:r>
+        <w:t xml:space="preserve"> </w:t>
+      </w:r>
+      <w:r>
+        <w:t xml:space="preserve">“Occupancy-Based Predictive AI-Driven Ventilation Control for Energy Savings in Office Buildings.”</w:t>
       </w:r>
       <w:r>
         <w:t xml:space="preserve"> </w:t>
@@ -9432,6 +10359,52 @@
           <w:iCs/>
           <w:i/>
         </w:rPr>
+        <w:t xml:space="preserve">Sustainability</w:t>
+      </w:r>
+      <w:r>
+        <w:t xml:space="preserve"> </w:t>
+      </w:r>
+      <w:r>
+        <w:t xml:space="preserve">17 (9): 4140.</w:t>
+      </w:r>
+      <w:r>
+        <w:t xml:space="preserve"> </w:t>
+      </w:r>
+      <w:hyperlink r:id="rId113">
+        <w:r>
+          <w:rPr>
+            <w:rStyle w:val="Hyperlink"/>
+          </w:rPr>
+          <w:t xml:space="preserve">https://doi.org/10.3390/su17094140</w:t>
+        </w:r>
+      </w:hyperlink>
+      <w:r>
+        <w:t xml:space="preserve">.</w:t>
+      </w:r>
+    </w:p>
+    <w:bookmarkEnd w:id="114"/>
+    <w:bookmarkStart w:id="116" w:name="ref-nageli_ciclovida_2019"/>
+    <w:p>
+      <w:pPr>
+        <w:pStyle w:val="Bibliography"/>
+      </w:pPr>
+      <w:r>
+        <w:t xml:space="preserve">Nägeli, Claudio, Abolfazl Farahani, Magnus Österbring, Jan-Olof Dalenbäck, and Holger Wallbaum. 2019.</w:t>
+      </w:r>
+      <w:r>
+        <w:t xml:space="preserve"> </w:t>
+      </w:r>
+      <w:r>
+        <w:t xml:space="preserve">“A Service-Life Cycle Approach to Maintenance and Energy Retrofit Planning for Building Portfolios.”</w:t>
+      </w:r>
+      <w:r>
+        <w:t xml:space="preserve"> </w:t>
+      </w:r>
+      <w:r>
+        <w:rPr>
+          <w:iCs/>
+          <w:i/>
+        </w:rPr>
         <w:t xml:space="preserve">Building and Environment</w:t>
       </w:r>
       <w:r>
@@ -9443,7 +10416,7 @@
       <w:r>
         <w:t xml:space="preserve"> </w:t>
       </w:r>
-      <w:hyperlink r:id="rId105">
+      <w:hyperlink r:id="rId115">
         <w:r>
           <w:rPr>
             <w:rStyle w:val="Hyperlink"/>
@@ -9455,8 +10428,8 @@
         <w:t xml:space="preserve">.</w:t>
       </w:r>
     </w:p>
-    <w:bookmarkEnd w:id="106"/>
-    <w:bookmarkStart w:id="108" w:name="ref-naji_campusdelphi_2023"/>
+    <w:bookmarkEnd w:id="116"/>
+    <w:bookmarkStart w:id="118" w:name="ref-naji_campusdelphi_2023"/>
     <w:p>
       <w:pPr>
         <w:pStyle w:val="Bibliography"/>
@@ -9489,7 +10462,7 @@
       <w:r>
         <w:t xml:space="preserve"> </w:t>
       </w:r>
-      <w:hyperlink r:id="rId107">
+      <w:hyperlink r:id="rId117">
         <w:r>
           <w:rPr>
             <w:rStyle w:val="Hyperlink"/>
@@ -9501,8 +10474,8 @@
         <w:t xml:space="preserve">.</w:t>
       </w:r>
     </w:p>
-    <w:bookmarkEnd w:id="108"/>
-    <w:bookmarkStart w:id="110" w:name="X29a0b815a0fa8c82998c6fb0764f2ef94fd929e"/>
+    <w:bookmarkEnd w:id="118"/>
+    <w:bookmarkStart w:id="120" w:name="X29a0b815a0fa8c82998c6fb0764f2ef94fd929e"/>
     <w:p>
       <w:pPr>
         <w:pStyle w:val="Bibliography"/>
@@ -9535,7 +10508,7 @@
       <w:r>
         <w:t xml:space="preserve"> </w:t>
       </w:r>
-      <w:hyperlink r:id="rId109">
+      <w:hyperlink r:id="rId119">
         <w:r>
           <w:rPr>
             <w:rStyle w:val="Hyperlink"/>
@@ -9547,8 +10520,8 @@
         <w:t xml:space="preserve">.</w:t>
       </w:r>
     </w:p>
-    <w:bookmarkEnd w:id="110"/>
-    <w:bookmarkStart w:id="112" w:name="ref-nielsen_sustentabilidadefm_2016"/>
+    <w:bookmarkEnd w:id="120"/>
+    <w:bookmarkStart w:id="122" w:name="ref-nielsen_sustentabilidadefm_2016"/>
     <w:p>
       <w:pPr>
         <w:pStyle w:val="Bibliography"/>
@@ -9581,7 +10554,7 @@
       <w:r>
         <w:t xml:space="preserve"> </w:t>
       </w:r>
-      <w:hyperlink r:id="rId111">
+      <w:hyperlink r:id="rId121">
         <w:r>
           <w:rPr>
             <w:rStyle w:val="Hyperlink"/>
@@ -9593,8 +10566,8 @@
         <w:t xml:space="preserve">.</w:t>
       </w:r>
     </w:p>
-    <w:bookmarkEnd w:id="112"/>
-    <w:bookmarkStart w:id="114" w:name="ref-okoro_sustainablefm_2023"/>
+    <w:bookmarkEnd w:id="122"/>
+    <w:bookmarkStart w:id="124" w:name="ref-okoro_sustainablefm_2023"/>
     <w:p>
       <w:pPr>
         <w:pStyle w:val="Bibliography"/>
@@ -9627,7 +10600,7 @@
       <w:r>
         <w:t xml:space="preserve"> </w:t>
       </w:r>
-      <w:hyperlink r:id="rId113">
+      <w:hyperlink r:id="rId123">
         <w:r>
           <w:rPr>
             <w:rStyle w:val="Hyperlink"/>
@@ -9639,8 +10612,8 @@
         <w:t xml:space="preserve">.</w:t>
       </w:r>
     </w:p>
-    <w:bookmarkEnd w:id="114"/>
-    <w:bookmarkStart w:id="116" w:name="ref-opoku_futurofm_2022"/>
+    <w:bookmarkEnd w:id="124"/>
+    <w:bookmarkStart w:id="126" w:name="ref-opoku_futurofm_2022"/>
     <w:p>
       <w:pPr>
         <w:pStyle w:val="Bibliography"/>
@@ -9673,7 +10646,7 @@
       <w:r>
         <w:t xml:space="preserve"> </w:t>
       </w:r>
-      <w:hyperlink r:id="rId115">
+      <w:hyperlink r:id="rId125">
         <w:r>
           <w:rPr>
             <w:rStyle w:val="Hyperlink"/>
@@ -9685,8 +10658,8 @@
         <w:t xml:space="preserve">.</w:t>
       </w:r>
     </w:p>
-    <w:bookmarkEnd w:id="116"/>
-    <w:bookmarkStart w:id="118" w:name="ref-othman_manutenibilidadeesi_2023"/>
+    <w:bookmarkEnd w:id="126"/>
+    <w:bookmarkStart w:id="128" w:name="ref-othman_manutenibilidadeesi_2023"/>
     <w:p>
       <w:pPr>
         <w:pStyle w:val="Bibliography"/>
@@ -9719,7 +10692,7 @@
       <w:r>
         <w:t xml:space="preserve"> </w:t>
       </w:r>
-      <w:hyperlink r:id="rId117">
+      <w:hyperlink r:id="rId127">
         <w:r>
           <w:rPr>
             <w:rStyle w:val="Hyperlink"/>
@@ -9731,8 +10704,8 @@
         <w:t xml:space="preserve">.</w:t>
       </w:r>
     </w:p>
-    <w:bookmarkEnd w:id="118"/>
-    <w:bookmarkStart w:id="120" w:name="ref-park_cbrfuzzyahp_2019"/>
+    <w:bookmarkEnd w:id="128"/>
+    <w:bookmarkStart w:id="130" w:name="ref-park_cbrfuzzyahp_2019"/>
     <w:p>
       <w:pPr>
         <w:pStyle w:val="Bibliography"/>
@@ -9765,7 +10738,7 @@
       <w:r>
         <w:t xml:space="preserve"> </w:t>
       </w:r>
-      <w:hyperlink r:id="rId119">
+      <w:hyperlink r:id="rId129">
         <w:r>
           <w:rPr>
             <w:rStyle w:val="Hyperlink"/>
@@ -9777,8 +10750,8 @@
         <w:t xml:space="preserve">.</w:t>
       </w:r>
     </w:p>
-    <w:bookmarkEnd w:id="120"/>
-    <w:bookmarkStart w:id="122" w:name="ref-ramantswana_esgfm_2026"/>
+    <w:bookmarkEnd w:id="130"/>
+    <w:bookmarkStart w:id="132" w:name="ref-ramantswana_esgfm_2026"/>
     <w:p>
       <w:pPr>
         <w:pStyle w:val="Bibliography"/>
@@ -9811,7 +10784,7 @@
       <w:r>
         <w:t xml:space="preserve"> </w:t>
       </w:r>
-      <w:hyperlink r:id="rId121">
+      <w:hyperlink r:id="rId131">
         <w:r>
           <w:rPr>
             <w:rStyle w:val="Hyperlink"/>
@@ -9823,8 +10796,8 @@
         <w:t xml:space="preserve">.</w:t>
       </w:r>
     </w:p>
-    <w:bookmarkEnd w:id="122"/>
-    <w:bookmarkStart w:id="124" w:name="ref-rathbone_deduplicacao_2015"/>
+    <w:bookmarkEnd w:id="132"/>
+    <w:bookmarkStart w:id="134" w:name="ref-rathbone_deduplicacao_2015"/>
     <w:p>
       <w:pPr>
         <w:pStyle w:val="Bibliography"/>
@@ -9857,7 +10830,7 @@
       <w:r>
         <w:t xml:space="preserve"> </w:t>
       </w:r>
-      <w:hyperlink r:id="rId123">
+      <w:hyperlink r:id="rId133">
         <w:r>
           <w:rPr>
             <w:rStyle w:val="Hyperlink"/>
@@ -9869,8 +10842,8 @@
         <w:t xml:space="preserve">.</w:t>
       </w:r>
     </w:p>
-    <w:bookmarkEnd w:id="124"/>
-    <w:bookmarkStart w:id="126" w:name="ref-snyder_revisaometodologia_2019"/>
+    <w:bookmarkEnd w:id="134"/>
+    <w:bookmarkStart w:id="136" w:name="ref-snyder_revisaometodologia_2019"/>
     <w:p>
       <w:pPr>
         <w:pStyle w:val="Bibliography"/>
@@ -9903,7 +10876,7 @@
       <w:r>
         <w:t xml:space="preserve"> </w:t>
       </w:r>
-      <w:hyperlink r:id="rId125">
+      <w:hyperlink r:id="rId135">
         <w:r>
           <w:rPr>
             <w:rStyle w:val="Hyperlink"/>
@@ -9915,20 +10888,20 @@
         <w:t xml:space="preserve">.</w:t>
       </w:r>
     </w:p>
-    <w:bookmarkEnd w:id="126"/>
-    <w:bookmarkStart w:id="128" w:name="ref-talib_hospitalfm_2013"/>
+    <w:bookmarkEnd w:id="136"/>
+    <w:bookmarkStart w:id="138" w:name="ref-suh_demandaenergiaagua_2012"/>
     <w:p>
       <w:pPr>
         <w:pStyle w:val="Bibliography"/>
       </w:pPr>
       <w:r>
-        <w:t xml:space="preserve">Talib, Yuhainis, Priyadarsini Rajagopalan, and Jay Yang. 2013.</w:t>
-      </w:r>
-      <w:r>
-        <w:t xml:space="preserve"> </w:t>
-      </w:r>
-      <w:r>
-        <w:t xml:space="preserve">“Evaluation of Building Performance for Strategic Facilities Management in Healthcare: A Case Study of a Public Hospital in Australia.”</w:t>
+        <w:t xml:space="preserve">Suh, Dongjun, and Seongju Chang. 2012.</w:t>
+      </w:r>
+      <w:r>
+        <w:t xml:space="preserve"> </w:t>
+      </w:r>
+      <w:r>
+        <w:t xml:space="preserve">“An Energy and Water Resource Demand Estimation Model for Multi-Family Housing Complexes in Korea.”</w:t>
       </w:r>
       <w:r>
         <w:t xml:space="preserve"> </w:t>
@@ -9938,6 +10911,52 @@
           <w:iCs/>
           <w:i/>
         </w:rPr>
+        <w:t xml:space="preserve">Energies</w:t>
+      </w:r>
+      <w:r>
+        <w:t xml:space="preserve"> </w:t>
+      </w:r>
+      <w:r>
+        <w:t xml:space="preserve">5 (11): 4497–4516.</w:t>
+      </w:r>
+      <w:r>
+        <w:t xml:space="preserve"> </w:t>
+      </w:r>
+      <w:hyperlink r:id="rId137">
+        <w:r>
+          <w:rPr>
+            <w:rStyle w:val="Hyperlink"/>
+          </w:rPr>
+          <w:t xml:space="preserve">https://doi.org/10.3390/en5114497</w:t>
+        </w:r>
+      </w:hyperlink>
+      <w:r>
+        <w:t xml:space="preserve">.</w:t>
+      </w:r>
+    </w:p>
+    <w:bookmarkEnd w:id="138"/>
+    <w:bookmarkStart w:id="140" w:name="ref-talib_hospitalfm_2013"/>
+    <w:p>
+      <w:pPr>
+        <w:pStyle w:val="Bibliography"/>
+      </w:pPr>
+      <w:r>
+        <w:t xml:space="preserve">Talib, Yuhainis, Priyadarsini Rajagopalan, and Jay Yang. 2013.</w:t>
+      </w:r>
+      <w:r>
+        <w:t xml:space="preserve"> </w:t>
+      </w:r>
+      <w:r>
+        <w:t xml:space="preserve">“Evaluation of Building Performance for Strategic Facilities Management in Healthcare: A Case Study of a Public Hospital in Australia.”</w:t>
+      </w:r>
+      <w:r>
+        <w:t xml:space="preserve"> </w:t>
+      </w:r>
+      <w:r>
+        <w:rPr>
+          <w:iCs/>
+          <w:i/>
+        </w:rPr>
         <w:t xml:space="preserve">Facilities</w:t>
       </w:r>
       <w:r>
@@ -9949,7 +10968,7 @@
       <w:r>
         <w:t xml:space="preserve"> </w:t>
       </w:r>
-      <w:hyperlink r:id="rId127">
+      <w:hyperlink r:id="rId139">
         <w:r>
           <w:rPr>
             <w:rStyle w:val="Hyperlink"/>
@@ -9961,8 +10980,8 @@
         <w:t xml:space="preserve">.</w:t>
       </w:r>
     </w:p>
-    <w:bookmarkEnd w:id="128"/>
-    <w:bookmarkStart w:id="130" w:name="ref-tan_fluxoinformacao_2018"/>
+    <w:bookmarkEnd w:id="140"/>
+    <w:bookmarkStart w:id="142" w:name="ref-tan_fluxoinformacao_2018"/>
     <w:p>
       <w:pPr>
         <w:pStyle w:val="Bibliography"/>
@@ -9995,7 +11014,7 @@
       <w:r>
         <w:t xml:space="preserve"> </w:t>
       </w:r>
-      <w:hyperlink r:id="rId129">
+      <w:hyperlink r:id="rId141">
         <w:r>
           <w:rPr>
             <w:rStyle w:val="Hyperlink"/>
@@ -10007,8 +11026,8 @@
         <w:t xml:space="preserve">.</w:t>
       </w:r>
     </w:p>
-    <w:bookmarkEnd w:id="130"/>
-    <w:bookmarkStart w:id="132" w:name="ref-whittemore_revisaointegrativa_2005"/>
+    <w:bookmarkEnd w:id="142"/>
+    <w:bookmarkStart w:id="144" w:name="ref-whittemore_revisaointegrativa_2005"/>
     <w:p>
       <w:pPr>
         <w:pStyle w:val="Bibliography"/>
@@ -10041,7 +11060,7 @@
       <w:r>
         <w:t xml:space="preserve"> </w:t>
       </w:r>
-      <w:hyperlink r:id="rId131">
+      <w:hyperlink r:id="rId143">
         <w:r>
           <w:rPr>
             <w:rStyle w:val="Hyperlink"/>
@@ -10053,20 +11072,20 @@
         <w:t xml:space="preserve">.</w:t>
       </w:r>
     </w:p>
-    <w:bookmarkEnd w:id="132"/>
-    <w:bookmarkStart w:id="134" w:name="ref-yoon_fuzzyfm_2018"/>
+    <w:bookmarkEnd w:id="144"/>
+    <w:bookmarkStart w:id="146" w:name="ref-wu_gnnvidautil_2025"/>
     <w:p>
       <w:pPr>
         <w:pStyle w:val="Bibliography"/>
       </w:pPr>
       <w:r>
-        <w:t xml:space="preserve">Yoon, Jong Han, and Hee Sung Cha. 2018.</w:t>
-      </w:r>
-      <w:r>
-        <w:t xml:space="preserve"> </w:t>
-      </w:r>
-      <w:r>
-        <w:t xml:space="preserve">“Optimal FM Strategy for Commercial Office Buildings Using Fuzzy Synthetic Evaluation.”</w:t>
+        <w:t xml:space="preserve">Wu, Pei-Yu, and S. Olof Mundt-Petersen. 2025.</w:t>
+      </w:r>
+      <w:r>
+        <w:t xml:space="preserve"> </w:t>
+      </w:r>
+      <w:r>
+        <w:t xml:space="preserve">“Empirical Quantification and Prediction of Building Component Lifespans with Graph Neural Networks.”</w:t>
       </w:r>
       <w:r>
         <w:t xml:space="preserve"> </w:t>
@@ -10076,6 +11095,52 @@
           <w:iCs/>
           <w:i/>
         </w:rPr>
+        <w:t xml:space="preserve">IOP Conference Series: Earth and Environmental Science</w:t>
+      </w:r>
+      <w:r>
+        <w:t xml:space="preserve"> </w:t>
+      </w:r>
+      <w:r>
+        <w:t xml:space="preserve">1554: 012036.</w:t>
+      </w:r>
+      <w:r>
+        <w:t xml:space="preserve"> </w:t>
+      </w:r>
+      <w:hyperlink r:id="rId145">
+        <w:r>
+          <w:rPr>
+            <w:rStyle w:val="Hyperlink"/>
+          </w:rPr>
+          <w:t xml:space="preserve">https://doi.org/10.1088/1755-1315/1554/1/012036</w:t>
+        </w:r>
+      </w:hyperlink>
+      <w:r>
+        <w:t xml:space="preserve">.</w:t>
+      </w:r>
+    </w:p>
+    <w:bookmarkEnd w:id="146"/>
+    <w:bookmarkStart w:id="148" w:name="ref-yoon_fuzzyfm_2018"/>
+    <w:p>
+      <w:pPr>
+        <w:pStyle w:val="Bibliography"/>
+      </w:pPr>
+      <w:r>
+        <w:t xml:space="preserve">Yoon, Jong Han, and Hee Sung Cha. 2018.</w:t>
+      </w:r>
+      <w:r>
+        <w:t xml:space="preserve"> </w:t>
+      </w:r>
+      <w:r>
+        <w:t xml:space="preserve">“Optimal FM Strategy for Commercial Office Buildings Using Fuzzy Synthetic Evaluation.”</w:t>
+      </w:r>
+      <w:r>
+        <w:t xml:space="preserve"> </w:t>
+      </w:r>
+      <w:r>
+        <w:rPr>
+          <w:iCs/>
+          <w:i/>
+        </w:rPr>
         <w:t xml:space="preserve">Journal of Performance of Constructed Facilities</w:t>
       </w:r>
       <w:r>
@@ -10087,7 +11152,7 @@
       <w:r>
         <w:t xml:space="preserve"> </w:t>
       </w:r>
-      <w:hyperlink r:id="rId133">
+      <w:hyperlink r:id="rId147">
         <w:r>
           <w:rPr>
             <w:rStyle w:val="Hyperlink"/>
@@ -10099,9 +11164,9 @@
         <w:t xml:space="preserve">.</w:t>
       </w:r>
     </w:p>
-    <w:bookmarkEnd w:id="134"/>
-    <w:bookmarkEnd w:id="135"/>
-    <w:bookmarkEnd w:id="136"/>
+    <w:bookmarkEnd w:id="148"/>
+    <w:bookmarkEnd w:id="149"/>
+    <w:bookmarkEnd w:id="150"/>
     <w:sectPr/>
   </w:body>
 </w:document>

</xml_diff>

<commit_message>
Corrige formatacao do Word para A4/margens/fonte/numeracao de linha
O gerador padrao (13_preparar_word.py, via Pandoc+LibreOffice) produzia
um .docx valido mas em pagina Carta (US Letter), margens de 1 polegada
e fonte Cambria/Calibri -- fora do formato exigido pela Ambiente
Construido (A4, margens 3cm superior/esquerda e 2cm inferior/direita,
Times New Roman, numeracao continua de linha), conferido diretamente no
template oficial da revista (Template AC-OTH.docx).

Adiciona scripts/python/ajustar_formato_word.py, que corrige essas
quatro propriedades de layout no .docx ja gerado, sem alterar texto,
tabelas, figuras ou referencias. Aplicado ao artigo.docx publicado
nesta branch.

Gera tambem artigo_anonimo.docx: mesma correcao de formato, aplicada
sobre uma copia com paragrafo de autoria removido e docProps limpos
(scripts/python/anonimizar_docx.py), para a avaliacao duplo-cega.
</commit_message>
<xml_diff>
--- a/artigo.docx
+++ b/artigo.docx
@@ -14800,12 +14800,13 @@
     </w:p>
     <w:sectPr>
       <w:type w:val="nextPage"/>
-      <w:pgSz w:w="12240" w:h="15840"/>
-      <w:pgMar w:left="1440" w:right="1440" w:gutter="0" w:header="0" w:top="1440" w:footer="0" w:bottom="1440"/>
+      <w:pgSz w:w="11906" w:h="16838"/>
+      <w:pgMar w:top="1701" w:right="1134" w:bottom="1134" w:left="1701" w:header="709" w:footer="709" w:gutter="0"/>
       <w:pgNumType w:fmt="decimal"/>
       <w:formProt w:val="false"/>
       <w:textDirection w:val="lrTb"/>
       <w:docGrid w:type="default" w:linePitch="100" w:charSpace="0"/>
+      <w:lnNumType w:countBy="1" w:restart="continuous"/>
     </w:sectPr>
   </w:body>
 </w:document>
@@ -14816,7 +14817,7 @@
   <w:docDefaults>
     <w:rPrDefault>
       <w:rPr>
-        <w:rFonts w:ascii="Cambria" w:hAnsi="Cambria" w:eastAsia="Cambria" w:cs="" w:asciiTheme="minorHAnsi" w:cstheme="minorBidi" w:eastAsiaTheme="minorHAnsi" w:hAnsiTheme="minorHAnsi"/>
+        <w:rFonts w:ascii="Times New Roman" w:hAnsi="Times New Roman" w:eastAsia="Times New Roman" w:cs="" w:asciiTheme="minorHAnsi" w:cstheme="minorBidi" w:eastAsiaTheme="minorHAnsi" w:hAnsiTheme="minorHAnsi"/>
         <w:sz w:val="24"/>
         <w:szCs w:val="24"/>
         <w:lang w:val="en-US" w:eastAsia="en-US" w:bidi="ar-SA"/>
@@ -14839,7 +14840,7 @@
       <w:jc w:val="start"/>
     </w:pPr>
     <w:rPr>
-      <w:rFonts w:ascii="Cambria" w:hAnsi="Cambria" w:eastAsia="Cambria" w:cs="" w:asciiTheme="minorHAnsi" w:cstheme="minorBidi" w:eastAsiaTheme="minorHAnsi" w:hAnsiTheme="minorHAnsi"/>
+      <w:rFonts w:ascii="Times New Roman" w:hAnsi="Times New Roman" w:eastAsia="Times New Roman" w:cs="" w:asciiTheme="minorHAnsi" w:cstheme="minorBidi" w:eastAsiaTheme="minorHAnsi" w:hAnsiTheme="minorHAnsi"/>
       <w:color w:val="auto"/>
       <w:kern w:val="0"/>
       <w:sz w:val="24"/>
@@ -14860,7 +14861,7 @@
       <w:outlineLvl w:val="0"/>
     </w:pPr>
     <w:rPr>
-      <w:rFonts w:ascii="Calibri" w:hAnsi="Calibri" w:eastAsia="" w:cs="" w:asciiTheme="majorHAnsi" w:cstheme="majorBidi" w:eastAsiaTheme="majorEastAsia" w:hAnsiTheme="majorHAnsi"/>
+      <w:rFonts w:ascii="Times New Roman" w:hAnsi="Times New Roman" w:eastAsia="Times New Roman" w:cs="" w:asciiTheme="majorHAnsi" w:cstheme="majorBidi" w:eastAsiaTheme="majorEastAsia" w:hAnsiTheme="majorHAnsi"/>
       <w:b/>
       <w:bCs/>
       <w:color w:themeColor="accent1" w:val="4F81BD"/>
@@ -14882,7 +14883,7 @@
       <w:outlineLvl w:val="1"/>
     </w:pPr>
     <w:rPr>
-      <w:rFonts w:ascii="Calibri" w:hAnsi="Calibri" w:eastAsia="" w:cs="" w:asciiTheme="majorHAnsi" w:cstheme="majorBidi" w:eastAsiaTheme="majorEastAsia" w:hAnsiTheme="majorHAnsi"/>
+      <w:rFonts w:ascii="Times New Roman" w:hAnsi="Times New Roman" w:eastAsia="Times New Roman" w:cs="" w:asciiTheme="majorHAnsi" w:cstheme="majorBidi" w:eastAsiaTheme="majorEastAsia" w:hAnsiTheme="majorHAnsi"/>
       <w:b/>
       <w:bCs/>
       <w:color w:themeColor="accent1" w:val="4F81BD"/>
@@ -14904,7 +14905,7 @@
       <w:outlineLvl w:val="2"/>
     </w:pPr>
     <w:rPr>
-      <w:rFonts w:ascii="Calibri" w:hAnsi="Calibri" w:eastAsia="" w:cs="" w:asciiTheme="majorHAnsi" w:cstheme="majorBidi" w:eastAsiaTheme="majorEastAsia" w:hAnsiTheme="majorHAnsi"/>
+      <w:rFonts w:ascii="Times New Roman" w:hAnsi="Times New Roman" w:eastAsia="Times New Roman" w:cs="" w:asciiTheme="majorHAnsi" w:cstheme="majorBidi" w:eastAsiaTheme="majorEastAsia" w:hAnsiTheme="majorHAnsi"/>
       <w:b/>
       <w:bCs/>
       <w:color w:themeColor="accent1" w:val="4F81BD"/>
@@ -14926,7 +14927,7 @@
       <w:outlineLvl w:val="3"/>
     </w:pPr>
     <w:rPr>
-      <w:rFonts w:ascii="Calibri" w:hAnsi="Calibri" w:eastAsia="" w:cs="" w:asciiTheme="majorHAnsi" w:cstheme="majorBidi" w:eastAsiaTheme="majorEastAsia" w:hAnsiTheme="majorHAnsi"/>
+      <w:rFonts w:ascii="Times New Roman" w:hAnsi="Times New Roman" w:eastAsia="Times New Roman" w:cs="" w:asciiTheme="majorHAnsi" w:cstheme="majorBidi" w:eastAsiaTheme="majorEastAsia" w:hAnsiTheme="majorHAnsi"/>
       <w:bCs/>
       <w:i/>
       <w:color w:themeColor="accent1" w:val="4F81BD"/>
@@ -14948,7 +14949,7 @@
       <w:outlineLvl w:val="4"/>
     </w:pPr>
     <w:rPr>
-      <w:rFonts w:ascii="Calibri" w:hAnsi="Calibri" w:eastAsia="" w:cs="" w:asciiTheme="majorHAnsi" w:cstheme="majorBidi" w:eastAsiaTheme="majorEastAsia" w:hAnsiTheme="majorHAnsi"/>
+      <w:rFonts w:ascii="Times New Roman" w:hAnsi="Times New Roman" w:eastAsia="Times New Roman" w:cs="" w:asciiTheme="majorHAnsi" w:cstheme="majorBidi" w:eastAsiaTheme="majorEastAsia" w:hAnsiTheme="majorHAnsi"/>
       <w:iCs/>
       <w:color w:themeColor="accent1" w:val="4F81BD"/>
       <w:sz w:val="24"/>
@@ -14969,7 +14970,7 @@
       <w:outlineLvl w:val="5"/>
     </w:pPr>
     <w:rPr>
-      <w:rFonts w:ascii="Calibri" w:hAnsi="Calibri" w:eastAsia="" w:cs="" w:asciiTheme="majorHAnsi" w:cstheme="majorBidi" w:eastAsiaTheme="majorEastAsia" w:hAnsiTheme="majorHAnsi"/>
+      <w:rFonts w:ascii="Times New Roman" w:hAnsi="Times New Roman" w:eastAsia="Times New Roman" w:cs="" w:asciiTheme="majorHAnsi" w:cstheme="majorBidi" w:eastAsiaTheme="majorEastAsia" w:hAnsiTheme="majorHAnsi"/>
       <w:color w:themeColor="accent1" w:val="4F81BD"/>
       <w:sz w:val="24"/>
       <w:szCs w:val="24"/>
@@ -14989,7 +14990,7 @@
       <w:outlineLvl w:val="6"/>
     </w:pPr>
     <w:rPr>
-      <w:rFonts w:ascii="Calibri" w:hAnsi="Calibri" w:eastAsia="" w:cs="" w:asciiTheme="majorHAnsi" w:cstheme="majorBidi" w:eastAsiaTheme="majorEastAsia" w:hAnsiTheme="majorHAnsi"/>
+      <w:rFonts w:ascii="Times New Roman" w:hAnsi="Times New Roman" w:eastAsia="Times New Roman" w:cs="" w:asciiTheme="majorHAnsi" w:cstheme="majorBidi" w:eastAsiaTheme="majorEastAsia" w:hAnsiTheme="majorHAnsi"/>
       <w:color w:themeColor="accent1" w:val="4F81BD"/>
       <w:sz w:val="24"/>
       <w:szCs w:val="24"/>
@@ -15009,7 +15010,7 @@
       <w:outlineLvl w:val="7"/>
     </w:pPr>
     <w:rPr>
-      <w:rFonts w:ascii="Calibri" w:hAnsi="Calibri" w:eastAsia="" w:cs="" w:asciiTheme="majorHAnsi" w:cstheme="majorBidi" w:eastAsiaTheme="majorEastAsia" w:hAnsiTheme="majorHAnsi"/>
+      <w:rFonts w:ascii="Times New Roman" w:hAnsi="Times New Roman" w:eastAsia="Times New Roman" w:cs="" w:asciiTheme="majorHAnsi" w:cstheme="majorBidi" w:eastAsiaTheme="majorEastAsia" w:hAnsiTheme="majorHAnsi"/>
       <w:color w:themeColor="accent1" w:val="4F81BD"/>
       <w:sz w:val="24"/>
       <w:szCs w:val="24"/>
@@ -15029,7 +15030,7 @@
       <w:outlineLvl w:val="8"/>
     </w:pPr>
     <w:rPr>
-      <w:rFonts w:ascii="Calibri" w:hAnsi="Calibri" w:eastAsia="" w:cs="" w:asciiTheme="majorHAnsi" w:cstheme="majorBidi" w:eastAsiaTheme="majorEastAsia" w:hAnsiTheme="majorHAnsi"/>
+      <w:rFonts w:ascii="Times New Roman" w:hAnsi="Times New Roman" w:eastAsia="Times New Roman" w:cs="" w:asciiTheme="majorHAnsi" w:cstheme="majorBidi" w:eastAsiaTheme="majorEastAsia" w:hAnsiTheme="majorHAnsi"/>
       <w:color w:themeColor="accent1" w:val="4F81BD"/>
       <w:sz w:val="24"/>
       <w:szCs w:val="24"/>
@@ -15351,7 +15352,7 @@
       <w:spacing w:before="240" w:after="120"/>
     </w:pPr>
     <w:rPr>
-      <w:rFonts w:ascii="Liberation Sans" w:hAnsi="Liberation Sans" w:eastAsia="DejaVu Sans" w:cs="DejaVu Sans"/>
+      <w:rFonts w:ascii="Times New Roman" w:hAnsi="Times New Roman" w:eastAsia="Times New Roman" w:cs="DejaVu Sans"/>
       <w:sz w:val="28"/>
       <w:szCs w:val="28"/>
     </w:rPr>
@@ -15422,7 +15423,7 @@
       <w:jc w:val="center"/>
     </w:pPr>
     <w:rPr>
-      <w:rFonts w:ascii="Calibri" w:hAnsi="Calibri" w:eastAsia="" w:cs="" w:asciiTheme="majorHAnsi" w:cstheme="majorBidi" w:eastAsiaTheme="majorEastAsia" w:hAnsiTheme="majorHAnsi"/>
+      <w:rFonts w:ascii="Times New Roman" w:hAnsi="Times New Roman" w:eastAsia="Times New Roman" w:cs="" w:asciiTheme="majorHAnsi" w:cstheme="majorBidi" w:eastAsiaTheme="majorEastAsia" w:hAnsiTheme="majorHAnsi"/>
       <w:b/>
       <w:bCs/>
       <w:color w:themeColor="accent1" w:themeShade="b5" w:val="345A8A"/>
@@ -15459,7 +15460,7 @@
       <w:jc w:val="center"/>
     </w:pPr>
     <w:rPr>
-      <w:rFonts w:ascii="Cambria" w:hAnsi="Cambria" w:eastAsia="Cambria" w:cs="" w:asciiTheme="minorHAnsi" w:cstheme="minorBidi" w:eastAsiaTheme="minorHAnsi" w:hAnsiTheme="minorHAnsi"/>
+      <w:rFonts w:ascii="Times New Roman" w:hAnsi="Times New Roman" w:eastAsia="Times New Roman" w:cs="" w:asciiTheme="minorHAnsi" w:cstheme="minorBidi" w:eastAsiaTheme="minorHAnsi" w:hAnsiTheme="minorHAnsi"/>
       <w:color w:val="auto"/>
       <w:kern w:val="0"/>
       <w:sz w:val="24"/>
@@ -15480,7 +15481,7 @@
       <w:jc w:val="center"/>
     </w:pPr>
     <w:rPr>
-      <w:rFonts w:ascii="Cambria" w:hAnsi="Cambria" w:eastAsia="Cambria" w:cs="" w:asciiTheme="minorHAnsi" w:cstheme="minorBidi" w:eastAsiaTheme="minorHAnsi" w:hAnsiTheme="minorHAnsi"/>
+      <w:rFonts w:ascii="Times New Roman" w:hAnsi="Times New Roman" w:eastAsia="Times New Roman" w:cs="" w:asciiTheme="minorHAnsi" w:cstheme="minorBidi" w:eastAsiaTheme="minorHAnsi" w:hAnsiTheme="minorHAnsi"/>
       <w:color w:val="auto"/>
       <w:kern w:val="0"/>
       <w:sz w:val="24"/>
@@ -15621,7 +15622,7 @@
       <w:outlineLvl w:val="9"/>
     </w:pPr>
     <w:rPr>
-      <w:rFonts w:ascii="Calibri" w:hAnsi="Calibri" w:eastAsia="" w:cs="" w:asciiTheme="majorHAnsi" w:cstheme="majorBidi" w:eastAsiaTheme="majorEastAsia" w:hAnsiTheme="majorHAnsi"/>
+      <w:rFonts w:ascii="Times New Roman" w:hAnsi="Times New Roman" w:eastAsia="Times New Roman" w:cs="" w:asciiTheme="majorHAnsi" w:cstheme="majorBidi" w:eastAsiaTheme="majorEastAsia" w:hAnsiTheme="majorHAnsi"/>
       <w:b w:val="false"/>
       <w:bCs w:val="false"/>
       <w:color w:themeColor="accent1" w:themeShade="bf" w:val="365F91"/>

</xml_diff>

<commit_message>
Atualiza Word (formatado) com o corte adicional de palavras
artigo.docx recompilado (6.890 palavras oficiais, Introducao a
Referencias, margem de 110 abaixo do limite de 7.000) e reformatado
para A4/margens/Times New Roman/numeracao de linha. artigo_anonimo.docx
regenerado a partir da mesma versao atualizada.

main_anonimo.pdf ainda reflete a contagem anterior (6.942 palavras);
sera atualizado se necessario.
</commit_message>
<xml_diff>
--- a/artigo.docx
+++ b/artigo.docx
@@ -14800,12 +14800,13 @@
     </w:p>
     <w:sectPr>
       <w:type w:val="nextPage"/>
-      <w:pgSz w:w="12240" w:h="15840"/>
-      <w:pgMar w:left="1440" w:right="1440" w:gutter="0" w:header="0" w:top="1440" w:footer="0" w:bottom="1440"/>
+      <w:pgSz w:w="11906" w:h="16838"/>
+      <w:pgMar w:top="1701" w:right="1134" w:bottom="1134" w:left="1701" w:header="709" w:footer="709" w:gutter="0"/>
       <w:pgNumType w:fmt="decimal"/>
       <w:formProt w:val="false"/>
       <w:textDirection w:val="lrTb"/>
       <w:docGrid w:type="default" w:linePitch="100" w:charSpace="0"/>
+      <w:lnNumType w:countBy="1" w:restart="continuous"/>
     </w:sectPr>
   </w:body>
 </w:document>
@@ -14816,7 +14817,7 @@
   <w:docDefaults>
     <w:rPrDefault>
       <w:rPr>
-        <w:rFonts w:ascii="Cambria" w:hAnsi="Cambria" w:eastAsia="Cambria" w:cs="" w:asciiTheme="minorHAnsi" w:cstheme="minorBidi" w:eastAsiaTheme="minorHAnsi" w:hAnsiTheme="minorHAnsi"/>
+        <w:rFonts w:ascii="Times New Roman" w:hAnsi="Times New Roman" w:eastAsia="Times New Roman" w:cs="" w:asciiTheme="minorHAnsi" w:cstheme="minorBidi" w:eastAsiaTheme="minorHAnsi" w:hAnsiTheme="minorHAnsi"/>
         <w:sz w:val="24"/>
         <w:szCs w:val="24"/>
         <w:lang w:val="en-US" w:eastAsia="en-US" w:bidi="ar-SA"/>
@@ -14839,7 +14840,7 @@
       <w:jc w:val="start"/>
     </w:pPr>
     <w:rPr>
-      <w:rFonts w:ascii="Cambria" w:hAnsi="Cambria" w:eastAsia="Cambria" w:cs="" w:asciiTheme="minorHAnsi" w:cstheme="minorBidi" w:eastAsiaTheme="minorHAnsi" w:hAnsiTheme="minorHAnsi"/>
+      <w:rFonts w:ascii="Times New Roman" w:hAnsi="Times New Roman" w:eastAsia="Times New Roman" w:cs="" w:asciiTheme="minorHAnsi" w:cstheme="minorBidi" w:eastAsiaTheme="minorHAnsi" w:hAnsiTheme="minorHAnsi"/>
       <w:color w:val="auto"/>
       <w:kern w:val="0"/>
       <w:sz w:val="24"/>
@@ -14860,7 +14861,7 @@
       <w:outlineLvl w:val="0"/>
     </w:pPr>
     <w:rPr>
-      <w:rFonts w:ascii="Calibri" w:hAnsi="Calibri" w:eastAsia="" w:cs="" w:asciiTheme="majorHAnsi" w:cstheme="majorBidi" w:eastAsiaTheme="majorEastAsia" w:hAnsiTheme="majorHAnsi"/>
+      <w:rFonts w:ascii="Times New Roman" w:hAnsi="Times New Roman" w:eastAsia="Times New Roman" w:cs="" w:asciiTheme="majorHAnsi" w:cstheme="majorBidi" w:eastAsiaTheme="majorEastAsia" w:hAnsiTheme="majorHAnsi"/>
       <w:b/>
       <w:bCs/>
       <w:color w:themeColor="accent1" w:val="4F81BD"/>
@@ -14882,7 +14883,7 @@
       <w:outlineLvl w:val="1"/>
     </w:pPr>
     <w:rPr>
-      <w:rFonts w:ascii="Calibri" w:hAnsi="Calibri" w:eastAsia="" w:cs="" w:asciiTheme="majorHAnsi" w:cstheme="majorBidi" w:eastAsiaTheme="majorEastAsia" w:hAnsiTheme="majorHAnsi"/>
+      <w:rFonts w:ascii="Times New Roman" w:hAnsi="Times New Roman" w:eastAsia="Times New Roman" w:cs="" w:asciiTheme="majorHAnsi" w:cstheme="majorBidi" w:eastAsiaTheme="majorEastAsia" w:hAnsiTheme="majorHAnsi"/>
       <w:b/>
       <w:bCs/>
       <w:color w:themeColor="accent1" w:val="4F81BD"/>
@@ -14904,7 +14905,7 @@
       <w:outlineLvl w:val="2"/>
     </w:pPr>
     <w:rPr>
-      <w:rFonts w:ascii="Calibri" w:hAnsi="Calibri" w:eastAsia="" w:cs="" w:asciiTheme="majorHAnsi" w:cstheme="majorBidi" w:eastAsiaTheme="majorEastAsia" w:hAnsiTheme="majorHAnsi"/>
+      <w:rFonts w:ascii="Times New Roman" w:hAnsi="Times New Roman" w:eastAsia="Times New Roman" w:cs="" w:asciiTheme="majorHAnsi" w:cstheme="majorBidi" w:eastAsiaTheme="majorEastAsia" w:hAnsiTheme="majorHAnsi"/>
       <w:b/>
       <w:bCs/>
       <w:color w:themeColor="accent1" w:val="4F81BD"/>
@@ -14926,7 +14927,7 @@
       <w:outlineLvl w:val="3"/>
     </w:pPr>
     <w:rPr>
-      <w:rFonts w:ascii="Calibri" w:hAnsi="Calibri" w:eastAsia="" w:cs="" w:asciiTheme="majorHAnsi" w:cstheme="majorBidi" w:eastAsiaTheme="majorEastAsia" w:hAnsiTheme="majorHAnsi"/>
+      <w:rFonts w:ascii="Times New Roman" w:hAnsi="Times New Roman" w:eastAsia="Times New Roman" w:cs="" w:asciiTheme="majorHAnsi" w:cstheme="majorBidi" w:eastAsiaTheme="majorEastAsia" w:hAnsiTheme="majorHAnsi"/>
       <w:bCs/>
       <w:i/>
       <w:color w:themeColor="accent1" w:val="4F81BD"/>
@@ -14948,7 +14949,7 @@
       <w:outlineLvl w:val="4"/>
     </w:pPr>
     <w:rPr>
-      <w:rFonts w:ascii="Calibri" w:hAnsi="Calibri" w:eastAsia="" w:cs="" w:asciiTheme="majorHAnsi" w:cstheme="majorBidi" w:eastAsiaTheme="majorEastAsia" w:hAnsiTheme="majorHAnsi"/>
+      <w:rFonts w:ascii="Times New Roman" w:hAnsi="Times New Roman" w:eastAsia="Times New Roman" w:cs="" w:asciiTheme="majorHAnsi" w:cstheme="majorBidi" w:eastAsiaTheme="majorEastAsia" w:hAnsiTheme="majorHAnsi"/>
       <w:iCs/>
       <w:color w:themeColor="accent1" w:val="4F81BD"/>
       <w:sz w:val="24"/>
@@ -14969,7 +14970,7 @@
       <w:outlineLvl w:val="5"/>
     </w:pPr>
     <w:rPr>
-      <w:rFonts w:ascii="Calibri" w:hAnsi="Calibri" w:eastAsia="" w:cs="" w:asciiTheme="majorHAnsi" w:cstheme="majorBidi" w:eastAsiaTheme="majorEastAsia" w:hAnsiTheme="majorHAnsi"/>
+      <w:rFonts w:ascii="Times New Roman" w:hAnsi="Times New Roman" w:eastAsia="Times New Roman" w:cs="" w:asciiTheme="majorHAnsi" w:cstheme="majorBidi" w:eastAsiaTheme="majorEastAsia" w:hAnsiTheme="majorHAnsi"/>
       <w:color w:themeColor="accent1" w:val="4F81BD"/>
       <w:sz w:val="24"/>
       <w:szCs w:val="24"/>
@@ -14989,7 +14990,7 @@
       <w:outlineLvl w:val="6"/>
     </w:pPr>
     <w:rPr>
-      <w:rFonts w:ascii="Calibri" w:hAnsi="Calibri" w:eastAsia="" w:cs="" w:asciiTheme="majorHAnsi" w:cstheme="majorBidi" w:eastAsiaTheme="majorEastAsia" w:hAnsiTheme="majorHAnsi"/>
+      <w:rFonts w:ascii="Times New Roman" w:hAnsi="Times New Roman" w:eastAsia="Times New Roman" w:cs="" w:asciiTheme="majorHAnsi" w:cstheme="majorBidi" w:eastAsiaTheme="majorEastAsia" w:hAnsiTheme="majorHAnsi"/>
       <w:color w:themeColor="accent1" w:val="4F81BD"/>
       <w:sz w:val="24"/>
       <w:szCs w:val="24"/>
@@ -15009,7 +15010,7 @@
       <w:outlineLvl w:val="7"/>
     </w:pPr>
     <w:rPr>
-      <w:rFonts w:ascii="Calibri" w:hAnsi="Calibri" w:eastAsia="" w:cs="" w:asciiTheme="majorHAnsi" w:cstheme="majorBidi" w:eastAsiaTheme="majorEastAsia" w:hAnsiTheme="majorHAnsi"/>
+      <w:rFonts w:ascii="Times New Roman" w:hAnsi="Times New Roman" w:eastAsia="Times New Roman" w:cs="" w:asciiTheme="majorHAnsi" w:cstheme="majorBidi" w:eastAsiaTheme="majorEastAsia" w:hAnsiTheme="majorHAnsi"/>
       <w:color w:themeColor="accent1" w:val="4F81BD"/>
       <w:sz w:val="24"/>
       <w:szCs w:val="24"/>
@@ -15029,7 +15030,7 @@
       <w:outlineLvl w:val="8"/>
     </w:pPr>
     <w:rPr>
-      <w:rFonts w:ascii="Calibri" w:hAnsi="Calibri" w:eastAsia="" w:cs="" w:asciiTheme="majorHAnsi" w:cstheme="majorBidi" w:eastAsiaTheme="majorEastAsia" w:hAnsiTheme="majorHAnsi"/>
+      <w:rFonts w:ascii="Times New Roman" w:hAnsi="Times New Roman" w:eastAsia="Times New Roman" w:cs="" w:asciiTheme="majorHAnsi" w:cstheme="majorBidi" w:eastAsiaTheme="majorEastAsia" w:hAnsiTheme="majorHAnsi"/>
       <w:color w:themeColor="accent1" w:val="4F81BD"/>
       <w:sz w:val="24"/>
       <w:szCs w:val="24"/>
@@ -15351,7 +15352,7 @@
       <w:spacing w:before="240" w:after="120"/>
     </w:pPr>
     <w:rPr>
-      <w:rFonts w:ascii="Liberation Sans" w:hAnsi="Liberation Sans" w:eastAsia="DejaVu Sans" w:cs="DejaVu Sans"/>
+      <w:rFonts w:ascii="Times New Roman" w:hAnsi="Times New Roman" w:eastAsia="Times New Roman" w:cs="DejaVu Sans"/>
       <w:sz w:val="28"/>
       <w:szCs w:val="28"/>
     </w:rPr>
@@ -15422,7 +15423,7 @@
       <w:jc w:val="center"/>
     </w:pPr>
     <w:rPr>
-      <w:rFonts w:ascii="Calibri" w:hAnsi="Calibri" w:eastAsia="" w:cs="" w:asciiTheme="majorHAnsi" w:cstheme="majorBidi" w:eastAsiaTheme="majorEastAsia" w:hAnsiTheme="majorHAnsi"/>
+      <w:rFonts w:ascii="Times New Roman" w:hAnsi="Times New Roman" w:eastAsia="Times New Roman" w:cs="" w:asciiTheme="majorHAnsi" w:cstheme="majorBidi" w:eastAsiaTheme="majorEastAsia" w:hAnsiTheme="majorHAnsi"/>
       <w:b/>
       <w:bCs/>
       <w:color w:themeColor="accent1" w:themeShade="b5" w:val="345A8A"/>
@@ -15459,7 +15460,7 @@
       <w:jc w:val="center"/>
     </w:pPr>
     <w:rPr>
-      <w:rFonts w:ascii="Cambria" w:hAnsi="Cambria" w:eastAsia="Cambria" w:cs="" w:asciiTheme="minorHAnsi" w:cstheme="minorBidi" w:eastAsiaTheme="minorHAnsi" w:hAnsiTheme="minorHAnsi"/>
+      <w:rFonts w:ascii="Times New Roman" w:hAnsi="Times New Roman" w:eastAsia="Times New Roman" w:cs="" w:asciiTheme="minorHAnsi" w:cstheme="minorBidi" w:eastAsiaTheme="minorHAnsi" w:hAnsiTheme="minorHAnsi"/>
       <w:color w:val="auto"/>
       <w:kern w:val="0"/>
       <w:sz w:val="24"/>
@@ -15480,7 +15481,7 @@
       <w:jc w:val="center"/>
     </w:pPr>
     <w:rPr>
-      <w:rFonts w:ascii="Cambria" w:hAnsi="Cambria" w:eastAsia="Cambria" w:cs="" w:asciiTheme="minorHAnsi" w:cstheme="minorBidi" w:eastAsiaTheme="minorHAnsi" w:hAnsiTheme="minorHAnsi"/>
+      <w:rFonts w:ascii="Times New Roman" w:hAnsi="Times New Roman" w:eastAsia="Times New Roman" w:cs="" w:asciiTheme="minorHAnsi" w:cstheme="minorBidi" w:eastAsiaTheme="minorHAnsi" w:hAnsiTheme="minorHAnsi"/>
       <w:color w:val="auto"/>
       <w:kern w:val="0"/>
       <w:sz w:val="24"/>
@@ -15621,7 +15622,7 @@
       <w:outlineLvl w:val="9"/>
     </w:pPr>
     <w:rPr>
-      <w:rFonts w:ascii="Calibri" w:hAnsi="Calibri" w:eastAsia="" w:cs="" w:asciiTheme="majorHAnsi" w:cstheme="majorBidi" w:eastAsiaTheme="majorEastAsia" w:hAnsiTheme="majorHAnsi"/>
+      <w:rFonts w:ascii="Times New Roman" w:hAnsi="Times New Roman" w:eastAsia="Times New Roman" w:cs="" w:asciiTheme="majorHAnsi" w:cstheme="majorBidi" w:eastAsiaTheme="majorEastAsia" w:hAnsiTheme="majorHAnsi"/>
       <w:b w:val="false"/>
       <w:bCs w:val="false"/>
       <w:color w:themeColor="accent1" w:themeShade="bf" w:val="365F91"/>

</xml_diff>

<commit_message>
Preserva italico (\textit{}) dentro de celulas de tabela
Mesmo padrao dos outros achados: construir_tabela() reconstroi cada celula
como texto simples (cell.text = valor), entao \textit{} dentro de uma
tabela (ex.: "digital twin", "Journal", "TITLE-ABS-KEY" como \texttt, este
ainda nao tratado) perdia a formatacao, embora o texto em si permanecesse
correto. Fora de tabela o Pandoc ja converte \textit{} nativamente para um
run em italico (preservado sem alteracao). Corrigido marcando \textit{}
apenas dentro dos blocos tabularx com um caractere Unicode de area de uso
privado (compativel com XML, ao contrario de \x01, que o Pandoc descartava
por invalidar o XML do .docx) antes do Pandoc rodar; construir_tabela()
agora divide o texto da celula por esse marcador e aplica italico so no
trecho marcado.
</commit_message>
<xml_diff>
--- a/artigo.docx
+++ b/artigo.docx
@@ -808,7 +808,20 @@
               <w:rPr>
                 <w:sz w:val="18"/>
               </w:rPr>
-              <w:t>BIM, digital twin, sensores, ontologias, IA e manutenção preditiva.</w:t>
+              <w:t xml:space="preserve">BIM, </w:t>
+            </w:r>
+            <w:r>
+              <w:rPr>
+                <w:i/>
+                <w:sz w:val="18"/>
+              </w:rPr>
+              <w:t>digital twin</w:t>
+            </w:r>
+            <w:r>
+              <w:rPr>
+                <w:sz w:val="18"/>
+              </w:rPr>
+              <w:t>, sensores, ontologias, IA e manutenção preditiva.</w:t>
             </w:r>
           </w:p>
         </w:tc>
@@ -5036,7 +5049,20 @@
               <w:rPr>
                 <w:sz w:val="18"/>
               </w:rPr>
-              <w:t>Identificação de universidades, campus, edifícios públicos, escolas, hospitais e outras tipologias.</w:t>
+              <w:t xml:space="preserve">Identificação de universidades, </w:t>
+            </w:r>
+            <w:r>
+              <w:rPr>
+                <w:i/>
+                <w:sz w:val="18"/>
+              </w:rPr>
+              <w:t>campus</w:t>
+            </w:r>
+            <w:r>
+              <w:rPr>
+                <w:sz w:val="18"/>
+              </w:rPr>
+              <w:t>, edifícios públicos, escolas, hospitais e outras tipologias.</w:t>
             </w:r>
           </w:p>
         </w:tc>
@@ -7669,9 +7695,42 @@
             </w:pPr>
             <w:r>
               <w:rPr>
-                <w:sz w:val="18"/>
-              </w:rPr>
-              <w:t>Journal, JOUR e journal-article.</w:t>
+                <w:i/>
+                <w:sz w:val="18"/>
+              </w:rPr>
+              <w:t>Journal</w:t>
+            </w:r>
+            <w:r>
+              <w:rPr>
+                <w:sz w:val="18"/>
+              </w:rPr>
+              <w:t xml:space="preserve">, </w:t>
+            </w:r>
+            <w:r>
+              <w:rPr>
+                <w:i/>
+                <w:sz w:val="18"/>
+              </w:rPr>
+              <w:t>JOUR</w:t>
+            </w:r>
+            <w:r>
+              <w:rPr>
+                <w:sz w:val="18"/>
+              </w:rPr>
+              <w:t xml:space="preserve"> e </w:t>
+            </w:r>
+            <w:r>
+              <w:rPr>
+                <w:i/>
+                <w:sz w:val="18"/>
+              </w:rPr>
+              <w:t>journal-article</w:t>
+            </w:r>
+            <w:r>
+              <w:rPr>
+                <w:sz w:val="18"/>
+              </w:rPr>
+              <w:t>.</w:t>
             </w:r>
           </w:p>
         </w:tc>
@@ -7782,9 +7841,29 @@
             </w:pPr>
             <w:r>
               <w:rPr>
-                <w:sz w:val="18"/>
-              </w:rPr>
-              <w:t>Conference Proceeding e CPAPER.</w:t>
+                <w:i/>
+                <w:sz w:val="18"/>
+              </w:rPr>
+              <w:t>Conference Proceeding</w:t>
+            </w:r>
+            <w:r>
+              <w:rPr>
+                <w:sz w:val="18"/>
+              </w:rPr>
+              <w:t xml:space="preserve"> e </w:t>
+            </w:r>
+            <w:r>
+              <w:rPr>
+                <w:i/>
+                <w:sz w:val="18"/>
+              </w:rPr>
+              <w:t>CPAPER</w:t>
+            </w:r>
+            <w:r>
+              <w:rPr>
+                <w:sz w:val="18"/>
+              </w:rPr>
+              <w:t>.</w:t>
             </w:r>
           </w:p>
         </w:tc>
@@ -7895,9 +7974,29 @@
             </w:pPr>
             <w:r>
               <w:rPr>
-                <w:sz w:val="18"/>
-              </w:rPr>
-              <w:t>Book Series e Book.</w:t>
+                <w:i/>
+                <w:sz w:val="18"/>
+              </w:rPr>
+              <w:t>Book Series</w:t>
+            </w:r>
+            <w:r>
+              <w:rPr>
+                <w:sz w:val="18"/>
+              </w:rPr>
+              <w:t xml:space="preserve"> e </w:t>
+            </w:r>
+            <w:r>
+              <w:rPr>
+                <w:i/>
+                <w:sz w:val="18"/>
+              </w:rPr>
+              <w:t>Book</w:t>
+            </w:r>
+            <w:r>
+              <w:rPr>
+                <w:sz w:val="18"/>
+              </w:rPr>
+              <w:t>.</w:t>
             </w:r>
           </w:p>
         </w:tc>
@@ -10851,6 +10950,7 @@
             </w:pPr>
             <w:r>
               <w:rPr>
+                <w:i/>
                 <w:sz w:val="18"/>
               </w:rPr>
               <w:t>Campus</w:t>
@@ -11964,7 +12064,20 @@
               <w:rPr>
                 <w:sz w:val="18"/>
               </w:rPr>
-              <w:t>Informação em 82 registros, BIM em 28 e digital twin em 11. Perdas de informação foram observadas por Tan; Zaman; Sutrisna (2018).</w:t>
+              <w:t xml:space="preserve">Informação em 82 registros, BIM em 28 e </w:t>
+            </w:r>
+            <w:r>
+              <w:rPr>
+                <w:i/>
+                <w:sz w:val="18"/>
+              </w:rPr>
+              <w:t>digital twin</w:t>
+            </w:r>
+            <w:r>
+              <w:rPr>
+                <w:sz w:val="18"/>
+              </w:rPr>
+              <w:t xml:space="preserve"> em 11. Perdas de informação foram observadas por Tan; Zaman; Sutrisna (2018).</w:t>
             </w:r>
           </w:p>
         </w:tc>

</xml_diff>